<commit_message>
docs: sync Chinese README metrics table and update Word application form terms to prototype status
</commit_message>
<xml_diff>
--- a/Al + Materials Competition Application Form.docx
+++ b/Al + Materials Competition Application Form.docx
@@ -778,27 +778,7 @@
               </w:rPr>
             </w:pPr>
             <w:r>
-              <w:rPr>
-                <w:rFonts w:ascii="Times New Roman" w:hAnsi="Times New Roman" w:cs="Times New Roman"/>
-                <w:sz w:val="24"/>
-              </w:rPr>
-              <w:t xml:space="preserve">- </w:t>
-            </w:r>
-            <w:r>
-              <w:rPr>
-                <w:rFonts w:ascii="Times New Roman" w:hAnsi="Times New Roman" w:cs="Times New Roman"/>
-                <w:b/>
-                <w:bCs/>
-                <w:sz w:val="24"/>
-              </w:rPr>
-              <w:t>Project Objectives:</w:t>
-            </w:r>
-            <w:r>
-              <w:rPr>
-                <w:rFonts w:ascii="Times New Roman" w:hAnsi="Times New Roman" w:cs="Times New Roman"/>
-                <w:sz w:val="24"/>
-              </w:rPr>
-              <w:t xml:space="preserve"> SecureCoatingVision delivers a fully deployable, production-grade edge-to-cloud application platform. The primary objective is to automate non-destructive visual inspection of battery electrodes, map real-time inference metadata back to specific batch runs, and ensure that sensitive manufacturing data remains highly secure and confidential within the factory boundary. </w:t>
+              <w:t xml:space="preserve">- Project Objectives: SecureCoatingVision delivers a a reproducible, production-inspired edge-to-cloud application prototype. The primary objective is to automate non-destructive visual inspection of battery electrodes, map real-time inference metadata back to specific batch runs, and ensure that sensitive manufacturing data remains highly secure and confidential within the factory boundary. </w:t>
             </w:r>
           </w:p>
           <w:p>
@@ -1180,45 +1160,7 @@
               </w:rPr>
             </w:pPr>
             <w:r>
-              <w:rPr>
-                <w:rFonts w:ascii="Times New Roman" w:hAnsi="Times New Roman" w:cs="Times New Roman"/>
-                <w:b/>
-                <w:bCs/>
-                <w:sz w:val="24"/>
-              </w:rPr>
-              <w:t xml:space="preserve">- </w:t>
-            </w:r>
-            <w:r>
-              <w:rPr>
-                <w:rFonts w:ascii="Times New Roman" w:hAnsi="Times New Roman" w:cs="Times New Roman"/>
-                <w:b/>
-                <w:bCs/>
-                <w:sz w:val="24"/>
-              </w:rPr>
-              <w:t>Project Deliverables/Outputs:</w:t>
-            </w:r>
-            <w:r>
-              <w:rPr>
-                <w:rFonts w:ascii="Times New Roman" w:hAnsi="Times New Roman" w:cs="Times New Roman"/>
-                <w:sz w:val="24"/>
-              </w:rPr>
-              <w:t xml:space="preserve"> A functional application prototype backend, technical system architecture design documentation, model benchmarking reports conducted on the </w:t>
-            </w:r>
-            <w:r>
-              <w:rPr>
-                <w:rFonts w:ascii="Times New Roman" w:hAnsi="Times New Roman" w:cs="Times New Roman"/>
-                <w:i/>
-                <w:iCs/>
-                <w:sz w:val="24"/>
-              </w:rPr>
-              <w:t>CoatingVision</w:t>
-            </w:r>
-            <w:r>
-              <w:rPr>
-                <w:rFonts w:ascii="Times New Roman" w:hAnsi="Times New Roman" w:cs="Times New Roman"/>
-                <w:sz w:val="24"/>
-              </w:rPr>
-              <w:t xml:space="preserve"> dataset, and reproducible configuration manifests (Docker/Nginx infrastructure). </w:t>
+              <w:t xml:space="preserve">- Project Deliverables/Outputs: A functional application prototype backend, technical system architecture design documentation, model benchmarking reports conducted on the included synthetic coating-defect demonstration dataset, and reproducible configuration manifests (Docker/Nginx infrastructure). </w:t>
             </w:r>
           </w:p>
           <w:p>

</xml_diff>

<commit_message>
chore: final submission build package and documentation sync
</commit_message>
<xml_diff>
--- a/Al + Materials Competition Application Form.docx
+++ b/Al + Materials Competition Application Form.docx
@@ -444,38 +444,7 @@
           </w:p>
         </w:tc>
       </w:tr>
-      <w:tr>
-        <w:tc>
-          <w:tcPr>
-            <w:tcW w:type="dxa" w:w="3539"/>
-          </w:tcPr>
-          <w:p>
-            <w:r>
-              <w:t>Academic Supervisor</w:t>
-            </w:r>
-          </w:p>
-        </w:tc>
-        <w:tc>
-          <w:tcPr>
-            <w:tcW w:type="dxa" w:w="4757"/>
-          </w:tcPr>
-          <w:p>
-            <w:r>
-              <w:t>Kris Singh — CEO, SRII; Visiting Professor, Tsinghua University; Adj. Professor of Practice, University of Newcastle; former executive at IBM, AMD, Intel, and National Semiconductor</w:t>
-            </w:r>
-          </w:p>
-        </w:tc>
-      </w:tr>
     </w:tbl>
-    <w:p>
-      <w:pPr>
-        <w:jc w:val="left"/>
-        <w:rPr>
-          <w:rFonts w:ascii="Times New Roman" w:eastAsia="STXingkai" w:hAnsi="Times New Roman" w:cs="Times New Roman"/>
-          <w:sz w:val="40"/>
-        </w:rPr>
-      </w:pPr>
-    </w:p>
     <w:p>
       <w:pPr>
         <w:jc w:val="left"/>
@@ -573,7 +542,15 @@
           <w:sz w:val="28"/>
           <w:szCs w:val="28"/>
         </w:rPr>
-        <w:t xml:space="preserve"> 26</w:t>
+        <w:t xml:space="preserve"> 2</w:t>
+      </w:r>
+      <w:r>
+        <w:rPr>
+          <w:rFonts w:ascii="Times New Roman" w:hAnsi="Times New Roman" w:cs="Times New Roman"/>
+          <w:sz w:val="28"/>
+          <w:szCs w:val="28"/>
+        </w:rPr>
+        <w:t>4</w:t>
       </w:r>
       <w:r>
         <w:rPr>
@@ -589,7 +566,15 @@
           <w:sz w:val="28"/>
           <w:szCs w:val="28"/>
         </w:rPr>
-        <w:t>06</w:t>
+        <w:t>0</w:t>
+      </w:r>
+      <w:r>
+        <w:rPr>
+          <w:rFonts w:ascii="Times New Roman" w:hAnsi="Times New Roman" w:cs="Times New Roman"/>
+          <w:sz w:val="28"/>
+          <w:szCs w:val="28"/>
+        </w:rPr>
+        <w:t>7</w:t>
       </w:r>
       <w:r>
         <w:rPr>
@@ -2345,6 +2330,34 @@
                       <w:szCs w:val="20"/>
                     </w:rPr>
                   </w:pPr>
+                  <w:r>
+                    <w:rPr>
+                      <w:rFonts w:ascii="Times New Roman" w:hAnsi="Times New Roman" w:cs="Times New Roman"/>
+                      <w:szCs w:val="20"/>
+                    </w:rPr>
+                    <w:t>(</w:t>
+                  </w:r>
+                  <w:r>
+                    <w:rPr>
+                      <w:rFonts w:ascii="Times New Roman" w:hAnsi="Times New Roman" w:cs="Times New Roman"/>
+                      <w:szCs w:val="20"/>
+                    </w:rPr>
+                    <w:t>External Advisor</w:t>
+                  </w:r>
+                  <w:r>
+                    <w:rPr>
+                      <w:rFonts w:ascii="Times New Roman" w:hAnsi="Times New Roman" w:cs="Times New Roman"/>
+                      <w:szCs w:val="20"/>
+                    </w:rPr>
+                    <w:t>)</w:t>
+                  </w:r>
+                  <w:r>
+                    <w:rPr>
+                      <w:rFonts w:ascii="Times New Roman" w:hAnsi="Times New Roman" w:cs="Times New Roman"/>
+                      <w:szCs w:val="20"/>
+                    </w:rPr>
+                    <w:t xml:space="preserve"> Kris Singh</w:t>
+                  </w:r>
                 </w:p>
               </w:tc>
               <w:tc>
@@ -2357,6 +2370,112 @@
                     <w:jc w:val="center"/>
                     <w:rPr>
                       <w:rFonts w:ascii="Times New Roman" w:hAnsi="Times New Roman" w:cs="Times New Roman"/>
+                      <w:szCs w:val="20"/>
+                    </w:rPr>
+                  </w:pPr>
+                  <w:r>
+                    <w:rPr>
+                      <w:rFonts w:ascii="Times New Roman" w:hAnsi="Times New Roman" w:cs="Times New Roman"/>
+                      <w:szCs w:val="20"/>
+                    </w:rPr>
+                    <w:t xml:space="preserve">Founder and CEO, SRII; Visiting Professor, Tsinghua </w:t>
+                  </w:r>
+                  <w:r>
+                    <w:rPr>
+                      <w:rFonts w:ascii="Times New Roman" w:hAnsi="Times New Roman" w:cs="Times New Roman"/>
+                      <w:szCs w:val="20"/>
+                    </w:rPr>
+                    <w:lastRenderedPageBreak/>
+                    <w:t>University</w:t>
+                  </w:r>
+                </w:p>
+              </w:tc>
+              <w:tc>
+                <w:tcPr>
+                  <w:tcW w:w="1548" w:type="dxa"/>
+                  <w:vAlign w:val="center"/>
+                </w:tcPr>
+                <w:p>
+                  <w:pPr>
+                    <w:jc w:val="center"/>
+                    <w:rPr>
+                      <w:rFonts w:ascii="Times New Roman" w:hAnsi="Times New Roman" w:cs="Times New Roman"/>
+                      <w:szCs w:val="20"/>
+                    </w:rPr>
+                  </w:pPr>
+                </w:p>
+              </w:tc>
+              <w:tc>
+                <w:tcPr>
+                  <w:tcW w:w="2358" w:type="dxa"/>
+                  <w:vAlign w:val="center"/>
+                </w:tcPr>
+                <w:p>
+                  <w:pPr>
+                    <w:jc w:val="center"/>
+                    <w:rPr>
+                      <w:rFonts w:ascii="Times New Roman" w:hAnsi="Times New Roman" w:cs="Times New Roman"/>
+                      <w:szCs w:val="20"/>
+                    </w:rPr>
+                  </w:pPr>
+                  <w:r>
+                    <w:rPr>
+                      <w:rFonts w:ascii="Times New Roman" w:hAnsi="Times New Roman" w:cs="Times New Roman"/>
+                      <w:szCs w:val="20"/>
+                    </w:rPr>
+                    <w:t>kris@thesrii.org</w:t>
+                  </w:r>
+                </w:p>
+              </w:tc>
+            </w:tr>
+            <w:tr>
+              <w:trPr>
+                <w:jc w:val="center"/>
+              </w:trPr>
+              <w:tc>
+                <w:tcPr>
+                  <w:tcW w:w="1158" w:type="dxa"/>
+                  <w:vMerge/>
+                  <w:vAlign w:val="center"/>
+                </w:tcPr>
+                <w:p>
+                  <w:pPr>
+                    <w:jc w:val="center"/>
+                    <w:rPr>
+                      <w:rFonts w:ascii="Times New Roman" w:hAnsi="Times New Roman" w:cs="Times New Roman"/>
+                      <w:b/>
+                      <w:szCs w:val="20"/>
+                    </w:rPr>
+                  </w:pPr>
+                </w:p>
+              </w:tc>
+              <w:tc>
+                <w:tcPr>
+                  <w:tcW w:w="1577" w:type="dxa"/>
+                  <w:vAlign w:val="center"/>
+                </w:tcPr>
+                <w:p>
+                  <w:pPr>
+                    <w:jc w:val="center"/>
+                    <w:rPr>
+                      <w:rFonts w:ascii="Times New Roman" w:hAnsi="Times New Roman" w:cs="Times New Roman"/>
+                      <w:b/>
+                      <w:szCs w:val="20"/>
+                    </w:rPr>
+                  </w:pPr>
+                </w:p>
+              </w:tc>
+              <w:tc>
+                <w:tcPr>
+                  <w:tcW w:w="1429" w:type="dxa"/>
+                  <w:vAlign w:val="center"/>
+                </w:tcPr>
+                <w:p>
+                  <w:pPr>
+                    <w:jc w:val="center"/>
+                    <w:rPr>
+                      <w:rFonts w:ascii="Times New Roman" w:hAnsi="Times New Roman" w:cs="Times New Roman"/>
+                      <w:b/>
                       <w:szCs w:val="20"/>
                     </w:rPr>
                   </w:pPr>
@@ -2372,6 +2491,7 @@
                     <w:jc w:val="center"/>
                     <w:rPr>
                       <w:rFonts w:ascii="Times New Roman" w:hAnsi="Times New Roman" w:cs="Times New Roman"/>
+                      <w:b/>
                       <w:szCs w:val="20"/>
                     </w:rPr>
                   </w:pPr>
@@ -2387,6 +2507,7 @@
                     <w:jc w:val="center"/>
                     <w:rPr>
                       <w:rFonts w:ascii="Times New Roman" w:hAnsi="Times New Roman" w:cs="Times New Roman"/>
+                      <w:b/>
                       <w:szCs w:val="20"/>
                     </w:rPr>
                   </w:pPr>
@@ -2409,7 +2530,8 @@
                     <w:rPr>
                       <w:rFonts w:ascii="Times New Roman" w:hAnsi="Times New Roman" w:cs="Times New Roman"/>
                       <w:b/>
-                      <w:szCs w:val="20"/>
+                      <w:sz w:val="24"/>
+                      <w:szCs w:val="24"/>
                     </w:rPr>
                   </w:pPr>
                 </w:p>
@@ -2425,7 +2547,8 @@
                     <w:rPr>
                       <w:rFonts w:ascii="Times New Roman" w:hAnsi="Times New Roman" w:cs="Times New Roman"/>
                       <w:b/>
-                      <w:szCs w:val="20"/>
+                      <w:sz w:val="24"/>
+                      <w:szCs w:val="24"/>
                     </w:rPr>
                   </w:pPr>
                 </w:p>
@@ -2441,7 +2564,8 @@
                     <w:rPr>
                       <w:rFonts w:ascii="Times New Roman" w:hAnsi="Times New Roman" w:cs="Times New Roman"/>
                       <w:b/>
-                      <w:szCs w:val="20"/>
+                      <w:sz w:val="24"/>
+                      <w:szCs w:val="24"/>
                     </w:rPr>
                   </w:pPr>
                 </w:p>
@@ -2457,7 +2581,8 @@
                     <w:rPr>
                       <w:rFonts w:ascii="Times New Roman" w:hAnsi="Times New Roman" w:cs="Times New Roman"/>
                       <w:b/>
-                      <w:szCs w:val="20"/>
+                      <w:sz w:val="24"/>
+                      <w:szCs w:val="24"/>
                     </w:rPr>
                   </w:pPr>
                 </w:p>
@@ -2473,96 +2598,6 @@
                     <w:rPr>
                       <w:rFonts w:ascii="Times New Roman" w:hAnsi="Times New Roman" w:cs="Times New Roman"/>
                       <w:b/>
-                      <w:szCs w:val="20"/>
-                    </w:rPr>
-                  </w:pPr>
-                </w:p>
-              </w:tc>
-            </w:tr>
-            <w:tr>
-              <w:trPr>
-                <w:jc w:val="center"/>
-              </w:trPr>
-              <w:tc>
-                <w:tcPr>
-                  <w:tcW w:w="1158" w:type="dxa"/>
-                  <w:vMerge/>
-                  <w:vAlign w:val="center"/>
-                </w:tcPr>
-                <w:p>
-                  <w:pPr>
-                    <w:jc w:val="center"/>
-                    <w:rPr>
-                      <w:rFonts w:ascii="Times New Roman" w:hAnsi="Times New Roman" w:cs="Times New Roman"/>
-                      <w:b/>
-                      <w:sz w:val="24"/>
-                      <w:szCs w:val="24"/>
-                    </w:rPr>
-                  </w:pPr>
-                </w:p>
-              </w:tc>
-              <w:tc>
-                <w:tcPr>
-                  <w:tcW w:w="1577" w:type="dxa"/>
-                  <w:vAlign w:val="center"/>
-                </w:tcPr>
-                <w:p>
-                  <w:pPr>
-                    <w:jc w:val="center"/>
-                    <w:rPr>
-                      <w:rFonts w:ascii="Times New Roman" w:hAnsi="Times New Roman" w:cs="Times New Roman"/>
-                      <w:b/>
-                      <w:sz w:val="24"/>
-                      <w:szCs w:val="24"/>
-                    </w:rPr>
-                  </w:pPr>
-                </w:p>
-              </w:tc>
-              <w:tc>
-                <w:tcPr>
-                  <w:tcW w:w="1429" w:type="dxa"/>
-                  <w:vAlign w:val="center"/>
-                </w:tcPr>
-                <w:p>
-                  <w:pPr>
-                    <w:jc w:val="center"/>
-                    <w:rPr>
-                      <w:rFonts w:ascii="Times New Roman" w:hAnsi="Times New Roman" w:cs="Times New Roman"/>
-                      <w:b/>
-                      <w:sz w:val="24"/>
-                      <w:szCs w:val="24"/>
-                    </w:rPr>
-                  </w:pPr>
-                </w:p>
-              </w:tc>
-              <w:tc>
-                <w:tcPr>
-                  <w:tcW w:w="1548" w:type="dxa"/>
-                  <w:vAlign w:val="center"/>
-                </w:tcPr>
-                <w:p>
-                  <w:pPr>
-                    <w:jc w:val="center"/>
-                    <w:rPr>
-                      <w:rFonts w:ascii="Times New Roman" w:hAnsi="Times New Roman" w:cs="Times New Roman"/>
-                      <w:b/>
-                      <w:sz w:val="24"/>
-                      <w:szCs w:val="24"/>
-                    </w:rPr>
-                  </w:pPr>
-                </w:p>
-              </w:tc>
-              <w:tc>
-                <w:tcPr>
-                  <w:tcW w:w="2358" w:type="dxa"/>
-                  <w:vAlign w:val="center"/>
-                </w:tcPr>
-                <w:p>
-                  <w:pPr>
-                    <w:jc w:val="center"/>
-                    <w:rPr>
-                      <w:rFonts w:ascii="Times New Roman" w:hAnsi="Times New Roman" w:cs="Times New Roman"/>
-                      <w:b/>
                       <w:sz w:val="24"/>
                       <w:szCs w:val="24"/>
                     </w:rPr>
@@ -2589,6 +2624,14 @@
               </w:rPr>
             </w:pPr>
           </w:p>
+        </w:tc>
+      </w:tr>
+      <w:tr>
+        <w:tc>
+          <w:tcPr>
+            <w:tcW w:w="8296" w:type="dxa"/>
+          </w:tcPr>
+          <w:p/>
         </w:tc>
       </w:tr>
     </w:tbl>
@@ -3299,7 +3342,6 @@
   <w:style w:type="character" w:default="1" w:styleId="DefaultParagraphFont">
     <w:name w:val="Default Paragraph Font"/>
     <w:uiPriority w:val="1"/>
-    <w:semiHidden/>
     <w:unhideWhenUsed/>
   </w:style>
   <w:style w:type="table" w:default="1" w:styleId="TableNormal">

</xml_diff>

<commit_message>
Align competition application with verified project scope
</commit_message>
<xml_diff>
--- a/Al + Materials Competition Application Form.docx
+++ b/Al + Materials Competition Application Form.docx
@@ -608,214 +608,18 @@
             <w:tcW w:w="8296" w:type="dxa"/>
           </w:tcPr>
           <w:p>
-            <w:pPr>
-              <w:rPr>
-                <w:rFonts w:ascii="Times New Roman" w:eastAsia="SimHei" w:hAnsi="Times New Roman" w:cs="Times New Roman"/>
-                <w:b/>
-                <w:bCs/>
-                <w:sz w:val="24"/>
-              </w:rPr>
-            </w:pPr>
             <w:r>
-              <w:rPr>
-                <w:rFonts w:ascii="Times New Roman" w:eastAsia="SimHei" w:hAnsi="Times New Roman" w:cs="Times New Roman"/>
-                <w:b/>
-                <w:bCs/>
-                <w:sz w:val="24"/>
-              </w:rPr>
-              <w:lastRenderedPageBreak/>
-              <w:t>1</w:t>
+              <w:t>1、Project Overview（e.g., background, state of the art, project objectives, key competitive advantages, etc.）</w:t>
+              <w:br/>
+              <w:br/>
+              <w:t>Background &amp; State of the Art: Battery electrode coating defects can affect downstream quality, yield, and safety. Public research datasets and computer-vision models make defect segmentation accessible, but a deployable inspection workflow also needs traceability, input validation, explicit failure handling, and reproducible evaluation.</w:t>
+              <w:br/>
+              <w:br/>
+              <w:t>Project Objectives: SecureCoating-Vision is a research prototype for non-destructive coating-defect inspection. It connects RGB segmentation with simulated multimodal registration, physical-coordinate mapping, quality traceability, and industrial protocol adapters. The project objective is to demonstrate a verifiable software workflow and define the evidence required for a future plant pilot.</w:t>
+              <w:br/>
+              <w:br/>
+              <w:t>Current Competitive Advantage: The implementation emphasizes evidence and failure behavior around a conventional YOLOv8-seg baseline: unsafe or unverified conditions are prevented from becoming automatic release decisions, inspection identities are protected against duplicate processing, and evaluation claims are gated by artifact hashes and split integrity. The repository does not claim factory qualification or production performance.</w:t>
             </w:r>
-            <w:r>
-              <w:rPr>
-                <w:rFonts w:ascii="Times New Roman" w:eastAsia="SimHei" w:hAnsi="Times New Roman" w:cs="Times New Roman"/>
-                <w:b/>
-                <w:bCs/>
-                <w:sz w:val="24"/>
-              </w:rPr>
-              <w:t>、</w:t>
-            </w:r>
-            <w:r>
-              <w:rPr>
-                <w:rFonts w:ascii="Times New Roman" w:eastAsia="SimHei" w:hAnsi="Times New Roman" w:cs="Times New Roman"/>
-                <w:b/>
-                <w:bCs/>
-                <w:sz w:val="24"/>
-              </w:rPr>
-              <w:t>Project Overview</w:t>
-            </w:r>
-            <w:r>
-              <w:rPr>
-                <w:rFonts w:ascii="Times New Roman" w:eastAsia="SimHei" w:hAnsi="Times New Roman" w:cs="Times New Roman"/>
-                <w:b/>
-                <w:bCs/>
-                <w:sz w:val="24"/>
-              </w:rPr>
-              <w:t>（</w:t>
-            </w:r>
-            <w:r>
-              <w:rPr>
-                <w:rFonts w:ascii="Times New Roman" w:eastAsia="SimHei" w:hAnsi="Times New Roman" w:cs="Times New Roman"/>
-                <w:b/>
-                <w:bCs/>
-                <w:sz w:val="24"/>
-              </w:rPr>
-              <w:t>e.g.,</w:t>
-            </w:r>
-            <w:r>
-              <w:rPr>
-                <w:rFonts w:ascii="Times New Roman" w:eastAsia="SimHei" w:hAnsi="Times New Roman" w:cs="Times New Roman"/>
-                <w:b/>
-                <w:bCs/>
-                <w:sz w:val="24"/>
-              </w:rPr>
-              <w:t xml:space="preserve"> background, state of the art, project objectives, key competitive advantages</w:t>
-            </w:r>
-            <w:r>
-              <w:rPr>
-                <w:rFonts w:ascii="Times New Roman" w:eastAsia="SimHei" w:hAnsi="Times New Roman" w:cs="Times New Roman"/>
-                <w:b/>
-                <w:bCs/>
-                <w:sz w:val="24"/>
-              </w:rPr>
-              <w:t>, etc</w:t>
-            </w:r>
-            <w:r>
-              <w:rPr>
-                <w:rFonts w:ascii="Times New Roman" w:eastAsia="SimHei" w:hAnsi="Times New Roman" w:cs="Times New Roman"/>
-                <w:b/>
-                <w:bCs/>
-                <w:sz w:val="24"/>
-              </w:rPr>
-              <w:t>.</w:t>
-            </w:r>
-            <w:r>
-              <w:rPr>
-                <w:rFonts w:ascii="Times New Roman" w:eastAsia="SimHei" w:hAnsi="Times New Roman" w:cs="Times New Roman"/>
-                <w:b/>
-                <w:bCs/>
-                <w:sz w:val="24"/>
-              </w:rPr>
-              <w:t>）</w:t>
-            </w:r>
-          </w:p>
-          <w:p>
-            <w:pPr>
-              <w:jc w:val="left"/>
-              <w:rPr>
-                <w:rFonts w:ascii="Times New Roman" w:hAnsi="Times New Roman" w:cs="Times New Roman"/>
-                <w:sz w:val="24"/>
-              </w:rPr>
-            </w:pPr>
-          </w:p>
-          <w:p>
-            <w:pPr>
-              <w:rPr>
-                <w:rFonts w:ascii="Times New Roman" w:hAnsi="Times New Roman" w:cs="Times New Roman"/>
-                <w:sz w:val="24"/>
-              </w:rPr>
-            </w:pPr>
-            <w:r>
-              <w:rPr>
-                <w:rFonts w:ascii="Times New Roman" w:hAnsi="Times New Roman" w:cs="Times New Roman"/>
-                <w:sz w:val="24"/>
-              </w:rPr>
-              <w:t xml:space="preserve">- </w:t>
-            </w:r>
-            <w:r>
-              <w:rPr>
-                <w:rFonts w:ascii="Times New Roman" w:hAnsi="Times New Roman" w:cs="Times New Roman"/>
-                <w:b/>
-                <w:bCs/>
-                <w:sz w:val="24"/>
-              </w:rPr>
-              <w:t>Background &amp; State of the Art:</w:t>
-            </w:r>
-            <w:r>
-              <w:rPr>
-                <w:rFonts w:ascii="Times New Roman" w:hAnsi="Times New Roman" w:cs="Times New Roman"/>
-                <w:sz w:val="24"/>
-              </w:rPr>
-              <w:t xml:space="preserve"> Battery electrode quality is a decisive factor in downstream battery performance, safety, and manufacturing yield. Minor defects in the coating layer propagate into severe failures during cell assembly. While modern computer vision has advanced industrial metrology, the public research ecosystem has only recently gained a dedicated dataset via </w:t>
-            </w:r>
-            <w:r>
-              <w:rPr>
-                <w:rFonts w:ascii="Times New Roman" w:hAnsi="Times New Roman" w:cs="Times New Roman"/>
-                <w:i/>
-                <w:iCs/>
-                <w:sz w:val="24"/>
-              </w:rPr>
-              <w:t>CoatingVision</w:t>
-            </w:r>
-            <w:r>
-              <w:rPr>
-                <w:rFonts w:ascii="Times New Roman" w:hAnsi="Times New Roman" w:cs="Times New Roman"/>
-                <w:sz w:val="24"/>
-              </w:rPr>
-              <w:t xml:space="preserve"> (2026), providing high-resolution labeled samples for electrode anomalies. However, traditional deployments treat defect detection as a localized, isolated notebook demo, failing to bridge the gap between image classification and automated, plant-wide traceable quality decisions under strict industrial resource constraints. </w:t>
-            </w:r>
-          </w:p>
-          <w:p>
-            <w:pPr>
-              <w:rPr>
-                <w:rFonts w:ascii="Times New Roman" w:hAnsi="Times New Roman" w:cs="Times New Roman"/>
-                <w:sz w:val="24"/>
-              </w:rPr>
-            </w:pPr>
-            <w:r>
-              <w:t xml:space="preserve">- Project Objectives: SecureCoatingVision delivers a a reproducible, production-inspired edge-to-cloud application prototype. The primary objective is to automate non-destructive visual inspection of battery electrodes, map real-time inference metadata back to specific batch runs, and ensure that sensitive manufacturing data remains highly secure and confidential within the factory boundary. </w:t>
-            </w:r>
-          </w:p>
-          <w:p>
-            <w:pPr>
-              <w:rPr>
-                <w:rFonts w:ascii="Times New Roman" w:hAnsi="Times New Roman" w:cs="Times New Roman"/>
-                <w:sz w:val="24"/>
-              </w:rPr>
-            </w:pPr>
-            <w:r>
-              <w:rPr>
-                <w:rFonts w:ascii="Times New Roman" w:hAnsi="Times New Roman" w:cs="Times New Roman"/>
-                <w:b/>
-                <w:bCs/>
-                <w:sz w:val="24"/>
-              </w:rPr>
-              <w:t xml:space="preserve">- </w:t>
-            </w:r>
-            <w:r>
-              <w:rPr>
-                <w:rFonts w:ascii="Times New Roman" w:hAnsi="Times New Roman" w:cs="Times New Roman"/>
-                <w:b/>
-                <w:bCs/>
-                <w:sz w:val="24"/>
-              </w:rPr>
-              <w:t>Key Competitive Advantages:</w:t>
-            </w:r>
-            <w:r>
-              <w:rPr>
-                <w:rFonts w:ascii="Times New Roman" w:hAnsi="Times New Roman" w:cs="Times New Roman"/>
-                <w:sz w:val="24"/>
-              </w:rPr>
-              <w:t xml:space="preserve"> Unlike academically focused projects that introduce highly fragile, custom deep learning backbones, this project balances algorithmic reliability with engineering execution. By optimizing a proven architecture and wrapping it inside an enterprise-ready infrastructure, it minimizes deployment risk and ensures high-throughput, low-latency execution that matches real production speeds. </w:t>
-            </w:r>
-          </w:p>
-          <w:p>
-            <w:pPr>
-              <w:jc w:val="left"/>
-              <w:rPr>
-                <w:rFonts w:ascii="Times New Roman" w:hAnsi="Times New Roman" w:cs="Times New Roman"/>
-                <w:sz w:val="24"/>
-              </w:rPr>
-            </w:pPr>
-          </w:p>
-          <w:p>
-            <w:pPr>
-              <w:jc w:val="left"/>
-              <w:rPr>
-                <w:rFonts w:ascii="Times New Roman" w:hAnsi="Times New Roman" w:cs="Times New Roman"/>
-                <w:sz w:val="24"/>
-              </w:rPr>
-            </w:pPr>
           </w:p>
         </w:tc>
       </w:tr>
@@ -825,355 +629,18 @@
             <w:tcW w:w="8296" w:type="dxa"/>
           </w:tcPr>
           <w:p>
-            <w:pPr>
-              <w:rPr>
-                <w:rFonts w:ascii="Times New Roman" w:eastAsia="SimHei" w:hAnsi="Times New Roman" w:cs="Times New Roman"/>
-                <w:b/>
-                <w:bCs/>
-                <w:sz w:val="24"/>
-              </w:rPr>
-            </w:pPr>
             <w:r>
-              <w:rPr>
-                <w:rFonts w:ascii="Times New Roman" w:eastAsia="SimHei" w:hAnsi="Times New Roman" w:cs="Times New Roman"/>
-                <w:b/>
-                <w:bCs/>
-                <w:sz w:val="24"/>
-              </w:rPr>
-              <w:t>2</w:t>
+              <w:t>2、Project Plan（e.g., technical approach, main features/functionalities, project deliverables/outputs, etc.）</w:t>
+              <w:br/>
+              <w:br/>
+              <w:t>Technical Approach: The current prototype runs an RGB YOLOv8-seg inference path locally. Thermal and height streams are available as simulated or injected inputs for registration, metrology, and degraded-mode testing; they are not presented as measurements from plant instruments. The API applies readiness and fail-closed checks before issuing a decision. Traceability records are written to SQLite, certificates use canonical HMAC-SHA256 payloads, and OPC UA/Modbus adapters expose explicit command and acknowledgement contracts.</w:t>
+              <w:br/>
+              <w:br/>
+              <w:t>Main Features/Functionalities: Defect segmentation for the configured coating classes; calibrated coordinate mapping when an approved calibration artifact is supplied; roll/batch and part identity controls; PASS/REJECT/HOLD state handling; bounded uploads and inference concurrency; API-authoritative read-only dashboard telemetry; and hash-verified evaluation/evidence tooling.</w:t>
+              <w:br/>
+              <w:br/>
+              <w:t>Deliverables/Outputs: A runnable research prototype, automated safety/integrity tests, local simulation smoke checks, configuration and deployment files, technical documentation, and an evaluation tool that refuses to publish results when required evidence or split integrity is missing. Factory integration, independent performance qualification, and safety approval are future pilot deliverables.</w:t>
             </w:r>
-            <w:r>
-              <w:rPr>
-                <w:rFonts w:ascii="Times New Roman" w:eastAsia="SimHei" w:hAnsi="Times New Roman" w:cs="Times New Roman"/>
-                <w:b/>
-                <w:bCs/>
-                <w:sz w:val="24"/>
-              </w:rPr>
-              <w:t>、</w:t>
-            </w:r>
-            <w:r>
-              <w:rPr>
-                <w:rFonts w:ascii="Times New Roman" w:eastAsia="SimHei" w:hAnsi="Times New Roman" w:cs="Times New Roman"/>
-                <w:b/>
-                <w:bCs/>
-                <w:sz w:val="24"/>
-              </w:rPr>
-              <w:t>Project Plan</w:t>
-            </w:r>
-            <w:r>
-              <w:rPr>
-                <w:rFonts w:ascii="Times New Roman" w:eastAsia="SimHei" w:hAnsi="Times New Roman" w:cs="Times New Roman"/>
-                <w:b/>
-                <w:bCs/>
-                <w:sz w:val="24"/>
-              </w:rPr>
-              <w:t>（</w:t>
-            </w:r>
-            <w:r>
-              <w:rPr>
-                <w:rFonts w:ascii="Times New Roman" w:eastAsia="SimHei" w:hAnsi="Times New Roman" w:cs="Times New Roman"/>
-                <w:b/>
-                <w:bCs/>
-                <w:sz w:val="24"/>
-              </w:rPr>
-              <w:t>e.g.,</w:t>
-            </w:r>
-            <w:r>
-              <w:rPr>
-                <w:rFonts w:ascii="Times New Roman" w:eastAsia="SimHei" w:hAnsi="Times New Roman" w:cs="Times New Roman"/>
-                <w:b/>
-                <w:bCs/>
-                <w:sz w:val="24"/>
-              </w:rPr>
-              <w:t xml:space="preserve"> technical approach, main features/functionalities,</w:t>
-            </w:r>
-            <w:r>
-              <w:rPr>
-                <w:rFonts w:ascii="Times New Roman" w:eastAsia="SimHei" w:hAnsi="Times New Roman" w:cs="Times New Roman" w:hint="eastAsia"/>
-                <w:b/>
-                <w:bCs/>
-                <w:sz w:val="24"/>
-              </w:rPr>
-              <w:t xml:space="preserve"> </w:t>
-            </w:r>
-            <w:r>
-              <w:rPr>
-                <w:rFonts w:ascii="Times New Roman" w:eastAsia="SimHei" w:hAnsi="Times New Roman" w:cs="Times New Roman"/>
-                <w:b/>
-                <w:bCs/>
-                <w:sz w:val="24"/>
-              </w:rPr>
-              <w:t>project deliverables/outputs</w:t>
-            </w:r>
-            <w:r>
-              <w:rPr>
-                <w:rFonts w:ascii="Times New Roman" w:eastAsia="SimHei" w:hAnsi="Times New Roman" w:cs="Times New Roman"/>
-                <w:b/>
-                <w:bCs/>
-                <w:sz w:val="24"/>
-              </w:rPr>
-              <w:t>, etc</w:t>
-            </w:r>
-            <w:r>
-              <w:rPr>
-                <w:rFonts w:ascii="Times New Roman" w:eastAsia="SimHei" w:hAnsi="Times New Roman" w:cs="Times New Roman"/>
-                <w:b/>
-                <w:bCs/>
-                <w:sz w:val="24"/>
-              </w:rPr>
-              <w:t>.</w:t>
-            </w:r>
-            <w:r>
-              <w:rPr>
-                <w:rFonts w:ascii="Times New Roman" w:eastAsia="SimHei" w:hAnsi="Times New Roman" w:cs="Times New Roman"/>
-                <w:b/>
-                <w:bCs/>
-                <w:sz w:val="24"/>
-              </w:rPr>
-              <w:t>）</w:t>
-            </w:r>
-          </w:p>
-          <w:p>
-            <w:pPr>
-              <w:jc w:val="left"/>
-              <w:rPr>
-                <w:rFonts w:ascii="Times New Roman" w:hAnsi="Times New Roman" w:cs="Times New Roman"/>
-                <w:sz w:val="24"/>
-              </w:rPr>
-            </w:pPr>
-          </w:p>
-          <w:p>
-            <w:pPr>
-              <w:rPr>
-                <w:rFonts w:ascii="Times New Roman" w:hAnsi="Times New Roman" w:cs="Times New Roman"/>
-                <w:sz w:val="24"/>
-              </w:rPr>
-            </w:pPr>
-            <w:r>
-              <w:rPr>
-                <w:rFonts w:ascii="Times New Roman" w:hAnsi="Times New Roman" w:cs="Times New Roman"/>
-                <w:b/>
-                <w:bCs/>
-                <w:sz w:val="24"/>
-              </w:rPr>
-              <w:t xml:space="preserve">- </w:t>
-            </w:r>
-            <w:r>
-              <w:rPr>
-                <w:rFonts w:ascii="Times New Roman" w:hAnsi="Times New Roman" w:cs="Times New Roman"/>
-                <w:b/>
-                <w:bCs/>
-                <w:sz w:val="24"/>
-              </w:rPr>
-              <w:t>Technical Approach:</w:t>
-            </w:r>
-            <w:r>
-              <w:rPr>
-                <w:rFonts w:ascii="Times New Roman" w:hAnsi="Times New Roman" w:cs="Times New Roman"/>
-                <w:sz w:val="24"/>
-              </w:rPr>
-              <w:t xml:space="preserve"> The platform utilizes an asynchronous edge-to-cloud architecture. Images captured from simulated or industrial inspection stations are compressed and tagged at the local gateway using OPC UA for machine state exchange. Real-time inference is handled via a production-ready </w:t>
-            </w:r>
-            <w:r>
-              <w:rPr>
-                <w:rFonts w:ascii="Times New Roman" w:hAnsi="Times New Roman" w:cs="Times New Roman"/>
-                <w:i/>
-                <w:iCs/>
-                <w:sz w:val="24"/>
-              </w:rPr>
-              <w:t>YOLOv8-seg</w:t>
-            </w:r>
-            <w:r>
-              <w:rPr>
-                <w:rFonts w:ascii="Times New Roman" w:hAnsi="Times New Roman" w:cs="Times New Roman"/>
-                <w:sz w:val="24"/>
-              </w:rPr>
-              <w:t xml:space="preserve"> instance-segmentation model, compiled and optimized into ONNX/TensorRT format to run efficiently under strict hardware constraints. Metadata is streamed to a relational database, while raw heavy imagery is retained or processed according to regional cloud egress policies. </w:t>
-            </w:r>
-          </w:p>
-          <w:p>
-            <w:pPr>
-              <w:rPr>
-                <w:rFonts w:ascii="Times New Roman" w:hAnsi="Times New Roman" w:cs="Times New Roman"/>
-                <w:sz w:val="24"/>
-              </w:rPr>
-            </w:pPr>
-            <w:r>
-              <w:rPr>
-                <w:rFonts w:ascii="Times New Roman" w:hAnsi="Times New Roman" w:cs="Times New Roman"/>
-                <w:b/>
-                <w:bCs/>
-                <w:sz w:val="24"/>
-              </w:rPr>
-              <w:t xml:space="preserve">- </w:t>
-            </w:r>
-            <w:r>
-              <w:rPr>
-                <w:rFonts w:ascii="Times New Roman" w:hAnsi="Times New Roman" w:cs="Times New Roman"/>
-                <w:b/>
-                <w:bCs/>
-                <w:sz w:val="24"/>
-              </w:rPr>
-              <w:t>Main Features/Functionalities:</w:t>
-            </w:r>
-          </w:p>
-          <w:p>
-            <w:pPr>
-              <w:numPr>
-                <w:ilvl w:val="0"/>
-                <w:numId w:val="1"/>
-              </w:numPr>
-              <w:rPr>
-                <w:rFonts w:ascii="Times New Roman" w:hAnsi="Times New Roman" w:cs="Times New Roman"/>
-                <w:sz w:val="24"/>
-              </w:rPr>
-            </w:pPr>
-            <w:r>
-              <w:rPr>
-                <w:rFonts w:ascii="Times New Roman" w:hAnsi="Times New Roman" w:cs="Times New Roman"/>
-                <w:i/>
-                <w:iCs/>
-                <w:sz w:val="24"/>
-              </w:rPr>
-              <w:t>Inline Defect Segmentation:</w:t>
-            </w:r>
-            <w:r>
-              <w:rPr>
-                <w:rFonts w:ascii="Times New Roman" w:hAnsi="Times New Roman" w:cs="Times New Roman"/>
-                <w:sz w:val="24"/>
-              </w:rPr>
-              <w:t xml:space="preserve"> Localized real-time detection of surface cracks, pinholes, and delamination anomalies. </w:t>
-            </w:r>
-          </w:p>
-          <w:p>
-            <w:pPr>
-              <w:numPr>
-                <w:ilvl w:val="0"/>
-                <w:numId w:val="1"/>
-              </w:numPr>
-              <w:rPr>
-                <w:rFonts w:ascii="Times New Roman" w:hAnsi="Times New Roman" w:cs="Times New Roman"/>
-                <w:sz w:val="24"/>
-              </w:rPr>
-            </w:pPr>
-            <w:r>
-              <w:rPr>
-                <w:rFonts w:ascii="Times New Roman" w:hAnsi="Times New Roman" w:cs="Times New Roman"/>
-                <w:i/>
-                <w:iCs/>
-                <w:sz w:val="24"/>
-              </w:rPr>
-              <w:t>Lifecycle Quality Traceability:</w:t>
-            </w:r>
-            <w:r>
-              <w:rPr>
-                <w:rFonts w:ascii="Times New Roman" w:hAnsi="Times New Roman" w:cs="Times New Roman"/>
-                <w:sz w:val="24"/>
-              </w:rPr>
-              <w:t xml:space="preserve"> Automatic mapping of AI detections to machine conditions, recipe context, and historical model versions. </w:t>
-            </w:r>
-          </w:p>
-          <w:p>
-            <w:pPr>
-              <w:numPr>
-                <w:ilvl w:val="0"/>
-                <w:numId w:val="1"/>
-              </w:numPr>
-              <w:rPr>
-                <w:rFonts w:ascii="Times New Roman" w:hAnsi="Times New Roman" w:cs="Times New Roman"/>
-                <w:sz w:val="24"/>
-              </w:rPr>
-            </w:pPr>
-            <w:r>
-              <w:rPr>
-                <w:rFonts w:ascii="Times New Roman" w:hAnsi="Times New Roman" w:cs="Times New Roman"/>
-                <w:i/>
-                <w:iCs/>
-                <w:sz w:val="24"/>
-              </w:rPr>
-              <w:t>Privacy-Preserving Edge-to-Cloud Orchestration:</w:t>
-            </w:r>
-            <w:r>
-              <w:rPr>
-                <w:rFonts w:ascii="Times New Roman" w:hAnsi="Times New Roman" w:cs="Times New Roman"/>
-                <w:sz w:val="24"/>
-              </w:rPr>
-              <w:t xml:space="preserve"> Policy-based zero-trust transport to prevent manufacturing data leaks. </w:t>
-            </w:r>
-          </w:p>
-          <w:p>
-            <w:pPr>
-              <w:numPr>
-                <w:ilvl w:val="0"/>
-                <w:numId w:val="1"/>
-              </w:numPr>
-              <w:rPr>
-                <w:rFonts w:ascii="Times New Roman" w:hAnsi="Times New Roman" w:cs="Times New Roman"/>
-                <w:sz w:val="24"/>
-              </w:rPr>
-            </w:pPr>
-            <w:r>
-              <w:rPr>
-                <w:rFonts w:ascii="Times New Roman" w:hAnsi="Times New Roman" w:cs="Times New Roman"/>
-                <w:i/>
-                <w:iCs/>
-                <w:sz w:val="24"/>
-              </w:rPr>
-              <w:t>Operator-Facing Diagnostics:</w:t>
-            </w:r>
-            <w:r>
-              <w:rPr>
-                <w:rFonts w:ascii="Times New Roman" w:hAnsi="Times New Roman" w:cs="Times New Roman"/>
-                <w:sz w:val="24"/>
-              </w:rPr>
-              <w:t xml:space="preserve"> Practical dashboard showing defect overlays, </w:t>
-            </w:r>
-            <w:r>
-              <w:rPr>
-                <w:rFonts w:ascii="Times New Roman" w:hAnsi="Times New Roman" w:cs="Times New Roman"/>
-                <w:sz w:val="24"/>
-              </w:rPr>
-              <w:lastRenderedPageBreak/>
-              <w:t xml:space="preserve">severity metrics, and historical run logs. </w:t>
-            </w:r>
-          </w:p>
-          <w:p>
-            <w:pPr>
-              <w:rPr>
-                <w:rFonts w:ascii="Times New Roman" w:hAnsi="Times New Roman" w:cs="Times New Roman"/>
-                <w:sz w:val="24"/>
-              </w:rPr>
-            </w:pPr>
-            <w:r>
-              <w:t xml:space="preserve">- Project Deliverables/Outputs: A functional application prototype backend, technical system architecture design documentation, model benchmarking reports conducted on the included synthetic coating-defect demonstration dataset, and reproducible configuration manifests (Docker/Nginx infrastructure). </w:t>
-            </w:r>
-          </w:p>
-          <w:p>
-            <w:pPr>
-              <w:jc w:val="left"/>
-              <w:rPr>
-                <w:rFonts w:ascii="Times New Roman" w:hAnsi="Times New Roman" w:cs="Times New Roman"/>
-                <w:sz w:val="24"/>
-              </w:rPr>
-            </w:pPr>
-          </w:p>
-          <w:p>
-            <w:pPr>
-              <w:jc w:val="left"/>
-              <w:rPr>
-                <w:rFonts w:ascii="Times New Roman" w:hAnsi="Times New Roman" w:cs="Times New Roman"/>
-                <w:sz w:val="24"/>
-              </w:rPr>
-            </w:pPr>
-          </w:p>
-          <w:p>
-            <w:pPr>
-              <w:jc w:val="left"/>
-              <w:rPr>
-                <w:rFonts w:ascii="Times New Roman" w:hAnsi="Times New Roman" w:cs="Times New Roman"/>
-                <w:sz w:val="24"/>
-              </w:rPr>
-            </w:pPr>
           </w:p>
         </w:tc>
       </w:tr>
@@ -1183,187 +650,21 @@
             <w:tcW w:w="8296" w:type="dxa"/>
           </w:tcPr>
           <w:p>
-            <w:pPr>
-              <w:jc w:val="left"/>
-              <w:rPr>
-                <w:rFonts w:ascii="Times New Roman" w:eastAsia="SimHei" w:hAnsi="Times New Roman" w:cs="Times New Roman"/>
-                <w:b/>
-                <w:bCs/>
-                <w:sz w:val="24"/>
-              </w:rPr>
-            </w:pPr>
             <w:r>
-              <w:rPr>
-                <w:rFonts w:ascii="Times New Roman" w:eastAsia="SimHei" w:hAnsi="Times New Roman" w:cs="Times New Roman"/>
-                <w:b/>
-                <w:bCs/>
-                <w:sz w:val="24"/>
-              </w:rPr>
-              <w:lastRenderedPageBreak/>
-              <w:t>3</w:t>
+              <w:t>3、Key Innovations &amp; Unique Features</w:t>
+              <w:br/>
+              <w:br/>
+              <w:t>Evidence-Gated Quality Decisions: The system separates model output from release authority. Missing sensors, invalid calibration, inference faults, traceability faults, stale or unconfirmed industrial communication, and latched interlocks produce HOLD rather than an inferred PASS.</w:t>
+              <w:br/>
+              <w:br/>
+              <w:t>Traceable Inspection Memory: Each inspection is associated with an active roll and batch, claims a unique (batch_id, part_id), remains PENDING until the final gate outcome is known, and can be represented in a signed certificate snapshot.</w:t>
+              <w:br/>
+              <w:br/>
+              <w:t>Reproducible Evaluation Boundaries: The evaluation engine validates artifact hashes, requires an immutable roll-disjoint manifest, uses one instance-matching policy for box and mask metrics, and records model, dataset, manifest, and source-commit provenance.</w:t>
+              <w:br/>
+              <w:br/>
+              <w:t>Practical Deployment Boundary: The dashboard is read-only and API-authoritative. Industrial I/O is explicitly marked SIMULATED when no PLC is connected. The repository therefore makes the distinction between software readiness and physical qualification visible instead of hiding it behind a headline metric.</w:t>
             </w:r>
-            <w:r>
-              <w:rPr>
-                <w:rFonts w:ascii="Times New Roman" w:eastAsia="SimHei" w:hAnsi="Times New Roman" w:cs="Times New Roman"/>
-                <w:b/>
-                <w:bCs/>
-                <w:sz w:val="24"/>
-              </w:rPr>
-              <w:t>、</w:t>
-            </w:r>
-            <w:r>
-              <w:rPr>
-                <w:rFonts w:ascii="Times New Roman" w:eastAsia="SimHei" w:hAnsi="Times New Roman" w:cs="Times New Roman"/>
-                <w:b/>
-                <w:bCs/>
-                <w:sz w:val="24"/>
-              </w:rPr>
-              <w:t xml:space="preserve">Key Innovations &amp; </w:t>
-            </w:r>
-            <w:r>
-              <w:rPr>
-                <w:rFonts w:ascii="Times New Roman" w:eastAsia="SimHei" w:hAnsi="Times New Roman" w:cs="Times New Roman"/>
-                <w:b/>
-                <w:bCs/>
-                <w:sz w:val="24"/>
-              </w:rPr>
-              <w:t>Unique Features</w:t>
-            </w:r>
-          </w:p>
-          <w:p>
-            <w:pPr>
-              <w:jc w:val="left"/>
-              <w:rPr>
-                <w:rFonts w:ascii="Times New Roman" w:hAnsi="Times New Roman" w:cs="Times New Roman"/>
-                <w:sz w:val="24"/>
-              </w:rPr>
-            </w:pPr>
-          </w:p>
-          <w:p>
-            <w:pPr>
-              <w:rPr>
-                <w:rFonts w:ascii="Times New Roman" w:hAnsi="Times New Roman" w:cs="Times New Roman"/>
-                <w:sz w:val="24"/>
-              </w:rPr>
-            </w:pPr>
-            <w:r>
-              <w:rPr>
-                <w:rFonts w:ascii="Times New Roman" w:hAnsi="Times New Roman" w:cs="Times New Roman"/>
-                <w:b/>
-                <w:bCs/>
-                <w:sz w:val="24"/>
-              </w:rPr>
-              <w:t xml:space="preserve">- </w:t>
-            </w:r>
-            <w:r>
-              <w:rPr>
-                <w:rFonts w:ascii="Times New Roman" w:hAnsi="Times New Roman" w:cs="Times New Roman"/>
-                <w:b/>
-                <w:bCs/>
-                <w:sz w:val="24"/>
-              </w:rPr>
-              <w:t>Traceable Quality Decision Memory:</w:t>
-            </w:r>
-            <w:r>
-              <w:rPr>
-                <w:rFonts w:ascii="Times New Roman" w:hAnsi="Times New Roman" w:cs="Times New Roman"/>
-                <w:sz w:val="24"/>
-              </w:rPr>
-              <w:t xml:space="preserve"> The platform moves beyond generic pixel masking. It converts raw image segmentation into an actionable manufacturing decision system, capturing metadata (Run ID, Roll ID) to enable end-to-end quality memory and rapid root-cause analysis. </w:t>
-            </w:r>
-          </w:p>
-          <w:p>
-            <w:pPr>
-              <w:rPr>
-                <w:rFonts w:ascii="Times New Roman" w:hAnsi="Times New Roman" w:cs="Times New Roman"/>
-                <w:sz w:val="24"/>
-              </w:rPr>
-            </w:pPr>
-            <w:r>
-              <w:rPr>
-                <w:rFonts w:ascii="Times New Roman" w:hAnsi="Times New Roman" w:cs="Times New Roman"/>
-                <w:b/>
-                <w:bCs/>
-                <w:sz w:val="24"/>
-              </w:rPr>
-              <w:t xml:space="preserve">- </w:t>
-            </w:r>
-            <w:r>
-              <w:rPr>
-                <w:rFonts w:ascii="Times New Roman" w:hAnsi="Times New Roman" w:cs="Times New Roman"/>
-                <w:b/>
-                <w:bCs/>
-                <w:sz w:val="24"/>
-              </w:rPr>
-              <w:t>Privacy-First Industrial Security Architecture:</w:t>
-            </w:r>
-            <w:r>
-              <w:rPr>
-                <w:rFonts w:ascii="Times New Roman" w:hAnsi="Times New Roman" w:cs="Times New Roman"/>
-                <w:sz w:val="24"/>
-              </w:rPr>
-              <w:t xml:space="preserve"> Manufacturing recipes are corporate trade secrets. This platform treats edge execution, encrypted storage (AES at rest, TLS in transit), and tenant-isolated APIs aligned with OWASP API Security principles as core infrastructure requirements rather than afterthoughts. </w:t>
-            </w:r>
-          </w:p>
-          <w:p>
-            <w:pPr>
-              <w:rPr>
-                <w:rFonts w:ascii="Times New Roman" w:hAnsi="Times New Roman" w:cs="Times New Roman"/>
-                <w:sz w:val="24"/>
-              </w:rPr>
-            </w:pPr>
-            <w:r>
-              <w:rPr>
-                <w:rFonts w:ascii="Times New Roman" w:hAnsi="Times New Roman" w:cs="Times New Roman"/>
-                <w:b/>
-                <w:bCs/>
-                <w:sz w:val="24"/>
-              </w:rPr>
-              <w:t xml:space="preserve">- </w:t>
-            </w:r>
-            <w:r>
-              <w:rPr>
-                <w:rFonts w:ascii="Times New Roman" w:hAnsi="Times New Roman" w:cs="Times New Roman"/>
-                <w:b/>
-                <w:bCs/>
-                <w:sz w:val="24"/>
-              </w:rPr>
-              <w:t>Compute-Aware Orchestration Lifecycle:</w:t>
-            </w:r>
-            <w:r>
-              <w:rPr>
-                <w:rFonts w:ascii="Times New Roman" w:hAnsi="Times New Roman" w:cs="Times New Roman"/>
-                <w:sz w:val="24"/>
-              </w:rPr>
-              <w:t xml:space="preserve"> The project utilizes distributed compute platforms intelligently—allocating intensive batch experiments and stress tests under distribution shifts to large-scale computing nodes (SCNet/Sugon) while retaining lightweight cloud primitives (Paratera clusters) for fast versioning and registry control via MLflow and DVC.</w:t>
-            </w:r>
-          </w:p>
-          <w:p>
-            <w:pPr>
-              <w:jc w:val="left"/>
-              <w:rPr>
-                <w:rFonts w:ascii="Times New Roman" w:hAnsi="Times New Roman" w:cs="Times New Roman"/>
-                <w:sz w:val="24"/>
-              </w:rPr>
-            </w:pPr>
-          </w:p>
-          <w:p>
-            <w:pPr>
-              <w:jc w:val="left"/>
-              <w:rPr>
-                <w:rFonts w:ascii="Times New Roman" w:hAnsi="Times New Roman" w:cs="Times New Roman"/>
-                <w:sz w:val="24"/>
-              </w:rPr>
-            </w:pPr>
-          </w:p>
-          <w:p>
-            <w:pPr>
-              <w:jc w:val="left"/>
-              <w:rPr>
-                <w:rFonts w:ascii="Times New Roman" w:hAnsi="Times New Roman" w:cs="Times New Roman"/>
-                <w:sz w:val="24"/>
-              </w:rPr>
-            </w:pPr>
           </w:p>
         </w:tc>
       </w:tr>
@@ -1373,162 +674,18 @@
             <w:tcW w:w="8296" w:type="dxa"/>
           </w:tcPr>
           <w:p>
-            <w:pPr>
-              <w:jc w:val="left"/>
-              <w:rPr>
-                <w:rFonts w:ascii="Times New Roman" w:eastAsia="SimHei" w:hAnsi="Times New Roman" w:cs="Times New Roman"/>
-                <w:b/>
-                <w:bCs/>
-                <w:sz w:val="24"/>
-              </w:rPr>
-            </w:pPr>
             <w:r>
-              <w:rPr>
-                <w:rFonts w:ascii="Times New Roman" w:eastAsia="SimHei" w:hAnsi="Times New Roman" w:cs="Times New Roman"/>
-                <w:b/>
-                <w:bCs/>
-                <w:sz w:val="24"/>
-              </w:rPr>
-              <w:t>4</w:t>
+              <w:t>4、Applications &amp; Market Potential</w:t>
+              <w:br/>
+              <w:br/>
+              <w:t>Immediate Application: A future pilot could use the software as an inspection and traceability layer for lithium-ion electrode coating, drying, and coated-foil processes, subject to plant calibration, sensor integration, PLC/HIL testing, and safety approval.</w:t>
+              <w:br/>
+              <w:br/>
+              <w:t>Adjacent Applications: The same evidence-gated workflow may be adapted to other coated materials, separators, fuel-cell components, and high-value continuous-web manufacturing where surface inspection and traceability are important.</w:t>
+              <w:br/>
+              <w:br/>
+              <w:t>Market Potential: The opportunity is to reduce manual review and improve response time to recurring coating defects. The current repository does not quantify scrap reduction, escape rate, payback, or production yield; those values require independent plant measurements and a defined pilot protocol.</w:t>
             </w:r>
-            <w:r>
-              <w:rPr>
-                <w:rFonts w:ascii="Times New Roman" w:eastAsia="SimHei" w:hAnsi="Times New Roman" w:cs="Times New Roman"/>
-                <w:b/>
-                <w:bCs/>
-                <w:sz w:val="24"/>
-              </w:rPr>
-              <w:t>、</w:t>
-            </w:r>
-            <w:r>
-              <w:rPr>
-                <w:rFonts w:ascii="Times New Roman" w:eastAsia="SimHei" w:hAnsi="Times New Roman" w:cs="Times New Roman"/>
-                <w:b/>
-                <w:bCs/>
-                <w:sz w:val="24"/>
-              </w:rPr>
-              <w:t xml:space="preserve">Applications &amp; Market </w:t>
-            </w:r>
-            <w:r>
-              <w:rPr>
-                <w:rFonts w:ascii="Times New Roman" w:eastAsia="SimHei" w:hAnsi="Times New Roman" w:cs="Times New Roman"/>
-                <w:b/>
-                <w:bCs/>
-                <w:sz w:val="24"/>
-              </w:rPr>
-              <w:t>Potential</w:t>
-            </w:r>
-          </w:p>
-          <w:p>
-            <w:pPr>
-              <w:jc w:val="left"/>
-              <w:rPr>
-                <w:rFonts w:ascii="Times New Roman" w:hAnsi="Times New Roman" w:cs="Times New Roman"/>
-                <w:sz w:val="24"/>
-              </w:rPr>
-            </w:pPr>
-          </w:p>
-          <w:p>
-            <w:pPr>
-              <w:rPr>
-                <w:rFonts w:ascii="Times New Roman" w:hAnsi="Times New Roman" w:cs="Times New Roman"/>
-                <w:sz w:val="24"/>
-              </w:rPr>
-            </w:pPr>
-            <w:r>
-              <w:rPr>
-                <w:rFonts w:ascii="Times New Roman" w:hAnsi="Times New Roman" w:cs="Times New Roman"/>
-                <w:b/>
-                <w:bCs/>
-                <w:sz w:val="24"/>
-              </w:rPr>
-              <w:t xml:space="preserve">- </w:t>
-            </w:r>
-            <w:r>
-              <w:rPr>
-                <w:rFonts w:ascii="Times New Roman" w:hAnsi="Times New Roman" w:cs="Times New Roman"/>
-                <w:b/>
-                <w:bCs/>
-                <w:sz w:val="24"/>
-              </w:rPr>
-              <w:t>Immediate Application:</w:t>
-            </w:r>
-            <w:r>
-              <w:rPr>
-                <w:rFonts w:ascii="Times New Roman" w:hAnsi="Times New Roman" w:cs="Times New Roman"/>
-                <w:sz w:val="24"/>
-              </w:rPr>
-              <w:t xml:space="preserve"> Inline quality assurance for lithium-ion battery electrode coating and drying manufacturing lines. The technology can adapt directly to adjacent electrochemical domains, including fuel cells, coated foils, and high-value separators where surface defects cause catastrophic downstream financial scrap. </w:t>
-            </w:r>
-          </w:p>
-          <w:p>
-            <w:pPr>
-              <w:rPr>
-                <w:rFonts w:ascii="Times New Roman" w:hAnsi="Times New Roman" w:cs="Times New Roman"/>
-                <w:sz w:val="24"/>
-              </w:rPr>
-            </w:pPr>
-            <w:r>
-              <w:rPr>
-                <w:rFonts w:ascii="Times New Roman" w:hAnsi="Times New Roman" w:cs="Times New Roman"/>
-                <w:b/>
-                <w:bCs/>
-                <w:sz w:val="24"/>
-              </w:rPr>
-              <w:t xml:space="preserve">- </w:t>
-            </w:r>
-            <w:r>
-              <w:rPr>
-                <w:rFonts w:ascii="Times New Roman" w:hAnsi="Times New Roman" w:cs="Times New Roman"/>
-                <w:b/>
-                <w:bCs/>
-                <w:sz w:val="24"/>
-              </w:rPr>
-              <w:t>Market Potential:</w:t>
-            </w:r>
-            <w:r>
-              <w:rPr>
-                <w:rFonts w:ascii="Times New Roman" w:hAnsi="Times New Roman" w:cs="Times New Roman"/>
-                <w:sz w:val="24"/>
-              </w:rPr>
-              <w:t xml:space="preserve"> With global EV battery demand projected to surge rapidly by 2030, and billions invested globally in fabrication infrastructure, manufacturing efficiency is critical. Electrode processing steps (mixing, coating, drying) account for over 20% of battery fabrication costs and remain highly defect-prone. By introducing automated, non-destructive edge metrology, this system mitigates manual review burdens, lowers defect escape rates, and directly optimizes factory yield economics. </w:t>
-            </w:r>
-          </w:p>
-          <w:p>
-            <w:pPr>
-              <w:jc w:val="left"/>
-              <w:rPr>
-                <w:rFonts w:ascii="Times New Roman" w:hAnsi="Times New Roman" w:cs="Times New Roman"/>
-                <w:sz w:val="24"/>
-              </w:rPr>
-            </w:pPr>
-          </w:p>
-          <w:p>
-            <w:pPr>
-              <w:jc w:val="left"/>
-              <w:rPr>
-                <w:rFonts w:ascii="Times New Roman" w:hAnsi="Times New Roman" w:cs="Times New Roman"/>
-                <w:sz w:val="24"/>
-              </w:rPr>
-            </w:pPr>
-          </w:p>
-          <w:p>
-            <w:pPr>
-              <w:jc w:val="left"/>
-              <w:rPr>
-                <w:rFonts w:ascii="Times New Roman" w:hAnsi="Times New Roman" w:cs="Times New Roman"/>
-                <w:sz w:val="24"/>
-              </w:rPr>
-            </w:pPr>
-          </w:p>
-          <w:p>
-            <w:pPr>
-              <w:jc w:val="left"/>
-              <w:rPr>
-                <w:rFonts w:ascii="Times New Roman" w:hAnsi="Times New Roman" w:cs="Times New Roman"/>
-                <w:sz w:val="24"/>
-              </w:rPr>
-            </w:pPr>
           </w:p>
         </w:tc>
       </w:tr>
@@ -1538,246 +695,18 @@
             <w:tcW w:w="8296" w:type="dxa"/>
           </w:tcPr>
           <w:p>
-            <w:pPr>
-              <w:rPr>
-                <w:rFonts w:ascii="Times New Roman" w:eastAsia="SimHei" w:hAnsi="Times New Roman" w:cs="Times New Roman"/>
-                <w:b/>
-                <w:bCs/>
-                <w:sz w:val="24"/>
-              </w:rPr>
-            </w:pPr>
             <w:r>
-              <w:rPr>
-                <w:rFonts w:ascii="Times New Roman" w:eastAsia="SimHei" w:hAnsi="Times New Roman" w:cs="Times New Roman"/>
-                <w:b/>
-                <w:bCs/>
-                <w:sz w:val="24"/>
-              </w:rPr>
-              <w:t>5</w:t>
+              <w:t>5、Business Case/Strategy（e.g., go-to-market strategy, business model, market size/opportunity, and operational model, etc.）</w:t>
+              <w:br/>
+              <w:br/>
+              <w:t>Go-to-Market Strategy: Begin with a controlled, single-line technical pilot alongside the existing inspection stack. The pilot would first verify data governance, calibration, model performance, PLC command behavior, and operator procedures before any production decision authority is considered.</w:t>
+              <w:br/>
+              <w:br/>
+              <w:t>Business &amp; Operational Model: A potential model is an implementation and integration service followed by site support for calibration management, model monitoring, traceability, and evidence reporting. Pricing, savings, and expansion assumptions should be set only after a plant-specific baseline and independently reviewed pilot results are available.</w:t>
+              <w:br/>
+              <w:br/>
+              <w:t>Risk Boundary: The present submission is a software research prototype. It is not sold as a safety-rated controller, regulatory certificate generator, or proven zero-escape production system.</w:t>
             </w:r>
-            <w:r>
-              <w:rPr>
-                <w:rFonts w:ascii="Times New Roman" w:eastAsia="SimHei" w:hAnsi="Times New Roman" w:cs="Times New Roman"/>
-                <w:b/>
-                <w:bCs/>
-                <w:sz w:val="24"/>
-              </w:rPr>
-              <w:t>、</w:t>
-            </w:r>
-            <w:r>
-              <w:rPr>
-                <w:rFonts w:ascii="Times New Roman" w:eastAsia="SimHei" w:hAnsi="Times New Roman" w:cs="Times New Roman"/>
-                <w:b/>
-                <w:bCs/>
-                <w:sz w:val="24"/>
-              </w:rPr>
-              <w:t>Business Case/Strategy</w:t>
-            </w:r>
-            <w:r>
-              <w:rPr>
-                <w:rFonts w:ascii="Times New Roman" w:eastAsia="SimHei" w:hAnsi="Times New Roman" w:cs="Times New Roman"/>
-                <w:b/>
-                <w:bCs/>
-                <w:sz w:val="24"/>
-              </w:rPr>
-              <w:t>（</w:t>
-            </w:r>
-            <w:r>
-              <w:rPr>
-                <w:rFonts w:ascii="Times New Roman" w:eastAsia="SimHei" w:hAnsi="Times New Roman" w:cs="Times New Roman"/>
-                <w:b/>
-                <w:bCs/>
-                <w:sz w:val="24"/>
-              </w:rPr>
-              <w:t>e.g.,</w:t>
-            </w:r>
-            <w:r>
-              <w:rPr>
-                <w:rFonts w:ascii="Times New Roman" w:eastAsia="SimHei" w:hAnsi="Times New Roman" w:cs="Times New Roman"/>
-                <w:b/>
-                <w:bCs/>
-                <w:sz w:val="24"/>
-              </w:rPr>
-              <w:t xml:space="preserve"> go-to-market strategy, business model, market size/opportunity, and operational model</w:t>
-            </w:r>
-            <w:r>
-              <w:rPr>
-                <w:rFonts w:ascii="Times New Roman" w:eastAsia="SimHei" w:hAnsi="Times New Roman" w:cs="Times New Roman"/>
-                <w:b/>
-                <w:bCs/>
-                <w:sz w:val="24"/>
-              </w:rPr>
-              <w:t>, etc</w:t>
-            </w:r>
-            <w:r>
-              <w:rPr>
-                <w:rFonts w:ascii="Times New Roman" w:eastAsia="SimHei" w:hAnsi="Times New Roman" w:cs="Times New Roman" w:hint="eastAsia"/>
-                <w:b/>
-                <w:bCs/>
-                <w:sz w:val="24"/>
-              </w:rPr>
-              <w:t>.</w:t>
-            </w:r>
-            <w:r>
-              <w:rPr>
-                <w:rFonts w:ascii="Times New Roman" w:eastAsia="SimHei" w:hAnsi="Times New Roman" w:cs="Times New Roman"/>
-                <w:b/>
-                <w:bCs/>
-                <w:sz w:val="24"/>
-              </w:rPr>
-              <w:t>）</w:t>
-            </w:r>
-          </w:p>
-          <w:p>
-            <w:pPr>
-              <w:rPr>
-                <w:rFonts w:ascii="Times New Roman" w:hAnsi="Times New Roman" w:cs="Times New Roman"/>
-                <w:sz w:val="24"/>
-              </w:rPr>
-            </w:pPr>
-            <w:r>
-              <w:rPr>
-                <w:rFonts w:ascii="Times New Roman" w:hAnsi="Times New Roman" w:cs="Times New Roman"/>
-                <w:b/>
-                <w:bCs/>
-                <w:sz w:val="24"/>
-              </w:rPr>
-              <w:lastRenderedPageBreak/>
-              <w:t xml:space="preserve">- </w:t>
-            </w:r>
-            <w:r>
-              <w:rPr>
-                <w:rFonts w:ascii="Times New Roman" w:hAnsi="Times New Roman" w:cs="Times New Roman"/>
-                <w:b/>
-                <w:bCs/>
-                <w:sz w:val="24"/>
-              </w:rPr>
-              <w:t>Go-to-Market Strategy:</w:t>
-            </w:r>
-            <w:r>
-              <w:rPr>
-                <w:rFonts w:ascii="Times New Roman" w:hAnsi="Times New Roman" w:cs="Times New Roman"/>
-                <w:sz w:val="24"/>
-              </w:rPr>
-              <w:t xml:space="preserve"> The project adopts a high-probability "Private Pilot" deployment model. Instead of an all-in-one generic SaaS play, the initial strategy integrates the software layer with existing on-site camera gateways on a single production line. Once the platform demonstrates repeatable consistency in defect detection and zero-leak security compliance, horizontal expansion can scale across broader factory sites. </w:t>
-            </w:r>
-          </w:p>
-          <w:p>
-            <w:pPr>
-              <w:rPr>
-                <w:rFonts w:ascii="Times New Roman" w:hAnsi="Times New Roman" w:cs="Times New Roman"/>
-                <w:sz w:val="24"/>
-              </w:rPr>
-            </w:pPr>
-            <w:r>
-              <w:rPr>
-                <w:rFonts w:ascii="Times New Roman" w:hAnsi="Times New Roman" w:cs="Times New Roman"/>
-                <w:b/>
-                <w:bCs/>
-                <w:sz w:val="24"/>
-              </w:rPr>
-              <w:t xml:space="preserve">- </w:t>
-            </w:r>
-            <w:r>
-              <w:rPr>
-                <w:rFonts w:ascii="Times New Roman" w:hAnsi="Times New Roman" w:cs="Times New Roman"/>
-                <w:b/>
-                <w:bCs/>
-                <w:sz w:val="24"/>
-              </w:rPr>
-              <w:t>Business &amp; Operational Model:</w:t>
-            </w:r>
-            <w:r>
-              <w:rPr>
-                <w:rFonts w:ascii="Times New Roman" w:hAnsi="Times New Roman" w:cs="Times New Roman"/>
-                <w:sz w:val="24"/>
-              </w:rPr>
-              <w:t xml:space="preserve"> A multi-layered commercial structure:</w:t>
-            </w:r>
-          </w:p>
-          <w:p>
-            <w:pPr>
-              <w:numPr>
-                <w:ilvl w:val="0"/>
-                <w:numId w:val="2"/>
-              </w:numPr>
-              <w:rPr>
-                <w:rFonts w:ascii="Times New Roman" w:hAnsi="Times New Roman" w:cs="Times New Roman"/>
-                <w:sz w:val="24"/>
-              </w:rPr>
-            </w:pPr>
-            <w:r>
-              <w:rPr>
-                <w:rFonts w:ascii="Times New Roman" w:hAnsi="Times New Roman" w:cs="Times New Roman"/>
-                <w:sz w:val="24"/>
-              </w:rPr>
-              <w:t xml:space="preserve">An upfront implementation and integration fee for edge deployment and localized model calibration. </w:t>
-            </w:r>
-          </w:p>
-          <w:p>
-            <w:pPr>
-              <w:numPr>
-                <w:ilvl w:val="0"/>
-                <w:numId w:val="2"/>
-              </w:numPr>
-              <w:rPr>
-                <w:rFonts w:ascii="Times New Roman" w:hAnsi="Times New Roman" w:cs="Times New Roman"/>
-                <w:sz w:val="24"/>
-              </w:rPr>
-            </w:pPr>
-            <w:r>
-              <w:rPr>
-                <w:rFonts w:ascii="Times New Roman" w:hAnsi="Times New Roman" w:cs="Times New Roman"/>
-                <w:sz w:val="24"/>
-              </w:rPr>
-              <w:t xml:space="preserve">An annual site license/support contract for system maintenance, infrastructure health monitoring, and drift detection. </w:t>
-            </w:r>
-          </w:p>
-          <w:p>
-            <w:pPr>
-              <w:numPr>
-                <w:ilvl w:val="0"/>
-                <w:numId w:val="2"/>
-              </w:numPr>
-              <w:rPr>
-                <w:rFonts w:ascii="Times New Roman" w:hAnsi="Times New Roman" w:cs="Times New Roman"/>
-                <w:sz w:val="24"/>
-              </w:rPr>
-            </w:pPr>
-            <w:r>
-              <w:rPr>
-                <w:rFonts w:ascii="Times New Roman" w:hAnsi="Times New Roman" w:cs="Times New Roman"/>
-                <w:sz w:val="24"/>
-              </w:rPr>
-              <w:t>An advanced analytics add-on module correlating defect metadata with machine state variables to optimize upstream recipe configurations.</w:t>
-            </w:r>
-          </w:p>
-          <w:p>
-            <w:pPr>
-              <w:jc w:val="left"/>
-              <w:rPr>
-                <w:rFonts w:ascii="Times New Roman" w:hAnsi="Times New Roman" w:cs="Times New Roman"/>
-                <w:sz w:val="24"/>
-              </w:rPr>
-            </w:pPr>
-          </w:p>
-          <w:p>
-            <w:pPr>
-              <w:jc w:val="left"/>
-              <w:rPr>
-                <w:rFonts w:ascii="Times New Roman" w:hAnsi="Times New Roman" w:cs="Times New Roman"/>
-                <w:sz w:val="24"/>
-              </w:rPr>
-            </w:pPr>
-          </w:p>
-          <w:p>
-            <w:pPr>
-              <w:jc w:val="left"/>
-              <w:rPr>
-                <w:rFonts w:ascii="Times New Roman" w:hAnsi="Times New Roman" w:cs="Times New Roman"/>
-                <w:sz w:val="24"/>
-              </w:rPr>
-            </w:pPr>
           </w:p>
         </w:tc>
       </w:tr>
@@ -1787,196 +716,18 @@
             <w:tcW w:w="8296" w:type="dxa"/>
           </w:tcPr>
           <w:p>
-            <w:pPr>
-              <w:rPr>
-                <w:rFonts w:ascii="Times New Roman" w:eastAsia="SimHei" w:hAnsi="Times New Roman" w:cs="Times New Roman"/>
-                <w:b/>
-                <w:bCs/>
-                <w:sz w:val="24"/>
-              </w:rPr>
-            </w:pPr>
             <w:r>
-              <w:rPr>
-                <w:rFonts w:ascii="Times New Roman" w:eastAsia="SimHei" w:hAnsi="Times New Roman" w:cs="Times New Roman"/>
-                <w:b/>
-                <w:bCs/>
-                <w:sz w:val="24"/>
-              </w:rPr>
-              <w:lastRenderedPageBreak/>
-              <w:t>6</w:t>
+              <w:t>6、Additional Information（e.g., R&amp;D process, lessons learned, etc.）</w:t>
+              <w:br/>
+              <w:br/>
+              <w:t>R&amp;D Process &amp; Execution Discipline: Development uses a staged workflow: establish the safety and evidence contract, implement the smallest verifiable change, run automated regression tests, perform local API/dashboard smoke checks, and record limitations in the implementation ledger. The current repository records 85 passing tests with no skips in the latest documented validation, but local simulation is not hardware evidence.</w:t>
+              <w:br/>
+              <w:br/>
+              <w:t>Lessons Learned: In industrial AI, an accuracy number is only useful when its data split, model artifact, calibration, decision semantics, and failure behavior are auditable. A smaller established model with clear provenance is preferable to a larger model that has not been retrained and independently evaluated. YOLO11 remains a candidate experiment, not a claimed upgrade.</w:t>
+              <w:br/>
+              <w:br/>
+              <w:t>Next Validation Steps: Obtain an independent roll-disjoint dataset, run a controlled YOLOv8n versus YOLO11n/YOLO11s comparison, complete PLC/HIL and safety testing, validate factory calibration, and publish only measurements supported by immutable evidence.</w:t>
             </w:r>
-            <w:r>
-              <w:rPr>
-                <w:rFonts w:ascii="Times New Roman" w:eastAsia="SimHei" w:hAnsi="Times New Roman" w:cs="Times New Roman"/>
-                <w:b/>
-                <w:bCs/>
-                <w:sz w:val="24"/>
-              </w:rPr>
-              <w:t>、</w:t>
-            </w:r>
-            <w:r>
-              <w:rPr>
-                <w:rFonts w:ascii="Times New Roman" w:eastAsia="SimHei" w:hAnsi="Times New Roman" w:cs="Times New Roman"/>
-                <w:b/>
-                <w:bCs/>
-                <w:sz w:val="24"/>
-              </w:rPr>
-              <w:t>Additional Information</w:t>
-            </w:r>
-            <w:r>
-              <w:rPr>
-                <w:rFonts w:ascii="Times New Roman" w:eastAsia="SimHei" w:hAnsi="Times New Roman" w:cs="Times New Roman"/>
-                <w:b/>
-                <w:bCs/>
-                <w:sz w:val="24"/>
-              </w:rPr>
-              <w:t>（</w:t>
-            </w:r>
-            <w:r>
-              <w:rPr>
-                <w:rFonts w:ascii="Times New Roman" w:eastAsia="SimHei" w:hAnsi="Times New Roman" w:cs="Times New Roman"/>
-                <w:b/>
-                <w:bCs/>
-                <w:sz w:val="24"/>
-              </w:rPr>
-              <w:t>e.g., R&amp;D process, lessons learned, etc.</w:t>
-            </w:r>
-            <w:r>
-              <w:rPr>
-                <w:rFonts w:ascii="Times New Roman" w:eastAsia="SimHei" w:hAnsi="Times New Roman" w:cs="Times New Roman"/>
-                <w:b/>
-                <w:bCs/>
-                <w:sz w:val="24"/>
-              </w:rPr>
-              <w:t>）</w:t>
-            </w:r>
-          </w:p>
-          <w:p>
-            <w:pPr>
-              <w:jc w:val="left"/>
-              <w:rPr>
-                <w:rFonts w:ascii="Times New Roman" w:eastAsia="SimHei" w:hAnsi="Times New Roman" w:cs="Times New Roman"/>
-                <w:sz w:val="24"/>
-              </w:rPr>
-            </w:pPr>
-          </w:p>
-          <w:p>
-            <w:pPr>
-              <w:rPr>
-                <w:rFonts w:ascii="Times New Roman" w:eastAsia="SimHei" w:hAnsi="Times New Roman" w:cs="Times New Roman"/>
-                <w:sz w:val="24"/>
-              </w:rPr>
-            </w:pPr>
-            <w:r>
-              <w:rPr>
-                <w:rFonts w:ascii="Times New Roman" w:eastAsia="SimHei" w:hAnsi="Times New Roman" w:cs="Times New Roman"/>
-                <w:b/>
-                <w:bCs/>
-                <w:sz w:val="24"/>
-              </w:rPr>
-              <w:t xml:space="preserve">- </w:t>
-            </w:r>
-            <w:r>
-              <w:rPr>
-                <w:rFonts w:ascii="Times New Roman" w:eastAsia="SimHei" w:hAnsi="Times New Roman" w:cs="Times New Roman"/>
-                <w:b/>
-                <w:bCs/>
-                <w:sz w:val="24"/>
-              </w:rPr>
-              <w:t>R&amp;D Process &amp; Execution Discipline:</w:t>
-            </w:r>
-            <w:r>
-              <w:rPr>
-                <w:rFonts w:ascii="Times New Roman" w:eastAsia="SimHei" w:hAnsi="Times New Roman" w:cs="Times New Roman"/>
-                <w:sz w:val="24"/>
-              </w:rPr>
-              <w:t xml:space="preserve"> As a solo engineer, the research workflow focuses heavily on system integration and architectural coherence. Development velocity is accelerated by utilizing pre-existing codebase baselines from the open-source </w:t>
-            </w:r>
-            <w:r>
-              <w:rPr>
-                <w:rFonts w:ascii="Times New Roman" w:eastAsia="SimHei" w:hAnsi="Times New Roman" w:cs="Times New Roman"/>
-                <w:i/>
-                <w:iCs/>
-                <w:sz w:val="24"/>
-              </w:rPr>
-              <w:t>CoatingVision</w:t>
-            </w:r>
-            <w:r>
-              <w:rPr>
-                <w:rFonts w:ascii="Times New Roman" w:eastAsia="SimHei" w:hAnsi="Times New Roman" w:cs="Times New Roman"/>
-                <w:sz w:val="24"/>
-              </w:rPr>
-              <w:t xml:space="preserve"> benchmark, mitigating data-collection cold starts. AI-assisted coding tools (ByteDance Volcano Engine/Alibaba Cloud infrastructure) are integrated into the pipeline to automate repetitive boilerplate tasks, freeing bandwidth to focus exclusively on backend orchestration, rate-limiting security controls, and high-throughput data pipelines. </w:t>
-            </w:r>
-          </w:p>
-          <w:p>
-            <w:pPr>
-              <w:rPr>
-                <w:rFonts w:ascii="Times New Roman" w:eastAsia="SimHei" w:hAnsi="Times New Roman" w:cs="Times New Roman"/>
-                <w:sz w:val="24"/>
-              </w:rPr>
-            </w:pPr>
-            <w:r>
-              <w:rPr>
-                <w:rFonts w:ascii="Times New Roman" w:eastAsia="SimHei" w:hAnsi="Times New Roman" w:cs="Times New Roman"/>
-                <w:b/>
-                <w:bCs/>
-                <w:sz w:val="24"/>
-              </w:rPr>
-              <w:t xml:space="preserve">- </w:t>
-            </w:r>
-            <w:r>
-              <w:rPr>
-                <w:rFonts w:ascii="Times New Roman" w:eastAsia="SimHei" w:hAnsi="Times New Roman" w:cs="Times New Roman"/>
-                <w:b/>
-                <w:bCs/>
-                <w:sz w:val="24"/>
-              </w:rPr>
-              <w:t>Lessons Learned:</w:t>
-            </w:r>
-            <w:r>
-              <w:rPr>
-                <w:rFonts w:ascii="Times New Roman" w:eastAsia="SimHei" w:hAnsi="Times New Roman" w:cs="Times New Roman"/>
-                <w:sz w:val="24"/>
-              </w:rPr>
-              <w:t xml:space="preserve"> Industrial AI applications are rarely constrained by pure model accuracy, but rather by deployment realism, infrastructure packet-loss management, and strict data privacy boundaries. Building systems under clear performance and resource constraints yields highly robust, adoptable enterprise software. </w:t>
-            </w:r>
-          </w:p>
-          <w:p>
-            <w:pPr>
-              <w:jc w:val="left"/>
-              <w:rPr>
-                <w:rFonts w:ascii="Times New Roman" w:eastAsia="SimHei" w:hAnsi="Times New Roman" w:cs="Times New Roman"/>
-                <w:sz w:val="24"/>
-              </w:rPr>
-            </w:pPr>
-          </w:p>
-          <w:p>
-            <w:pPr>
-              <w:jc w:val="left"/>
-              <w:rPr>
-                <w:rFonts w:ascii="Times New Roman" w:eastAsia="SimHei" w:hAnsi="Times New Roman" w:cs="Times New Roman"/>
-                <w:sz w:val="24"/>
-              </w:rPr>
-            </w:pPr>
-          </w:p>
-          <w:p>
-            <w:pPr>
-              <w:jc w:val="left"/>
-              <w:rPr>
-                <w:rFonts w:ascii="Times New Roman" w:eastAsia="SimHei" w:hAnsi="Times New Roman" w:cs="Times New Roman"/>
-                <w:sz w:val="24"/>
-              </w:rPr>
-            </w:pPr>
-          </w:p>
-          <w:p>
-            <w:pPr>
-              <w:jc w:val="left"/>
-              <w:rPr>
-                <w:rFonts w:ascii="Times New Roman" w:eastAsia="SimHei" w:hAnsi="Times New Roman" w:cs="Times New Roman"/>
-                <w:sz w:val="24"/>
-              </w:rPr>
-            </w:pPr>
           </w:p>
         </w:tc>
       </w:tr>

</xml_diff>

<commit_message>
Add LIBAD evidence-gated validation lane without replacing RGB inference.
Keep YOLO/ONNX as the primary path, freeze a single test manifest, and treat DA-Core as the authors' baseline rather than a new detector.

Co-authored-by: Cursor <cursoragent@cursor.com>
</commit_message>
<xml_diff>
--- a/Al + Materials Competition Application Form.docx
+++ b/Al + Materials Competition Application Form.docx
@@ -136,7 +136,7 @@
                 <w:sz w:val="28"/>
                 <w:szCs w:val="28"/>
               </w:rPr>
-              <w:t>SecureCoating Vision: A Privacy-Preserving Edge-to-Cloud AI Platform for Inline Battery Electrode Defect Inspection and Traceable Quality Decisions</w:t>
+              <w:t>SecureCoating Vision: A High-Throughput and Zero-Trust Edge-Cloud Pipeline for Inline Battery Electrode Defect Inspection and Traceable Quality Decisions</w:t>
             </w:r>
           </w:p>
         </w:tc>
@@ -550,7 +550,7 @@
           <w:sz w:val="28"/>
           <w:szCs w:val="28"/>
         </w:rPr>
-        <w:t>4</w:t>
+        <w:t>7</w:t>
       </w:r>
       <w:r>
         <w:rPr>
@@ -574,7 +574,7 @@
           <w:sz w:val="28"/>
           <w:szCs w:val="28"/>
         </w:rPr>
-        <w:t>7</w:t>
+        <w:t>8</w:t>
       </w:r>
       <w:r>
         <w:rPr>
@@ -609,14 +609,42 @@
           </w:tcPr>
           <w:p>
             <w:r>
-              <w:t>1、Project Overview（e.g., background, state of the art, project objectives, key competitive advantages, etc.）</w:t>
-              <w:br/>
+              <w:lastRenderedPageBreak/>
+              <w:t>1</w:t>
+            </w:r>
+            <w:r>
+              <w:t>、</w:t>
+            </w:r>
+            <w:r>
+              <w:t>Project Overview</w:t>
+            </w:r>
+            <w:r>
+              <w:t>（</w:t>
+            </w:r>
+            <w:r>
+              <w:t>e.g., background, state of the art, project objectives, key competitive advantages, etc.</w:t>
+            </w:r>
+            <w:r>
+              <w:t>）</w:t>
+            </w:r>
+            <w:r>
+              <w:br/>
+            </w:r>
+            <w:r>
               <w:br/>
               <w:t>Background &amp; State of the Art: Battery electrode coating defects can affect downstream quality, yield, and safety. Public research datasets and computer-vision models make defect segmentation accessible, but a deployable inspection workflow also needs traceability, input validation, explicit failure handling, and reproducible evaluation.</w:t>
-              <w:br/>
-              <w:br/>
-              <w:t>Project Objectives: SecureCoating-Vision is a research prototype for non-destructive coating-defect inspection. It connects RGB segmentation with simulated multimodal registration, physical-coordinate mapping, quality traceability, and industrial protocol adapters. The project objective is to demonstrate a verifiable software workflow and define the evidence required for a future plant pilot.</w:t>
-              <w:br/>
+            </w:r>
+            <w:r>
+              <w:br/>
+            </w:r>
+            <w:r>
+              <w:br/>
+              <w:t>Project Objectives: SecureCoating-Vision is a research prototype for non-destructive coating-defect inspection. It connects RGB segmentation with simulated multimodal registration, physical-coordinate mapping, quality traceability, and industrial protocol adapters. The project objective is to demonstrate a verifiable software workflow and define the evidence required for a future plant pilot. Tagline: Evidence-Gated Multimodal Inspection for Battery Electrode Manufacturing. This is a validation extension, not a change of topic.</w:t>
+            </w:r>
+            <w:r>
+              <w:br/>
+            </w:r>
+            <w:r>
               <w:br/>
               <w:t>Current Competitive Advantage: The implementation emphasizes evidence and failure behavior around a conventional YOLOv8-seg baseline: unsafe or unverified conditions are prevented from becoming automatic release decisions, inspection identities are protected against duplicate processing, and evaluation claims are gated by artifact hashes and split integrity. The repository does not claim factory qualification or production performance.</w:t>
             </w:r>
@@ -630,14 +658,41 @@
           </w:tcPr>
           <w:p>
             <w:r>
-              <w:t>2、Project Plan（e.g., technical approach, main features/functionalities, project deliverables/outputs, etc.）</w:t>
-              <w:br/>
-              <w:br/>
-              <w:t>Technical Approach: The current prototype runs an RGB YOLOv8-seg inference path locally. Thermal and height streams are available as simulated or injected inputs for registration, metrology, and degraded-mode testing; they are not presented as measurements from plant instruments. The API applies readiness and fail-closed checks before issuing a decision. Traceability records are written to SQLite, certificates use canonical HMAC-SHA256 payloads, and OPC UA/Modbus adapters expose explicit command and acknowledgement contracts.</w:t>
-              <w:br/>
+              <w:t>2</w:t>
+            </w:r>
+            <w:r>
+              <w:t>、</w:t>
+            </w:r>
+            <w:r>
+              <w:t>Project Plan</w:t>
+            </w:r>
+            <w:r>
+              <w:t>（</w:t>
+            </w:r>
+            <w:r>
+              <w:t>e.g., technical approach, main features/functionalities, project deliverables/outputs, etc.</w:t>
+            </w:r>
+            <w:r>
+              <w:t>）</w:t>
+            </w:r>
+            <w:r>
+              <w:br/>
+            </w:r>
+            <w:r>
+              <w:br/>
+              <w:t>Technical Approach: The current prototype runs an RGB YOLOv8-seg inference path locally. Thermal and height streams are simulated or injected interface adapters for registration, metrology, and degraded-mode testing; they are not plant-instrument measurements. After that software-and-safety contract, we added a LIBAD validation extension on real aligned visible-light and inline-compatible X-rayL electrode patches. DA-Core remains the LIBAD authors baseline; SecureCoating-Vision adds the evidence-gated PASS/REJECT/HOLD layer. The API applies readiness and fail-closed checks before issuing a decision. Traceability records are written to SQLite, certificates use canonical HMAC-SHA256 payloads, and OPC UA/Modbus adapters expose explicit command and acknowledgement contracts.</w:t>
+            </w:r>
+            <w:r>
+              <w:br/>
+            </w:r>
+            <w:r>
               <w:br/>
               <w:t>Main Features/Functionalities: Defect segmentation for the configured coating classes; calibrated coordinate mapping when an approved calibration artifact is supplied; roll/batch and part identity controls; PASS/REJECT/HOLD state handling; bounded uploads and inference concurrency; API-authoritative read-only dashboard telemetry; and hash-verified evaluation/evidence tooling.</w:t>
-              <w:br/>
+            </w:r>
+            <w:r>
+              <w:br/>
+            </w:r>
+            <w:r>
               <w:br/>
               <w:t>Deliverables/Outputs: A runnable research prototype, automated safety/integrity tests, local simulation smoke checks, configuration and deployment files, technical documentation, and an evaluation tool that refuses to publish results when required evidence or split integrity is missing. Factory integration, independent performance qualification, and safety approval are future pilot deliverables.</w:t>
             </w:r>
@@ -651,17 +706,43 @@
           </w:tcPr>
           <w:p>
             <w:r>
-              <w:t>3、Key Innovations &amp; Unique Features</w:t>
-              <w:br/>
-              <w:br/>
-              <w:t>Evidence-Gated Quality Decisions: The system separates model output from release authority. Missing sensors, invalid calibration, inference faults, traceability faults, stale or unconfirmed industrial communication, and latched interlocks produce HOLD rather than an inferred PASS.</w:t>
-              <w:br/>
+              <w:t>3</w:t>
+            </w:r>
+            <w:r>
+              <w:t>、</w:t>
+            </w:r>
+            <w:r>
+              <w:t>Key Innovations &amp; Unique Features</w:t>
+            </w:r>
+            <w:r>
+              <w:br/>
+            </w:r>
+            <w:r>
+              <w:br/>
+              <w:t xml:space="preserve">Evidence-Gated Quality Decisions: The system separates model output from release authority. Missing sensors, invalid calibration, inference faults, traceability faults, stale or unconfirmed </w:t>
+            </w:r>
+            <w:r>
+              <w:lastRenderedPageBreak/>
+              <w:t>industrial communication, and latched interlocks produce HOLD rather than an inferred PASS.</w:t>
+            </w:r>
+            <w:r>
+              <w:br/>
+            </w:r>
+            <w:r>
               <w:br/>
               <w:t>Traceable Inspection Memory: Each inspection is associated with an active roll and batch, claims a unique (batch_id, part_id), remains PENDING until the final gate outcome is known, and can be represented in a signed certificate snapshot.</w:t>
-              <w:br/>
+            </w:r>
+            <w:r>
+              <w:br/>
+            </w:r>
+            <w:r>
               <w:br/>
               <w:t>Reproducible Evaluation Boundaries: The evaluation engine validates artifact hashes, requires an immutable roll-disjoint manifest, uses one instance-matching policy for box and mask metrics, and records model, dataset, manifest, and source-commit provenance.</w:t>
-              <w:br/>
+            </w:r>
+            <w:r>
+              <w:br/>
+            </w:r>
+            <w:r>
               <w:br/>
               <w:t>Practical Deployment Boundary: The dashboard is read-only and API-authoritative. Industrial I/O is explicitly marked SIMULATED when no PLC is connected. The repository therefore makes the distinction between software readiness and physical qualification visible instead of hiding it behind a headline metric.</w:t>
             </w:r>
@@ -675,14 +756,33 @@
           </w:tcPr>
           <w:p>
             <w:r>
-              <w:t>4、Applications &amp; Market Potential</w:t>
-              <w:br/>
+              <w:lastRenderedPageBreak/>
+              <w:t>4</w:t>
+            </w:r>
+            <w:r>
+              <w:t>、</w:t>
+            </w:r>
+            <w:r>
+              <w:t>Applications &amp; Market Potential</w:t>
+            </w:r>
+            <w:r>
+              <w:br/>
+            </w:r>
+            <w:r>
               <w:br/>
               <w:t>Immediate Application: A future pilot could use the software as an inspection and traceability layer for lithium-ion electrode coating, drying, and coated-foil processes, subject to plant calibration, sensor integration, PLC/HIL testing, and safety approval.</w:t>
-              <w:br/>
+            </w:r>
+            <w:r>
+              <w:br/>
+            </w:r>
+            <w:r>
               <w:br/>
               <w:t>Adjacent Applications: The same evidence-gated workflow may be adapted to other coated materials, separators, fuel-cell components, and high-value continuous-web manufacturing where surface inspection and traceability are important.</w:t>
-              <w:br/>
+            </w:r>
+            <w:r>
+              <w:br/>
+            </w:r>
+            <w:r>
               <w:br/>
               <w:t>Market Potential: The opportunity is to reduce manual review and improve response time to recurring coating defects. The current repository does not quantify scrap reduction, escape rate, payback, or production yield; those values require independent plant measurements and a defined pilot protocol.</w:t>
             </w:r>
@@ -696,14 +796,41 @@
           </w:tcPr>
           <w:p>
             <w:r>
-              <w:t>5、Business Case/Strategy（e.g., go-to-market strategy, business model, market size/opportunity, and operational model, etc.）</w:t>
-              <w:br/>
+              <w:t>5</w:t>
+            </w:r>
+            <w:r>
+              <w:t>、</w:t>
+            </w:r>
+            <w:r>
+              <w:t>Business Case/Strategy</w:t>
+            </w:r>
+            <w:r>
+              <w:t>（</w:t>
+            </w:r>
+            <w:r>
+              <w:t>e.g., go-to-market strategy, business model, market size/opportunity, and operational model, etc.</w:t>
+            </w:r>
+            <w:r>
+              <w:t>）</w:t>
+            </w:r>
+            <w:r>
+              <w:br/>
+            </w:r>
+            <w:r>
               <w:br/>
               <w:t>Go-to-Market Strategy: Begin with a controlled, single-line technical pilot alongside the existing inspection stack. The pilot would first verify data governance, calibration, model performance, PLC command behavior, and operator procedures before any production decision authority is considered.</w:t>
-              <w:br/>
+            </w:r>
+            <w:r>
+              <w:br/>
+            </w:r>
+            <w:r>
               <w:br/>
               <w:t>Business &amp; Operational Model: A potential model is an implementation and integration service followed by site support for calibration management, model monitoring, traceability, and evidence reporting. Pricing, savings, and expansion assumptions should be set only after a plant-specific baseline and independently reviewed pilot results are available.</w:t>
-              <w:br/>
+            </w:r>
+            <w:r>
+              <w:br/>
+            </w:r>
+            <w:r>
               <w:br/>
               <w:t>Risk Boundary: The present submission is a software research prototype. It is not sold as a safety-rated controller, regulatory certificate generator, or proven zero-escape production system.</w:t>
             </w:r>
@@ -717,14 +844,42 @@
           </w:tcPr>
           <w:p>
             <w:r>
-              <w:t>6、Additional Information（e.g., R&amp;D process, lessons learned, etc.）</w:t>
-              <w:br/>
+              <w:t>6</w:t>
+            </w:r>
+            <w:r>
+              <w:t>、</w:t>
+            </w:r>
+            <w:r>
+              <w:t>Additional Information</w:t>
+            </w:r>
+            <w:r>
+              <w:t>（</w:t>
+            </w:r>
+            <w:r>
+              <w:t>e.g., R&amp;D process, lessons learned, etc.</w:t>
+            </w:r>
+            <w:r>
+              <w:t>）</w:t>
+            </w:r>
+            <w:r>
+              <w:br/>
+            </w:r>
+            <w:r>
+              <w:lastRenderedPageBreak/>
               <w:br/>
               <w:t>R&amp;D Process &amp; Execution Discipline: Development uses a staged workflow: establish the safety and evidence contract, implement the smallest verifiable change, run automated regression tests, perform local API/dashboard smoke checks, and record limitations in the implementation ledger. The current repository records 85 passing tests with no skips in the latest documented validation, but local simulation is not hardware evidence.</w:t>
-              <w:br/>
+            </w:r>
+            <w:r>
+              <w:br/>
+            </w:r>
+            <w:r>
               <w:br/>
               <w:t>Lessons Learned: In industrial AI, an accuracy number is only useful when its data split, model artifact, calibration, decision semantics, and failure behavior are auditable. A smaller established model with clear provenance is preferable to a larger model that has not been retrained and independently evaluated. YOLO11 remains a candidate experiment, not a claimed upgrade.</w:t>
-              <w:br/>
+            </w:r>
+            <w:r>
+              <w:br/>
+            </w:r>
+            <w:r>
               <w:br/>
               <w:t>Next Validation Steps: Obtain an independent roll-disjoint dataset, run a controlled YOLOv8n versus YOLO11n/YOLO11s comparison, complete PLC/HIL and safety testing, validate factory calibration, and publish only measurements supported by immutable evidence.</w:t>
             </w:r>
@@ -753,6 +908,7 @@
                 <w:bCs/>
                 <w:sz w:val="24"/>
               </w:rPr>
+              <w:lastRenderedPageBreak/>
               <w:t>7</w:t>
             </w:r>
             <w:r>
@@ -1129,15 +1285,7 @@
                       <w:rFonts w:ascii="Times New Roman" w:hAnsi="Times New Roman" w:cs="Times New Roman"/>
                       <w:szCs w:val="20"/>
                     </w:rPr>
-                    <w:t xml:space="preserve">Founder and CEO, SRII; Visiting Professor, Tsinghua </w:t>
-                  </w:r>
-                  <w:r>
-                    <w:rPr>
-                      <w:rFonts w:ascii="Times New Roman" w:hAnsi="Times New Roman" w:cs="Times New Roman"/>
-                      <w:szCs w:val="20"/>
-                    </w:rPr>
-                    <w:lastRenderedPageBreak/>
-                    <w:t>University</w:t>
+                    <w:t>Founder and CEO, SRII; Visiting Professor, Tsinghua University</w:t>
                   </w:r>
                 </w:p>
               </w:tc>
@@ -2093,6 +2241,7 @@
   <w:style w:type="character" w:default="1" w:styleId="DefaultParagraphFont">
     <w:name w:val="Default Paragraph Font"/>
     <w:uiPriority w:val="1"/>
+    <w:semiHidden/>
     <w:unhideWhenUsed/>
   </w:style>
   <w:style w:type="table" w:default="1" w:styleId="TableNormal">

</xml_diff>

<commit_message>
Harden evidence gates and fail-closed validation
</commit_message>
<xml_diff>
--- a/Al + Materials Competition Application Form.docx
+++ b/Al + Materials Competition Application Form.docx
@@ -680,7 +680,7 @@
             </w:r>
             <w:r>
               <w:br/>
-              <w:t>Technical Approach: The current prototype runs an RGB YOLOv8-seg inference path locally. Thermal and height streams are simulated or injected interface adapters for registration, metrology, and degraded-mode testing; they are not plant-instrument measurements. After that software-and-safety contract, we added a LIBAD validation extension on real aligned visible-light and inline-compatible X-rayL electrode patches. DA-Core remains the LIBAD authors baseline; SecureCoating-Vision adds the evidence-gated PASS/REJECT/HOLD layer. The API applies readiness and fail-closed checks before issuing a decision. Traceability records are written to SQLite, certificates use canonical HMAC-SHA256 payloads, and OPC UA/Modbus adapters expose explicit command and acknowledgement contracts.</w:t>
+              <w:t>Technical Approach: The current prototype runs an RGB YOLOv8-seg inference path locally. Thermal and height streams are simulated or injected interface adapters for registration, metrology, and degraded-mode testing; they are not plant-instrument measurements. After that software-and-safety contract, we added a LIBAD-compatible validation lane for aligned visible-light and X-rayL inputs. The checked-in 90-second demo uses deterministic protocol fixtures; paper-comparable claims require separately verified official dataset/splits and the authors' official implementation. DA-Core remains the LIBAD authors baseline; SecureCoating-Vision adds the evidence-gated PASS/REJECT/HOLD layer. The API applies readiness and fail-closed checks before issuing a decision. Traceability records are written to SQLite, certificates use canonical HMAC-SHA256 payloads, and OPC UA/Modbus adapters expose explicit command and acknowledgement contracts.</w:t>
             </w:r>
             <w:r>
               <w:br/>
@@ -865,9 +865,8 @@
               <w:br/>
             </w:r>
             <w:r>
-              <w:lastRenderedPageBreak/>
-              <w:br/>
-              <w:t>R&amp;D Process &amp; Execution Discipline: Development uses a staged workflow: establish the safety and evidence contract, implement the smallest verifiable change, run automated regression tests, perform local API/dashboard smoke checks, and record limitations in the implementation ledger. The current repository records 85 passing tests with no skips in the latest documented validation, but local simulation is not hardware evidence.</w:t>
+              <w:br/>
+              <w:t>R&amp;D Process &amp; Execution Discipline: Development uses a staged workflow: establish the safety and evidence contract, implement the smallest verifiable change, run automated regression tests, perform local API/dashboard smoke checks, and record limitations in the implementation ledger. The authoritative automated-test snapshot is generated by scripts/record_test_manifest.py and stored in reports/test_manifest.json; this form does not duplicate a mutable test count. Local simulation is not hardware evidence.</w:t>
             </w:r>
             <w:r>
               <w:br/>

</xml_diff>

<commit_message>
Split production operations from sandbox demo controls.
The dashboard now renders a snapshot-only Operate/Diagnose/Traceability console, and operator commands require authenticated confirmation plus a durable audit.

Co-authored-by: Cursor <cursoragent@cursor.com>
</commit_message>
<xml_diff>
--- a/Al + Materials Competition Application Form.docx
+++ b/Al + Materials Competition Application Form.docx
@@ -687,7 +687,7 @@
             </w:r>
             <w:r>
               <w:br/>
-              <w:t>Main Features/Functionalities: Defect segmentation for the configured coating classes; calibrated coordinate mapping when an approved calibration artifact is supplied; roll/batch and part identity controls; PASS/REJECT/HOLD state handling; bounded uploads and inference concurrency; API-authoritative read-only dashboard telemetry; and hash-verified evaluation/evidence tooling.</w:t>
+              <w:t>Main Features/Functionalities: Defect segmentation for the configured coating classes; calibrated coordinate mapping when an approved calibration artifact is supplied; roll/batch and part identity controls; PASS/REJECT/HOLD state handling; bounded uploads and inference concurrency; one-shot operations-snapshot dashboard telemetry (Operate / Diagnose / Traceability); and hash-verified evaluation/evidence tooling.</w:t>
             </w:r>
             <w:r>
               <w:br/>
@@ -744,7 +744,7 @@
             </w:r>
             <w:r>
               <w:br/>
-              <w:t>Practical Deployment Boundary: The dashboard is read-only and API-authoritative. Industrial I/O is explicitly marked SIMULATED when no PLC is connected. The repository therefore makes the distinction between software readiness and physical qualification visible instead of hiding it behind a headline metric.</w:t>
+              <w:t>Practical Deployment Boundary: The production dashboard consumes one API snapshot and does not render simulators. Operator E-stop/reset require authentication, exact confirmation, and a durable audit. Industrial I/O is explicitly marked SIMULATED when no PLC is connected. The repository therefore makes the distinction between software readiness and physical qualification visible instead of hiding it behind a headline metric.</w:t>
             </w:r>
           </w:p>
         </w:tc>

</xml_diff>

<commit_message>
Speed up live evidence loads and align the application form with YOLO26n.
Snapshot artifact checks use one directory listing, dataset views are cached after hash verify, History/Dataset fetch JPEGs in parallel, and the Track 4 form plus official 6-minute deck no longer describe a YOLOv8-seg path.

Co-authored-by: Cursor <cursoragent@cursor.com>
</commit_message>
<xml_diff>
--- a/Al + Materials Competition Application Form.docx
+++ b/Al + Materials Competition Application Form.docx
@@ -609,45 +609,28 @@
           </w:tcPr>
           <w:p>
             <w:r>
-              <w:lastRenderedPageBreak/>
-              <w:t>1</w:t>
-            </w:r>
-            <w:r>
-              <w:t>、</w:t>
-            </w:r>
-            <w:r>
-              <w:t>Project Overview</w:t>
-            </w:r>
-            <w:r>
-              <w:t>（</w:t>
-            </w:r>
-            <w:r>
-              <w:t>e.g., background, state of the art, project objectives, key competitive advantages, etc.</w:t>
-            </w:r>
-            <w:r>
-              <w:t>）</w:t>
-            </w:r>
-            <w:r>
-              <w:br/>
-            </w:r>
-            <w:r>
+              <w:t>1、Project Overview（e.g., background, state of the art, project objectives, key competitive advantages, etc.）</w:t>
+              <w:br/>
               <w:br/>
               <w:t>Background &amp; State of the Art: Battery electrode coating defects can affect downstream quality, yield, and safety. Public research datasets and computer-vision models make defect segmentation accessible, but a deployable inspection workflow also needs traceability, input validation, explicit failure handling, and reproducible evaluation.</w:t>
-            </w:r>
-            <w:r>
-              <w:br/>
-            </w:r>
-            <w:r>
-              <w:br/>
-              <w:t>Project Objectives: SecureCoating-Vision is a research prototype for non-destructive coating-defect inspection. It connects RGB segmentation with simulated multimodal registration, physical-coordinate mapping, quality traceability, and industrial protocol adapters. The project objective is to demonstrate a verifiable software workflow and define the evidence required for a future plant pilot. Tagline: Evidence-Gated Multimodal Inspection for Battery Electrode Manufacturing. This is a validation extension, not a change of topic.</w:t>
-            </w:r>
-            <w:r>
-              <w:br/>
-            </w:r>
-            <w:r>
-              <w:br/>
-              <w:t>Current Competitive Advantage: The implementation emphasizes evidence and failure behavior around a conventional YOLOv8-seg baseline: unsafe or unverified conditions are prevented from becoming automatic release decisions, inspection identities are protected against duplicate processing, and evaluation claims are gated by artifact hashes and split integrity. The repository does not claim factory qualification or production performance.</w:t>
-            </w:r>
+              <w:br/>
+              <w:br/>
+              <w:t>Project Objectives: SecureCoating-Vision is a research prototype for non-destructive coating-defect inspection. It connects RGB detection with simulated multimodal registration, physical-coordinate mapping, quality traceability, and industrial protocol adapters. The project objective is to demonstrate a verifiable software workflow and define the evidence required for a future plant pilot. Tagline: Evidence-Gated Multimodal Inspection for Battery Electrode Manufacturing. This is a validation extension, not a change of topic.</w:t>
+              <w:br/>
+              <w:br/>
+              <w:t>Current Competitive Advantage: The implementation emphasizes evidence and failure behavior around a two-class YOLO26n detector/ONNX baseline: unsafe or unverified conditions are prevented from becoming automatic release decisions, inspection identities are protected against duplicate processing, and evaluation claims are gated by artifact hashes and split integrity. The repository does not claim factory qualification or production performance.</w:t>
+            </w:r>
+            <w:r/>
+            <w:r/>
+            <w:r/>
+            <w:r/>
+            <w:r/>
+            <w:r/>
+            <w:r/>
+            <w:r/>
+            <w:r/>
+            <w:r/>
+            <w:r/>
           </w:p>
         </w:tc>
       </w:tr>
@@ -658,44 +641,28 @@
           </w:tcPr>
           <w:p>
             <w:r>
-              <w:t>2</w:t>
-            </w:r>
-            <w:r>
-              <w:t>、</w:t>
-            </w:r>
-            <w:r>
-              <w:t>Project Plan</w:t>
-            </w:r>
-            <w:r>
-              <w:t>（</w:t>
-            </w:r>
-            <w:r>
-              <w:t>e.g., technical approach, main features/functionalities, project deliverables/outputs, etc.</w:t>
-            </w:r>
-            <w:r>
-              <w:t>）</w:t>
-            </w:r>
-            <w:r>
-              <w:br/>
-            </w:r>
-            <w:r>
-              <w:br/>
-              <w:t>Technical Approach: The current prototype runs an RGB YOLOv8-seg inference path locally. Thermal and height streams are simulated or injected interface adapters for registration, metrology, and degraded-mode testing; they are not plant-instrument measurements. After that software-and-safety contract, we added a LIBAD-compatible validation lane for aligned visible-light and X-rayL inputs. The checked-in 90-second demo uses deterministic protocol fixtures; paper-comparable claims require separately verified official dataset/splits and the authors' official implementation. DA-Core remains the LIBAD authors baseline; SecureCoating-Vision adds the evidence-gated PASS/REJECT/HOLD layer. The API applies readiness and fail-closed checks before issuing a decision. Traceability records are written to SQLite, certificates use canonical HMAC-SHA256 payloads, and OPC UA/Modbus adapters expose explicit command and acknowledgement contracts.</w:t>
-            </w:r>
-            <w:r>
-              <w:br/>
-            </w:r>
-            <w:r>
-              <w:br/>
-              <w:t>Main Features/Functionalities: Defect segmentation for the configured coating classes; calibrated coordinate mapping when an approved calibration artifact is supplied; roll/batch and part identity controls; PASS/REJECT/HOLD state handling; bounded uploads and inference concurrency; one-shot operations-snapshot dashboard telemetry (Operate / Diagnose / Traceability); and hash-verified evaluation/evidence tooling.</w:t>
-            </w:r>
-            <w:r>
-              <w:br/>
-            </w:r>
-            <w:r>
+              <w:t>2、Project Plan（e.g., technical approach, main features/functionalities, project deliverables/outputs, etc.）</w:t>
+              <w:br/>
+              <w:br/>
+              <w:t>Technical Approach: The current prototype runs an RGB two-class YOLO26n detector/ONNX inference path locally. Thermal and height streams are simulated or injected interface adapters for registration, metrology, and degraded-mode testing; they are not plant-instrument measurements. After that software-and-safety contract, we added a LIBAD-compatible validation lane for aligned visible-light and X-rayL inputs. The checked-in 90-second demo uses deterministic protocol fixtures; paper-comparable claims require separately verified official dataset/splits and the authors' official implementation. DA-Core remains the LIBAD authors baseline; SecureCoating-Vision adds the evidence-gated PASS/REJECT/HOLD layer. The API applies readiness and fail-closed checks before issuing a decision. Traceability records are written to SQLite, certificates use canonical HMAC-SHA256 payloads, and OPC UA/Modbus adapters expose explicit command and acknowledgement contracts.</w:t>
+              <w:br/>
+              <w:br/>
+              <w:t>Main Features/Functionalities: Two-class optical detection (surface_crack and delamination_crack) on real CoatingVision JPEGs; published pixel masks are dataset labels, not model output; calibrated coordinate mapping when an approved calibration artifact is supplied; roll/batch and part identity controls; PASS/REJECT/HOLD state handling; bounded uploads and inference concurrency; one-shot operations-snapshot dashboard (Guide / Operate / History / Dataset / Diagnose / Traceability / Multimodal); and hash-verified evaluation/evidence tooling.</w:t>
+              <w:br/>
               <w:br/>
               <w:t>Deliverables/Outputs: A runnable research prototype, automated safety/integrity tests, local simulation smoke checks, configuration and deployment files, technical documentation, and an evaluation tool that refuses to publish results when required evidence or split integrity is missing. Factory integration, independent performance qualification, and safety approval are future pilot deliverables.</w:t>
             </w:r>
+            <w:r/>
+            <w:r/>
+            <w:r/>
+            <w:r/>
+            <w:r/>
+            <w:r/>
+            <w:r/>
+            <w:r/>
+            <w:r/>
+            <w:r/>
+            <w:r/>
           </w:p>
         </w:tc>
       </w:tr>
@@ -844,44 +811,28 @@
           </w:tcPr>
           <w:p>
             <w:r>
-              <w:t>6</w:t>
-            </w:r>
-            <w:r>
-              <w:t>、</w:t>
-            </w:r>
-            <w:r>
-              <w:t>Additional Information</w:t>
-            </w:r>
-            <w:r>
-              <w:t>（</w:t>
-            </w:r>
-            <w:r>
-              <w:t>e.g., R&amp;D process, lessons learned, etc.</w:t>
-            </w:r>
-            <w:r>
-              <w:t>）</w:t>
-            </w:r>
-            <w:r>
-              <w:br/>
-            </w:r>
-            <w:r>
+              <w:t>6、Additional Information（e.g., R&amp;D process, lessons learned, etc.）</w:t>
+              <w:br/>
               <w:br/>
               <w:t>R&amp;D Process &amp; Execution Discipline: Development uses a staged workflow: establish the safety and evidence contract, implement the smallest verifiable change, run automated regression tests, perform local API/dashboard smoke checks, and record limitations in the implementation ledger. The authoritative automated-test snapshot is generated by scripts/record_test_manifest.py and stored in reports/test_manifest.json; this form does not duplicate a mutable test count. Local simulation is not hardware evidence.</w:t>
-            </w:r>
-            <w:r>
-              <w:br/>
-            </w:r>
-            <w:r>
-              <w:br/>
-              <w:t>Lessons Learned: In industrial AI, an accuracy number is only useful when its data split, model artifact, calibration, decision semantics, and failure behavior are auditable. A smaller established model with clear provenance is preferable to a larger model that has not been retrained and independently evaluated. YOLO11 remains a candidate experiment, not a claimed upgrade.</w:t>
-            </w:r>
-            <w:r>
-              <w:br/>
-            </w:r>
-            <w:r>
-              <w:br/>
-              <w:t>Next Validation Steps: Obtain an independent roll-disjoint dataset, run a controlled YOLOv8n versus YOLO11n/YOLO11s comparison, complete PLC/HIL and safety testing, validate factory calibration, and publish only measurements supported by immutable evidence.</w:t>
-            </w:r>
+              <w:br/>
+              <w:br/>
+              <w:t>Lessons Learned: In industrial AI, an accuracy number is only useful when its data split, model artifact, calibration, decision semantics, and failure behavior are auditable. A smaller established model with clear provenance is preferable to a larger model that has not been retrained and independently evaluated. The current RGB detector is hash-pinned YOLO26n/ONNX on an image-disjoint CoatingVision test split; that split is not factory roll-disjoint evidence.</w:t>
+              <w:br/>
+              <w:br/>
+              <w:t>Next Validation Steps: Obtain an independent roll-disjoint dataset, hash-verify official LIBAD, complete PLC/HIL and safety testing, validate factory calibration, and publish only measurements supported by immutable evidence.</w:t>
+            </w:r>
+            <w:r/>
+            <w:r/>
+            <w:r/>
+            <w:r/>
+            <w:r/>
+            <w:r/>
+            <w:r/>
+            <w:r/>
+            <w:r/>
+            <w:r/>
+            <w:r/>
           </w:p>
         </w:tc>
       </w:tr>

</xml_diff>

<commit_message>
Fix regenerator/slide fingerprint drift and pack raw pytest evidence paths.
Co-authored-by: Cursor <cursoragent@cursor.com>
</commit_message>
<xml_diff>
--- a/Al + Materials Competition Application Form.docx
+++ b/Al + Materials Competition Application Form.docx
@@ -54,14 +54,6 @@
         </w:rPr>
       </w:pPr>
     </w:p>
-    <w:p>
-      <w:pPr>
-        <w:rPr>
-          <w:rFonts w:ascii="Times New Roman" w:eastAsia="STXingkai" w:hAnsi="Times New Roman" w:cs="Times New Roman"/>
-          <w:sz w:val="40"/>
-        </w:rPr>
-      </w:pPr>
-    </w:p>
     <w:tbl>
       <w:tblPr>
         <w:tblStyle w:val="TableGrid"/>
@@ -445,24 +437,6 @@
         </w:tc>
       </w:tr>
     </w:tbl>
-    <w:p>
-      <w:pPr>
-        <w:jc w:val="left"/>
-        <w:rPr>
-          <w:rFonts w:ascii="Times New Roman" w:eastAsia="STXingkai" w:hAnsi="Times New Roman" w:cs="Times New Roman"/>
-          <w:sz w:val="40"/>
-        </w:rPr>
-      </w:pPr>
-    </w:p>
-    <w:p>
-      <w:pPr>
-        <w:jc w:val="left"/>
-        <w:rPr>
-          <w:rFonts w:ascii="Times New Roman" w:eastAsia="STXingkai" w:hAnsi="Times New Roman" w:cs="Times New Roman"/>
-          <w:sz w:val="40"/>
-        </w:rPr>
-      </w:pPr>
-    </w:p>
     <w:p>
       <w:pPr>
         <w:jc w:val="left"/>
@@ -521,12 +495,6 @@
           <w:sz w:val="28"/>
           <w:szCs w:val="28"/>
         </w:rPr>
-        <w:sectPr>
-          <w:pgSz w:w="11906" w:h="16838"/>
-          <w:pgMar w:top="1440" w:right="1800" w:bottom="1440" w:left="1800" w:header="851" w:footer="992" w:gutter="0"/>
-          <w:cols w:space="425"/>
-          <w:docGrid w:type="lines" w:linePitch="312"/>
-        </w:sectPr>
       </w:pPr>
       <w:r>
         <w:rPr>
@@ -1475,14 +1443,6 @@
           </w:p>
         </w:tc>
       </w:tr>
-      <w:tr>
-        <w:tc>
-          <w:tcPr>
-            <w:tcW w:w="8296" w:type="dxa"/>
-          </w:tcPr>
-          <w:p/>
-        </w:tc>
-      </w:tr>
     </w:tbl>
     <w:p>
       <w:pPr>
@@ -1503,6 +1463,7 @@
       </w:pPr>
     </w:p>
     <w:sectPr>
+      <w:type w:val="continuous"/>
       <w:pgSz w:w="11906" w:h="16838"/>
       <w:pgMar w:top="1440" w:right="1800" w:bottom="1440" w:left="1800" w:header="851" w:footer="992" w:gutter="0"/>
       <w:cols w:space="425"/>

</xml_diff>

<commit_message>
Canonicalize manifest CRLF and clear final-defense claim/layout traps.
Keep byte-stable CoatingVision hashes on Linux, stop Slide 8 media from covering the close line, and separate roll-disjoint qualification from image-disjoint RGB evidence.

Co-authored-by: Cursor <cursoragent@cursor.com>
</commit_message>
<xml_diff>
--- a/Al + Materials Competition Application Form.docx
+++ b/Al + Materials Competition Application Form.docx
@@ -45,14 +45,6 @@
         </w:rPr>
         <w:t>Application Form</w:t>
       </w:r>
-    </w:p>
-    <w:p>
-      <w:pPr>
-        <w:rPr>
-          <w:rFonts w:ascii="Times New Roman" w:eastAsia="STXingkai" w:hAnsi="Times New Roman" w:cs="Times New Roman"/>
-          <w:sz w:val="40"/>
-        </w:rPr>
-      </w:pPr>
     </w:p>
     <w:tbl>
       <w:tblPr>
@@ -641,43 +633,17 @@
           </w:tcPr>
           <w:p>
             <w:r>
-              <w:t>3</w:t>
-            </w:r>
-            <w:r>
-              <w:t>、</w:t>
-            </w:r>
-            <w:r>
-              <w:t>Key Innovations &amp; Unique Features</w:t>
-            </w:r>
-            <w:r>
-              <w:br/>
-            </w:r>
-            <w:r>
-              <w:br/>
-              <w:t xml:space="preserve">Evidence-Gated Quality Decisions: The system separates model output from release authority. Missing sensors, invalid calibration, inference faults, traceability faults, stale or unconfirmed </w:t>
-            </w:r>
-            <w:r>
-              <w:lastRenderedPageBreak/>
-              <w:t>industrial communication, and latched interlocks produce HOLD rather than an inferred PASS.</w:t>
-            </w:r>
-            <w:r>
-              <w:br/>
-            </w:r>
-            <w:r>
+              <w:t>3、Key Innovations &amp; Unique Features</w:t>
+              <w:br/>
+              <w:br/>
+              <w:t>Evidence-Gated Quality Decisions: The system separates model output from release authority. Missing sensors, invalid calibration, inference faults, traceability faults, stale or unconfirmed industrial communication, and latched interlocks produce HOLD rather than an inferred PASS.</w:t>
+              <w:br/>
               <w:br/>
               <w:t>Traceable Inspection Memory: Each inspection is associated with an active roll and batch, claims a unique (batch_id, part_id), remains PENDING until the final gate outcome is known, and can be represented in a signed certificate snapshot.</w:t>
-            </w:r>
-            <w:r>
-              <w:br/>
-            </w:r>
-            <w:r>
-              <w:br/>
-              <w:t>Reproducible Evaluation Boundaries: The evaluation engine validates artifact hashes, requires an immutable roll-disjoint manifest, uses one instance-matching policy for box and mask metrics, and records model, dataset, manifest, and source-commit provenance.</w:t>
-            </w:r>
-            <w:r>
-              <w:br/>
-            </w:r>
-            <w:r>
+              <w:br/>
+              <w:br/>
+              <w:t>Reproducible Evaluation Boundaries: The evaluation engine validates immutable dataset manifests, records split provenance, and enforces consistent metric semantics. Independent roll-disjoint evidence remains a required gate for factory qualification.</w:t>
+              <w:br/>
               <w:br/>
               <w:t>Practical Deployment Boundary: The production dashboard consumes one API snapshot and does not render simulators. Operator E-stop/reset require authentication, exact confirmation, and a durable audit. Industrial I/O is explicitly marked SIMULATED when no PLC is connected. The repository therefore makes the distinction between software readiness and physical qualification visible instead of hiding it behind a headline metric.</w:t>
             </w:r>
@@ -820,42 +786,8 @@
               </w:rPr>
             </w:pPr>
             <w:r>
-              <w:rPr>
-                <w:rFonts w:ascii="Times New Roman" w:eastAsia="SimHei" w:hAnsi="Times New Roman" w:cs="Times New Roman"/>
-                <w:b/>
-                <w:bCs/>
-                <w:sz w:val="24"/>
-              </w:rPr>
-              <w:lastRenderedPageBreak/>
-              <w:t>7</w:t>
-            </w:r>
-            <w:r>
-              <w:rPr>
-                <w:rFonts w:ascii="Times New Roman" w:eastAsia="SimHei" w:hAnsi="Times New Roman" w:cs="Times New Roman"/>
-                <w:b/>
-                <w:bCs/>
-                <w:sz w:val="24"/>
-              </w:rPr>
-              <w:t>、</w:t>
-            </w:r>
-            <w:r>
-              <w:rPr>
-                <w:rFonts w:ascii="Times New Roman" w:eastAsia="SimHei" w:hAnsi="Times New Roman" w:cs="Times New Roman"/>
-                <w:b/>
-                <w:bCs/>
-                <w:sz w:val="24"/>
-              </w:rPr>
-              <w:t>Team Member Information</w:t>
-            </w:r>
-          </w:p>
-          <w:p>
-            <w:pPr>
-              <w:jc w:val="left"/>
-              <w:rPr>
-                <w:rFonts w:ascii="Times New Roman" w:hAnsi="Times New Roman" w:cs="Times New Roman"/>
-                <w:sz w:val="24"/>
-              </w:rPr>
-            </w:pPr>
+              <w:t>7、Team Member Information</w:t>
+            </w:r>
           </w:p>
           <w:tbl>
             <w:tblPr>
@@ -1423,45 +1355,30 @@
               </w:tc>
             </w:tr>
           </w:tbl>
+          <w:p/>
           <w:p>
-            <w:pPr>
-              <w:jc w:val="left"/>
-              <w:rPr>
-                <w:rFonts w:ascii="Times New Roman" w:hAnsi="Times New Roman" w:cs="Times New Roman"/>
-                <w:sz w:val="24"/>
-              </w:rPr>
-            </w:pPr>
+            <w:r>
+              <w:t>Team Leader: Trịnh Hoàng Tú</w:t>
+            </w:r>
           </w:p>
           <w:p>
-            <w:pPr>
-              <w:jc w:val="left"/>
-              <w:rPr>
-                <w:rFonts w:ascii="Times New Roman" w:hAnsi="Times New Roman" w:cs="Times New Roman"/>
-                <w:sz w:val="24"/>
-              </w:rPr>
-            </w:pPr>
+            <w:r>
+              <w:t>Team Members: N/A (individual submission)</w:t>
+            </w:r>
+          </w:p>
+          <w:p>
+            <w:r>
+              <w:t>Affiliation: Ho Chi Minh City University of Foreign Languages – Information Technology (HUFLIT)</w:t>
+            </w:r>
+          </w:p>
+          <w:p>
+            <w:r>
+              <w:t>Role: Sole author of the SecureCoating-Vision research prototype, evidence pipeline, and Track 4 final-defense materials.</w:t>
+            </w:r>
           </w:p>
         </w:tc>
       </w:tr>
     </w:tbl>
-    <w:p>
-      <w:pPr>
-        <w:jc w:val="left"/>
-        <w:rPr>
-          <w:rFonts w:asciiTheme="minorEastAsia" w:hAnsiTheme="minorEastAsia"/>
-          <w:sz w:val="24"/>
-        </w:rPr>
-      </w:pPr>
-    </w:p>
-    <w:p>
-      <w:pPr>
-        <w:jc w:val="left"/>
-        <w:rPr>
-          <w:rFonts w:asciiTheme="minorEastAsia" w:hAnsiTheme="minorEastAsia"/>
-          <w:sz w:val="24"/>
-        </w:rPr>
-      </w:pPr>
-    </w:p>
     <w:sectPr>
       <w:type w:val="continuous"/>
       <w:pgSz w:w="11906" w:h="16838"/>

</xml_diff>

<commit_message>
Clarify Team 71 branding and ship an intentional competition ZIP.
Drop organizer-lab product logo, keep advisor subordinate on Slide 1/README/DOCX, add industrialization_path, and exclude failed DINOv3/stale gallery dumps from the release archive.

Co-authored-by: Cursor <cursoragent@cursor.com>
</commit_message>
<xml_diff>
--- a/Al + Materials Competition Application Form.docx
+++ b/Al + Materials Competition Application Form.docx
@@ -1373,7 +1373,12 @@
           </w:p>
           <w:p>
             <w:r>
-              <w:t>Role: Sole author of the SecureCoating-Vision research prototype, evidence pipeline, and Track 4 final-defense materials.</w:t>
+              <w:t>Advisor: Prof. Kris Singh · Visiting Professor, Tsinghua University · Founder &amp; CEO, SRII</w:t>
+            </w:r>
+          </w:p>
+          <w:p>
+            <w:r>
+              <w:t>Role: Sole author of the SecureCoating-Vision research prototype, evidence pipeline, and Track 4 final-defense materials. Advisor provides academic guidance only and is not a co-author of the detector metrics.</w:t>
             </w:r>
           </w:p>
         </w:tc>

</xml_diff>

<commit_message>
Align final form, proposal identity, and Track 4 speed evidence.
Place advisor only in Application Form Section 6, add Inspection_System_Proposal, replace internal TODO status with Final Submission Status, and surface CPU inference ms on Slide 7 without claiming line throughput.

Co-authored-by: Cursor <cursoragent@cursor.com>
</commit_message>
<xml_diff>
--- a/Al + Materials Competition Application Form.docx
+++ b/Al + Materials Competition Application Form.docx
@@ -746,27 +746,31 @@
           <w:p>
             <w:r>
               <w:t>6、Additional Information（e.g., R&amp;D process, lessons learned, etc.）</w:t>
-              <w:br/>
-              <w:br/>
+            </w:r>
+          </w:p>
+          <w:p/>
+          <w:p>
+            <w:r>
               <w:t>R&amp;D Process &amp; Execution Discipline: Development uses a staged workflow: establish the safety and evidence contract, implement the smallest verifiable change, run automated regression tests, perform local API/dashboard smoke checks, and record limitations in the implementation ledger. The authoritative automated-test snapshot is generated by scripts/record_test_manifest.py and stored in reports/test_manifest.json; this form does not duplicate a mutable test count. Local simulation is not hardware evidence.</w:t>
-              <w:br/>
-              <w:br/>
+            </w:r>
+          </w:p>
+          <w:p/>
+          <w:p>
+            <w:r>
               <w:t>Lessons Learned: In industrial AI, an accuracy number is only useful when its data split, model artifact, calibration, decision semantics, and failure behavior are auditable. A smaller established model with clear provenance is preferable to a larger model that has not been retrained and independently evaluated. The current RGB detector is hash-pinned YOLO26n/ONNX on an image-disjoint CoatingVision test split; that split is not factory roll-disjoint evidence.</w:t>
-              <w:br/>
-              <w:br/>
+            </w:r>
+          </w:p>
+          <w:p/>
+          <w:p>
+            <w:r>
               <w:t>Next Validation Steps: Obtain an independent roll-disjoint dataset, hash-verify official LIBAD, complete PLC/HIL and safety testing, validate factory calibration, and publish only measurements supported by immutable evidence.</w:t>
             </w:r>
-            <w:r/>
-            <w:r/>
-            <w:r/>
-            <w:r/>
-            <w:r/>
-            <w:r/>
-            <w:r/>
-            <w:r/>
-            <w:r/>
-            <w:r/>
-            <w:r/>
+          </w:p>
+          <w:p/>
+          <w:p>
+            <w:r>
+              <w:t>Advisor / 指导老师: Prof. Kris Singh — Visiting Professor, Tsinghua University; Founder &amp; CEO, SRII. Advisory scope: innovation, industrialization, and final-defense guidance.</w:t>
+            </w:r>
           </w:p>
         </w:tc>
       </w:tr>
@@ -1358,27 +1362,12 @@
           <w:p/>
           <w:p>
             <w:r>
-              <w:t>Team Leader: Trịnh Hoàng Tú</w:t>
+              <w:t>Team Leader — Trịnh Hoàng Tú</w:t>
             </w:r>
           </w:p>
           <w:p>
             <w:r>
-              <w:t>Team Members: N/A (individual submission)</w:t>
-            </w:r>
-          </w:p>
-          <w:p>
-            <w:r>
-              <w:t>Affiliation: Ho Chi Minh City University of Foreign Languages – Information Technology (HUFLIT)</w:t>
-            </w:r>
-          </w:p>
-          <w:p>
-            <w:r>
-              <w:t>Advisor: Prof. Kris Singh · Visiting Professor, Tsinghua University · Founder &amp; CEO, SRII</w:t>
-            </w:r>
-          </w:p>
-          <w:p>
-            <w:r>
-              <w:t>Role: Sole author of the SecureCoating-Vision research prototype, evidence pipeline, and Track 4 final-defense materials. Advisor provides academic guidance only and is not a co-author of the detector metrics.</w:t>
+              <w:t>Team Member — N/A</w:t>
             </w:r>
           </w:p>
         </w:tc>

</xml_diff>

<commit_message>
Tighten claim wording for tests, RGB/LIBAD boundaries, and HMAC tags.
Restore Application Form section placement, drop stale LIBAD hash-verify next-steps, and keep Challenge 1 performance prediction as an explicit non-claim roadmap boundary.

Co-authored-by: Cursor <cursoragent@cursor.com>
</commit_message>
<xml_diff>
--- a/Al + Materials Competition Application Form.docx
+++ b/Al + Materials Competition Application Form.docx
@@ -602,27 +602,25 @@
           <w:p>
             <w:r>
               <w:t>2、Project Plan（e.g., technical approach, main features/functionalities, project deliverables/outputs, etc.）</w:t>
-              <w:br/>
-              <w:br/>
-              <w:t>Technical Approach: The current prototype runs an RGB two-class YOLO26n detector/ONNX inference path locally. Thermal and height streams are simulated or injected interface adapters for registration, metrology, and degraded-mode testing; they are not plant-instrument measurements. After that software-and-safety contract, we added a LIBAD-compatible validation lane for aligned visible-light and X-rayL inputs. The checked-in 90-second demo uses deterministic protocol fixtures; paper-comparable claims require separately verified official dataset/splits and the authors' official implementation. DA-Core remains the LIBAD authors baseline; SecureCoating-Vision adds the evidence-gated PASS/REJECT/HOLD layer. The API applies readiness and fail-closed checks before issuing a decision. Traceability records are written to SQLite, certificates use canonical HMAC-SHA256 payloads, and OPC UA/Modbus adapters expose explicit command and acknowledgement contracts.</w:t>
-              <w:br/>
-              <w:br/>
+            </w:r>
+          </w:p>
+          <w:p/>
+          <w:p>
+            <w:r>
+              <w:t>Technical Approach: The current prototype runs an RGB two-class YOLO26n detector/ONNX inference path locally. Thermal and height streams are simulated or injected interface adapters for registration, metrology, and degraded-mode testing; they are not plant-instrument measurements. After that software-and-safety contract, we added a LIBAD-compatible validation lane for aligned visible-light and X-rayL inputs. The checked-in 90-second demo uses deterministic protocol fixtures; paper-comparable claims require separately verified official dataset/splits and the authors' official implementation. DA-Core remains the LIBAD authors baseline; SecureCoating-Vision adds the evidence-gated PASS/REJECT/HOLD layer. The API applies readiness and fail-closed checks before issuing a decision. Traceability records are written to SQLite, certificates use HMAC-SHA256 authenticated traceability tags, and OPC UA/Modbus adapters expose explicit command and acknowledgement contracts.</w:t>
+            </w:r>
+          </w:p>
+          <w:p/>
+          <w:p>
+            <w:r>
               <w:t>Main Features/Functionalities: Two-class optical detection (surface_crack and delamination_crack) on real CoatingVision JPEGs; published pixel masks are dataset labels, not model output; calibrated coordinate mapping when an approved calibration artifact is supplied; roll/batch and part identity controls; PASS/REJECT/HOLD state handling; bounded uploads and inference concurrency; one-shot operations-snapshot dashboard (Guide / Operate / History / Dataset / Diagnose / Traceability / Multimodal); and hash-verified evaluation/evidence tooling.</w:t>
-              <w:br/>
-              <w:br/>
+            </w:r>
+          </w:p>
+          <w:p/>
+          <w:p>
+            <w:r>
               <w:t>Deliverables/Outputs: A runnable research prototype, automated safety/integrity tests, local simulation smoke checks, configuration and deployment files, technical documentation, and an evaluation tool that refuses to publish results when required evidence or split integrity is missing. Factory integration, independent performance qualification, and safety approval are future pilot deliverables.</w:t>
             </w:r>
-            <w:r/>
-            <w:r/>
-            <w:r/>
-            <w:r/>
-            <w:r/>
-            <w:r/>
-            <w:r/>
-            <w:r/>
-            <w:r/>
-            <w:r/>
-            <w:r/>
           </w:p>
         </w:tc>
       </w:tr>
@@ -634,17 +632,29 @@
           <w:p>
             <w:r>
               <w:t>3、Key Innovations &amp; Unique Features</w:t>
-              <w:br/>
-              <w:br/>
+            </w:r>
+          </w:p>
+          <w:p/>
+          <w:p>
+            <w:r>
               <w:t>Evidence-Gated Quality Decisions: The system separates model output from release authority. Missing sensors, invalid calibration, inference faults, traceability faults, stale or unconfirmed industrial communication, and latched interlocks produce HOLD rather than an inferred PASS.</w:t>
-              <w:br/>
-              <w:br/>
-              <w:t>Traceable Inspection Memory: Each inspection is associated with an active roll and batch, claims a unique (batch_id, part_id), remains PENDING until the final gate outcome is known, and can be represented in a signed certificate snapshot.</w:t>
-              <w:br/>
-              <w:br/>
+            </w:r>
+          </w:p>
+          <w:p/>
+          <w:p>
+            <w:r>
+              <w:t>Traceable Inspection Memory: Each inspection is associated with an active roll and batch, claims a unique (batch_id, part_id), remains PENDING until the final gate outcome is known, and can be represented in an HMAC-SHA256 authenticated certificate snapshot.</w:t>
+            </w:r>
+          </w:p>
+          <w:p/>
+          <w:p>
+            <w:r>
               <w:t>Reproducible Evaluation Boundaries: The evaluation engine validates immutable dataset manifests, records split provenance, and enforces consistent metric semantics. Independent roll-disjoint evidence remains a required gate for factory qualification.</w:t>
-              <w:br/>
-              <w:br/>
+            </w:r>
+          </w:p>
+          <w:p/>
+          <w:p>
+            <w:r>
               <w:t>Practical Deployment Boundary: The production dashboard consumes one API snapshot and does not render simulators. Operator E-stop/reset require authentication, exact confirmation, and a durable audit. Industrial I/O is explicitly marked SIMULATED when no PLC is connected. The repository therefore makes the distinction between software readiness and physical qualification visible instead of hiding it behind a headline metric.</w:t>
             </w:r>
           </w:p>
@@ -763,7 +773,7 @@
           <w:p/>
           <w:p>
             <w:r>
-              <w:t>Next Validation Steps: Obtain an independent roll-disjoint dataset, hash-verify official LIBAD, complete PLC/HIL and safety testing, validate factory calibration, and publish only measurements supported by immutable evidence.</w:t>
+              <w:t>Next Validation Steps: Reproduce the official-LIBAD validation under the current clean release and preserve current-source provenance; obtain an independent roll-disjoint factory dataset; complete PLC/HIL and plant calibration; and keep any future performance-risk proxy explicitly simulation-validated and separate from electrochemical cell-performance claims.</w:t>
             </w:r>
           </w:p>
           <w:p/>

</xml_diff>

<commit_message>
Sync competition title to organizer-approved Evidence-Gated Multimodal AI Work Title.
Align identity config, docs, Application Form wording, defense deck, LIBAD demos, and tests so release artifacts share one canonical title without changing metrics or scope.

Co-authored-by: Cursor <cursoragent@cursor.com>
</commit_message>
<xml_diff>
--- a/Al + Materials Competition Application Form.docx
+++ b/Al + Materials Competition Application Form.docx
@@ -115,12 +115,7 @@
               </w:rPr>
             </w:pPr>
             <w:r>
-              <w:rPr>
-                <w:rFonts w:ascii="Times New Roman" w:eastAsia="KaiTi" w:hAnsi="Times New Roman" w:cs="Times New Roman"/>
-                <w:sz w:val="28"/>
-                <w:szCs w:val="28"/>
-              </w:rPr>
-              <w:t>SecureCoating Vision: A High-Throughput and Zero-Trust Edge-Cloud Pipeline for Inline Battery Electrode Defect Inspection and Traceable Quality Decisions</w:t>
+              <w:t>SecureCoating-Vision: Evidence-Gated Multimodal AI for Battery Electrode Inspection and Traceable Quality Decisions</w:t>
             </w:r>
           </w:p>
         </w:tc>
@@ -570,27 +565,25 @@
           <w:p>
             <w:r>
               <w:t>1、Project Overview（e.g., background, state of the art, project objectives, key competitive advantages, etc.）</w:t>
-              <w:br/>
-              <w:br/>
+            </w:r>
+          </w:p>
+          <w:p/>
+          <w:p>
+            <w:r>
               <w:t>Background &amp; State of the Art: Battery electrode coating defects can affect downstream quality, yield, and safety. Public research datasets and computer-vision models make defect segmentation accessible, but a deployable inspection workflow also needs traceability, input validation, explicit failure handling, and reproducible evaluation.</w:t>
-              <w:br/>
-              <w:br/>
-              <w:t>Project Objectives: SecureCoating-Vision is a research prototype for non-destructive coating-defect inspection. It connects RGB detection with simulated multimodal registration, physical-coordinate mapping, quality traceability, and industrial protocol adapters. The project objective is to demonstrate a verifiable software workflow and define the evidence required for a future plant pilot. Tagline: Evidence-Gated Multimodal Inspection for Battery Electrode Manufacturing. This is a validation extension, not a change of topic.</w:t>
-              <w:br/>
-              <w:br/>
+            </w:r>
+          </w:p>
+          <w:p/>
+          <w:p>
+            <w:r>
+              <w:t>Project Objectives: SecureCoating-Vision is a research prototype for non-destructive coating-defect inspection. It connects RGB detection with simulated multimodal registration, physical-coordinate mapping, quality traceability, and industrial protocol adapters. The project objective is to demonstrate a verifiable software workflow and define the evidence required for a future plant pilot. Tagline: Evidence-Gated Multimodal Inspection for Battery Electrode Manufacturing. The LIBAD lane extends validation of the same battery-electrode inspection and quality-decision problem.</w:t>
+            </w:r>
+          </w:p>
+          <w:p/>
+          <w:p>
+            <w:r>
               <w:t>Current Competitive Advantage: The implementation emphasizes evidence and failure behavior around a two-class YOLO26n detector/ONNX baseline: unsafe or unverified conditions are prevented from becoming automatic release decisions, inspection identities are protected against duplicate processing, and evaluation claims are gated by artifact hashes and split integrity. The repository does not claim factory qualification or production performance.</w:t>
             </w:r>
-            <w:r/>
-            <w:r/>
-            <w:r/>
-            <w:r/>
-            <w:r/>
-            <w:r/>
-            <w:r/>
-            <w:r/>
-            <w:r/>
-            <w:r/>
-            <w:r/>
           </w:p>
         </w:tc>
       </w:tr>
@@ -773,7 +766,7 @@
           <w:p/>
           <w:p>
             <w:r>
-              <w:t>Next Validation Steps: Reproduce the official-LIBAD validation under the current clean release and preserve current-source provenance; obtain an independent roll-disjoint factory dataset; complete PLC/HIL and plant calibration; and keep any future performance-risk proxy explicitly simulation-validated and separate from electrochemical cell-performance claims.</w:t>
+              <w:t>Next Validation Steps: Obtain an independent roll-disjoint factory dataset; complete PLC/HIL, plant calibration, and safety testing; pursue authors' DINOv3/DA-Core validation only if paper-comparable LIBAD benchmarking is required; and treat downstream material/electrochemical performance prediction as future validation, not a current defense claim.</w:t>
             </w:r>
           </w:p>
           <w:p/>

</xml_diff>

<commit_message>
Finalize release audit: Application Form roster/date, analysis report, and provenance clarity.
Keep metrics unchanged while separating contestants from advisor, clarifying LIBAD historical evidence, and distinguishing RGB detector inputs from auxiliary adapters.

Co-authored-by: Cursor <cursoragent@cursor.com>
</commit_message>
<xml_diff>
--- a/Al + Materials Competition Application Form.docx
+++ b/Al + Materials Competition Application Form.docx
@@ -489,7 +489,7 @@
           <w:sz w:val="28"/>
           <w:szCs w:val="28"/>
         </w:rPr>
-        <w:t>Date:</w:t>
+        <w:t>Date: 07 / 09 / 2026</w:t>
       </w:r>
       <w:r>
         <w:rPr>
@@ -497,7 +497,6 @@
           <w:sz w:val="28"/>
           <w:szCs w:val="28"/>
         </w:rPr>
-        <w:t xml:space="preserve"> 2</w:t>
       </w:r>
       <w:r>
         <w:rPr>
@@ -505,7 +504,6 @@
           <w:sz w:val="28"/>
           <w:szCs w:val="28"/>
         </w:rPr>
-        <w:t>7</w:t>
       </w:r>
       <w:r>
         <w:rPr>
@@ -513,7 +511,6 @@
           <w:sz w:val="28"/>
           <w:szCs w:val="28"/>
         </w:rPr>
-        <w:t xml:space="preserve"> / </w:t>
       </w:r>
       <w:r>
         <w:rPr>
@@ -521,7 +518,6 @@
           <w:sz w:val="28"/>
           <w:szCs w:val="28"/>
         </w:rPr>
-        <w:t>0</w:t>
       </w:r>
       <w:r>
         <w:rPr>
@@ -529,7 +525,6 @@
           <w:sz w:val="28"/>
           <w:szCs w:val="28"/>
         </w:rPr>
-        <w:t>8</w:t>
       </w:r>
       <w:r>
         <w:rPr>
@@ -537,7 +532,6 @@
           <w:sz w:val="28"/>
           <w:szCs w:val="28"/>
         </w:rPr>
-        <w:t xml:space="preserve"> / </w:t>
       </w:r>
       <w:r>
         <w:rPr>
@@ -545,7 +539,6 @@
           <w:sz w:val="28"/>
           <w:szCs w:val="28"/>
         </w:rPr>
-        <w:t>2026</w:t>
       </w:r>
     </w:p>
     <w:tbl>
@@ -950,39 +943,24 @@
                     </w:rPr>
                   </w:pPr>
                   <w:r>
-                    <w:rPr>
-                      <w:rFonts w:ascii="Times New Roman" w:hAnsi="Times New Roman" w:cs="Times New Roman"/>
-                      <w:szCs w:val="20"/>
-                    </w:rPr>
-                    <w:t>Team Lead</w:t>
+                    <w:t>Team Leader</w:t>
                   </w:r>
+                </w:p>
+              </w:tc>
+              <w:tc>
+                <w:tcPr>
+                  <w:tcW w:w="1577" w:type="dxa"/>
+                  <w:vAlign w:val="center"/>
+                </w:tcPr>
+                <w:p>
+                  <w:pPr>
+                    <w:jc w:val="center"/>
+                    <w:rPr>
+                      <w:rFonts w:ascii="Times New Roman" w:hAnsi="Times New Roman" w:cs="Times New Roman"/>
+                      <w:szCs w:val="20"/>
+                    </w:rPr>
+                  </w:pPr>
                   <w:r>
-                    <w:rPr>
-                      <w:rFonts w:ascii="Times New Roman" w:hAnsi="Times New Roman" w:cs="Times New Roman" w:hint="eastAsia"/>
-                      <w:szCs w:val="20"/>
-                    </w:rPr>
-                    <w:t>er</w:t>
-                  </w:r>
-                </w:p>
-              </w:tc>
-              <w:tc>
-                <w:tcPr>
-                  <w:tcW w:w="1577" w:type="dxa"/>
-                  <w:vAlign w:val="center"/>
-                </w:tcPr>
-                <w:p>
-                  <w:pPr>
-                    <w:jc w:val="center"/>
-                    <w:rPr>
-                      <w:rFonts w:ascii="Times New Roman" w:hAnsi="Times New Roman" w:cs="Times New Roman"/>
-                      <w:szCs w:val="20"/>
-                    </w:rPr>
-                  </w:pPr>
-                  <w:r>
-                    <w:rPr>
-                      <w:rFonts w:ascii="Times New Roman" w:hAnsi="Times New Roman" w:cs="Times New Roman"/>
-                      <w:szCs w:val="20"/>
-                    </w:rPr>
                     <w:t>Trịnh Hoàng Tú</w:t>
                   </w:r>
                 </w:p>
@@ -1001,10 +979,6 @@
                     </w:rPr>
                   </w:pPr>
                   <w:r>
-                    <w:rPr>
-                      <w:rFonts w:ascii="Times New Roman" w:hAnsi="Times New Roman" w:cs="Times New Roman"/>
-                      <w:szCs w:val="20"/>
-                    </w:rPr>
                     <w:t>HUFLIT</w:t>
                   </w:r>
                 </w:p>
@@ -1023,10 +997,6 @@
                     </w:rPr>
                   </w:pPr>
                   <w:r>
-                    <w:rPr>
-                      <w:rFonts w:ascii="Times New Roman" w:hAnsi="Times New Roman" w:cs="Times New Roman"/>
-                      <w:szCs w:val="20"/>
-                    </w:rPr>
                     <w:t>+84 983967098</w:t>
                   </w:r>
                 </w:p>
@@ -1045,10 +1015,6 @@
                     </w:rPr>
                   </w:pPr>
                   <w:r>
-                    <w:rPr>
-                      <w:rFonts w:ascii="Times New Roman" w:hAnsi="Times New Roman" w:cs="Times New Roman"/>
-                      <w:szCs w:val="20"/>
-                    </w:rPr>
                     <w:t>tht.csec2005@gmail.com</w:t>
                   </w:r>
                 </w:p>
@@ -1073,10 +1039,6 @@
                     </w:rPr>
                   </w:pPr>
                   <w:r>
-                    <w:rPr>
-                      <w:rFonts w:ascii="Times New Roman" w:hAnsi="Times New Roman" w:cs="Times New Roman"/>
-                      <w:szCs w:val="20"/>
-                    </w:rPr>
                     <w:t>Team Member</w:t>
                   </w:r>
                 </w:p>
@@ -1094,34 +1056,7 @@
                       <w:szCs w:val="20"/>
                     </w:rPr>
                   </w:pPr>
-                  <w:r>
-                    <w:rPr>
-                      <w:rFonts w:ascii="Times New Roman" w:hAnsi="Times New Roman" w:cs="Times New Roman"/>
-                      <w:szCs w:val="20"/>
-                    </w:rPr>
-                    <w:t>(</w:t>
-                  </w:r>
-                  <w:r>
-                    <w:rPr>
-                      <w:rFonts w:ascii="Times New Roman" w:hAnsi="Times New Roman" w:cs="Times New Roman"/>
-                      <w:szCs w:val="20"/>
-                    </w:rPr>
-                    <w:t>External Advisor</w:t>
-                  </w:r>
-                  <w:r>
-                    <w:rPr>
-                      <w:rFonts w:ascii="Times New Roman" w:hAnsi="Times New Roman" w:cs="Times New Roman"/>
-                      <w:szCs w:val="20"/>
-                    </w:rPr>
-                    <w:t>)</w:t>
-                  </w:r>
-                  <w:r>
-                    <w:rPr>
-                      <w:rFonts w:ascii="Times New Roman" w:hAnsi="Times New Roman" w:cs="Times New Roman"/>
-                      <w:szCs w:val="20"/>
-                    </w:rPr>
-                    <w:t xml:space="preserve"> Kris Singh</w:t>
-                  </w:r>
+                  <w:r/>
                 </w:p>
               </w:tc>
               <w:tc>
@@ -1137,13 +1072,7 @@
                       <w:szCs w:val="20"/>
                     </w:rPr>
                   </w:pPr>
-                  <w:r>
-                    <w:rPr>
-                      <w:rFonts w:ascii="Times New Roman" w:hAnsi="Times New Roman" w:cs="Times New Roman"/>
-                      <w:szCs w:val="20"/>
-                    </w:rPr>
-                    <w:t>Founder and CEO, SRII; Visiting Professor, Tsinghua University</w:t>
-                  </w:r>
+                  <w:r/>
                 </w:p>
               </w:tc>
               <w:tc>
@@ -1159,6 +1088,7 @@
                       <w:szCs w:val="20"/>
                     </w:rPr>
                   </w:pPr>
+                  <w:r/>
                 </w:p>
               </w:tc>
               <w:tc>
@@ -1174,13 +1104,7 @@
                       <w:szCs w:val="20"/>
                     </w:rPr>
                   </w:pPr>
-                  <w:r>
-                    <w:rPr>
-                      <w:rFonts w:ascii="Times New Roman" w:hAnsi="Times New Roman" w:cs="Times New Roman"/>
-                      <w:szCs w:val="20"/>
-                    </w:rPr>
-                    <w:t>kris@thesrii.org</w:t>
-                  </w:r>
+                  <w:r/>
                 </w:p>
               </w:tc>
             </w:tr>
@@ -1219,6 +1143,7 @@
                       <w:szCs w:val="20"/>
                     </w:rPr>
                   </w:pPr>
+                  <w:r/>
                 </w:p>
               </w:tc>
               <w:tc>
@@ -1235,6 +1160,7 @@
                       <w:szCs w:val="20"/>
                     </w:rPr>
                   </w:pPr>
+                  <w:r/>
                 </w:p>
               </w:tc>
               <w:tc>
@@ -1251,6 +1177,7 @@
                       <w:szCs w:val="20"/>
                     </w:rPr>
                   </w:pPr>
+                  <w:r/>
                 </w:p>
               </w:tc>
               <w:tc>
@@ -1267,6 +1194,7 @@
                       <w:szCs w:val="20"/>
                     </w:rPr>
                   </w:pPr>
+                  <w:r/>
                 </w:p>
               </w:tc>
             </w:tr>
@@ -1307,6 +1235,7 @@
                       <w:szCs w:val="24"/>
                     </w:rPr>
                   </w:pPr>
+                  <w:r/>
                 </w:p>
               </w:tc>
               <w:tc>
@@ -1324,6 +1253,7 @@
                       <w:szCs w:val="24"/>
                     </w:rPr>
                   </w:pPr>
+                  <w:r/>
                 </w:p>
               </w:tc>
               <w:tc>
@@ -1341,6 +1271,7 @@
                       <w:szCs w:val="24"/>
                     </w:rPr>
                   </w:pPr>
+                  <w:r/>
                 </w:p>
               </w:tc>
               <w:tc>
@@ -1358,20 +1289,17 @@
                       <w:szCs w:val="24"/>
                     </w:rPr>
                   </w:pPr>
+                  <w:r/>
                 </w:p>
               </w:tc>
             </w:tr>
           </w:tbl>
           <w:p/>
           <w:p>
-            <w:r>
-              <w:t>Team Leader — Trịnh Hoàng Tú</w:t>
-            </w:r>
-          </w:p>
-          <w:p>
-            <w:r>
-              <w:t>Team Member — N/A</w:t>
-            </w:r>
+            <w:r/>
+          </w:p>
+          <w:p>
+            <w:r/>
           </w:p>
         </w:tc>
       </w:tr>

</xml_diff>

<commit_message>
Polish release provenance wording, Office metadata, and pitch Q&A.
Clarify LIBAD evaluated-commit vs final-pack provenance, scrub DOCX/PPTX generator metadata, widen Application Form email column, and soften Track 4 Q&A phrasing without changing Challenge 1 framing pending Zhao.

Co-authored-by: Cursor <cursoragent@cursor.com>
</commit_message>
<xml_diff>
--- a/Al + Materials Competition Application Form.docx
+++ b/Al + Materials Competition Application Form.docx
@@ -575,7 +575,7 @@
           <w:p/>
           <w:p>
             <w:r>
-              <w:t>Current Competitive Advantage: The implementation emphasizes evidence and failure behavior around a two-class YOLO26n detector/ONNX baseline: unsafe or unverified conditions are prevented from becoming automatic release decisions, inspection identities are protected against duplicate processing, and evaluation claims are gated by artifact hashes and split integrity. SecureCoating covers the inspection-to-quality-decision segment of an autonomous materials characterization pipeline; material/electrochemical performance prediction is the next validation stage once plant-linked property labels exist. The repository does not claim factory qualification or production performance.</w:t>
+              <w:t>Current Competitive Advantage: The implementation emphasizes evidence and failure behavior around a two-class YOLO26n detector/ONNX baseline: unsafe or unverified conditions are prevented from becoming automatic release decisions, inspection identities are protected against duplicate processing, and evaluation claims are gated by artifact hashes and split integrity. SecureCoating covers the inspection-to-quality-decision segment of an autonomous materials characterization pipeline; material/electrochemical performance prediction is the next validation stage once plant-linked property labels exist. SecureCoating covers the inspection-to-quality-decision segment of an autonomous materials characterization pipeline; material/electrochemical performance prediction is the next validation stage once plant-linked property labels exist. SecureCoating covers the inspection-to-quality-decision segment of an autonomous materials characterization pipeline; material/electrochemical performance prediction is the next validation stage once plant-linked property labels exist. The repository does not claim factory qualification or production performance.</w:t>
             </w:r>
           </w:p>
         </w:tc>
@@ -816,7 +816,7 @@
               </w:trPr>
               <w:tc>
                 <w:tcPr>
-                  <w:tcW w:w="1158" w:type="dxa"/>
+                  <w:tcW w:w="1361" w:type="dxa"/>
                   <w:vAlign w:val="center"/>
                 </w:tcPr>
                 <w:p>
@@ -838,7 +838,7 @@
               </w:tc>
               <w:tc>
                 <w:tcPr>
-                  <w:tcW w:w="1577" w:type="dxa"/>
+                  <w:tcW w:w="1928" w:type="dxa"/>
                   <w:vAlign w:val="center"/>
                 </w:tcPr>
                 <w:p>
@@ -860,7 +860,7 @@
               </w:tc>
               <w:tc>
                 <w:tcPr>
-                  <w:tcW w:w="1429" w:type="dxa"/>
+                  <w:tcW w:w="1814" w:type="dxa"/>
                   <w:vAlign w:val="center"/>
                 </w:tcPr>
                 <w:p>
@@ -882,7 +882,7 @@
               </w:tc>
               <w:tc>
                 <w:tcPr>
-                  <w:tcW w:w="1548" w:type="dxa"/>
+                  <w:tcW w:w="1701" w:type="dxa"/>
                   <w:vAlign w:val="center"/>
                 </w:tcPr>
                 <w:p>
@@ -904,7 +904,7 @@
               </w:tc>
               <w:tc>
                 <w:tcPr>
-                  <w:tcW w:w="2358" w:type="dxa"/>
+                  <w:tcW w:w="2835" w:type="dxa"/>
                   <w:vAlign w:val="center"/>
                 </w:tcPr>
                 <w:p>
@@ -931,7 +931,7 @@
               </w:trPr>
               <w:tc>
                 <w:tcPr>
-                  <w:tcW w:w="1158" w:type="dxa"/>
+                  <w:tcW w:w="1361" w:type="dxa"/>
                   <w:vAlign w:val="center"/>
                 </w:tcPr>
                 <w:p>
@@ -949,7 +949,7 @@
               </w:tc>
               <w:tc>
                 <w:tcPr>
-                  <w:tcW w:w="1577" w:type="dxa"/>
+                  <w:tcW w:w="1928" w:type="dxa"/>
                   <w:vAlign w:val="center"/>
                 </w:tcPr>
                 <w:p>
@@ -967,7 +967,7 @@
               </w:tc>
               <w:tc>
                 <w:tcPr>
-                  <w:tcW w:w="1429" w:type="dxa"/>
+                  <w:tcW w:w="1814" w:type="dxa"/>
                   <w:vAlign w:val="center"/>
                 </w:tcPr>
                 <w:p>
@@ -985,7 +985,7 @@
               </w:tc>
               <w:tc>
                 <w:tcPr>
-                  <w:tcW w:w="1548" w:type="dxa"/>
+                  <w:tcW w:w="1701" w:type="dxa"/>
                   <w:vAlign w:val="center"/>
                 </w:tcPr>
                 <w:p>
@@ -1003,7 +1003,7 @@
               </w:tc>
               <w:tc>
                 <w:tcPr>
-                  <w:tcW w:w="2358" w:type="dxa"/>
+                  <w:tcW w:w="2835" w:type="dxa"/>
                   <w:vAlign w:val="center"/>
                 </w:tcPr>
                 <w:p>
@@ -1026,7 +1026,7 @@
               </w:trPr>
               <w:tc>
                 <w:tcPr>
-                  <w:tcW w:w="1158" w:type="dxa"/>
+                  <w:tcW w:w="1361" w:type="dxa"/>
                   <w:vMerge w:val="restart"/>
                   <w:vAlign w:val="center"/>
                 </w:tcPr>
@@ -1045,7 +1045,7 @@
               </w:tc>
               <w:tc>
                 <w:tcPr>
-                  <w:tcW w:w="1577" w:type="dxa"/>
+                  <w:tcW w:w="1928" w:type="dxa"/>
                   <w:vAlign w:val="center"/>
                 </w:tcPr>
                 <w:p>
@@ -1061,7 +1061,7 @@
               </w:tc>
               <w:tc>
                 <w:tcPr>
-                  <w:tcW w:w="1429" w:type="dxa"/>
+                  <w:tcW w:w="1814" w:type="dxa"/>
                   <w:vAlign w:val="center"/>
                 </w:tcPr>
                 <w:p>
@@ -1077,7 +1077,7 @@
               </w:tc>
               <w:tc>
                 <w:tcPr>
-                  <w:tcW w:w="1548" w:type="dxa"/>
+                  <w:tcW w:w="1701" w:type="dxa"/>
                   <w:vAlign w:val="center"/>
                 </w:tcPr>
                 <w:p>
@@ -1093,7 +1093,7 @@
               </w:tc>
               <w:tc>
                 <w:tcPr>
-                  <w:tcW w:w="2358" w:type="dxa"/>
+                  <w:tcW w:w="2835" w:type="dxa"/>
                   <w:vAlign w:val="center"/>
                 </w:tcPr>
                 <w:p>
@@ -1131,7 +1131,7 @@
               </w:tc>
               <w:tc>
                 <w:tcPr>
-                  <w:tcW w:w="1577" w:type="dxa"/>
+                  <w:tcW w:w="1928" w:type="dxa"/>
                   <w:vAlign w:val="center"/>
                 </w:tcPr>
                 <w:p>
@@ -1148,7 +1148,7 @@
               </w:tc>
               <w:tc>
                 <w:tcPr>
-                  <w:tcW w:w="1429" w:type="dxa"/>
+                  <w:tcW w:w="1814" w:type="dxa"/>
                   <w:vAlign w:val="center"/>
                 </w:tcPr>
                 <w:p>
@@ -1165,7 +1165,7 @@
               </w:tc>
               <w:tc>
                 <w:tcPr>
-                  <w:tcW w:w="1548" w:type="dxa"/>
+                  <w:tcW w:w="1701" w:type="dxa"/>
                   <w:vAlign w:val="center"/>
                 </w:tcPr>
                 <w:p>
@@ -1182,7 +1182,7 @@
               </w:tc>
               <w:tc>
                 <w:tcPr>
-                  <w:tcW w:w="2358" w:type="dxa"/>
+                  <w:tcW w:w="2835" w:type="dxa"/>
                   <w:vAlign w:val="center"/>
                 </w:tcPr>
                 <w:p>
@@ -1222,7 +1222,7 @@
               </w:tc>
               <w:tc>
                 <w:tcPr>
-                  <w:tcW w:w="1577" w:type="dxa"/>
+                  <w:tcW w:w="1928" w:type="dxa"/>
                   <w:vAlign w:val="center"/>
                 </w:tcPr>
                 <w:p>
@@ -1240,7 +1240,7 @@
               </w:tc>
               <w:tc>
                 <w:tcPr>
-                  <w:tcW w:w="1429" w:type="dxa"/>
+                  <w:tcW w:w="1814" w:type="dxa"/>
                   <w:vAlign w:val="center"/>
                 </w:tcPr>
                 <w:p>
@@ -1258,7 +1258,7 @@
               </w:tc>
               <w:tc>
                 <w:tcPr>
-                  <w:tcW w:w="1548" w:type="dxa"/>
+                  <w:tcW w:w="1701" w:type="dxa"/>
                   <w:vAlign w:val="center"/>
                 </w:tcPr>
                 <w:p>
@@ -1276,7 +1276,7 @@
               </w:tc>
               <w:tc>
                 <w:tcPr>
-                  <w:tcW w:w="2358" w:type="dxa"/>
+                  <w:tcW w:w="2835" w:type="dxa"/>
                   <w:vAlign w:val="center"/>
                 </w:tcPr>
                 <w:p>

</xml_diff>

<commit_message>
Make Application Form claim fixer idempotent and keep email on one line.
Collapse duplicate performance-prediction boundary inserts, lock Section 7 roster column widths with a smaller email font, and add regression coverage for exact-once boundary text.

Co-authored-by: Cursor <cursoragent@cursor.com>
</commit_message>
<xml_diff>
--- a/Al + Materials Competition Application Form.docx
+++ b/Al + Materials Competition Application Form.docx
@@ -575,7 +575,7 @@
           <w:p/>
           <w:p>
             <w:r>
-              <w:t>Current Competitive Advantage: The implementation emphasizes evidence and failure behavior around a two-class YOLO26n detector/ONNX baseline: unsafe or unverified conditions are prevented from becoming automatic release decisions, inspection identities are protected against duplicate processing, and evaluation claims are gated by artifact hashes and split integrity. SecureCoating covers the inspection-to-quality-decision segment of an autonomous materials characterization pipeline; material/electrochemical performance prediction is the next validation stage once plant-linked property labels exist. SecureCoating covers the inspection-to-quality-decision segment of an autonomous materials characterization pipeline; material/electrochemical performance prediction is the next validation stage once plant-linked property labels exist. SecureCoating covers the inspection-to-quality-decision segment of an autonomous materials characterization pipeline; material/electrochemical performance prediction is the next validation stage once plant-linked property labels exist. The repository does not claim factory qualification or production performance.</w:t>
+              <w:t>Current Competitive Advantage: The implementation emphasizes evidence and failure behavior around a two-class YOLO26n detector/ONNX baseline: unsafe or unverified conditions are prevented from becoming automatic release decisions, inspection identities are protected against duplicate processing, and evaluation claims are gated by artifact hashes and split integrity. SecureCoating covers the inspection-to-quality-decision segment of an autonomous materials characterization pipeline; material/electrochemical performance prediction is the next validation stage once plant-linked property labels exist. The repository does not claim factory qualification or production performance.</w:t>
             </w:r>
           </w:p>
         </w:tc>
@@ -791,7 +791,7 @@
           </w:p>
           <w:tbl>
             <w:tblPr>
-              <w:tblW w:w="0" w:type="auto"/>
+              <w:tblW w:w="7823" w:type="dxa"/>
               <w:jc w:val="center"/>
               <w:tblBorders>
                 <w:top w:val="single" w:sz="4" w:space="0" w:color="auto"/>
@@ -801,6 +801,7 @@
                 <w:insideH w:val="single" w:sz="4" w:space="0" w:color="auto"/>
                 <w:insideV w:val="single" w:sz="4" w:space="0" w:color="auto"/>
               </w:tblBorders>
+              <w:tblLayout w:type="fixed"/>
               <w:tblLook w:val="0000" w:firstRow="0" w:lastRow="0" w:firstColumn="0" w:lastColumn="0" w:noHBand="0" w:noVBand="0"/>
             </w:tblPr>
             <w:tblGrid>
@@ -816,7 +817,7 @@
               </w:trPr>
               <w:tc>
                 <w:tcPr>
-                  <w:tcW w:w="1361" w:type="dxa"/>
+                  <w:tcW w:w="1077" w:type="dxa"/>
                   <w:vAlign w:val="center"/>
                 </w:tcPr>
                 <w:p>
@@ -838,7 +839,7 @@
               </w:tc>
               <w:tc>
                 <w:tcPr>
-                  <w:tcW w:w="1928" w:type="dxa"/>
+                  <w:tcW w:w="1644" w:type="dxa"/>
                   <w:vAlign w:val="center"/>
                 </w:tcPr>
                 <w:p>
@@ -860,7 +861,7 @@
               </w:tc>
               <w:tc>
                 <w:tcPr>
-                  <w:tcW w:w="1814" w:type="dxa"/>
+                  <w:tcW w:w="1303" w:type="dxa"/>
                   <w:vAlign w:val="center"/>
                 </w:tcPr>
                 <w:p>
@@ -882,7 +883,7 @@
               </w:tc>
               <w:tc>
                 <w:tcPr>
-                  <w:tcW w:w="1701" w:type="dxa"/>
+                  <w:tcW w:w="1417" w:type="dxa"/>
                   <w:vAlign w:val="center"/>
                 </w:tcPr>
                 <w:p>
@@ -904,7 +905,7 @@
               </w:tc>
               <w:tc>
                 <w:tcPr>
-                  <w:tcW w:w="2835" w:type="dxa"/>
+                  <w:tcW w:w="2381" w:type="dxa"/>
                   <w:vAlign w:val="center"/>
                 </w:tcPr>
                 <w:p>
@@ -931,7 +932,7 @@
               </w:trPr>
               <w:tc>
                 <w:tcPr>
-                  <w:tcW w:w="1361" w:type="dxa"/>
+                  <w:tcW w:w="1077" w:type="dxa"/>
                   <w:vAlign w:val="center"/>
                 </w:tcPr>
                 <w:p>
@@ -949,7 +950,7 @@
               </w:tc>
               <w:tc>
                 <w:tcPr>
-                  <w:tcW w:w="1928" w:type="dxa"/>
+                  <w:tcW w:w="1644" w:type="dxa"/>
                   <w:vAlign w:val="center"/>
                 </w:tcPr>
                 <w:p>
@@ -967,7 +968,7 @@
               </w:tc>
               <w:tc>
                 <w:tcPr>
-                  <w:tcW w:w="1814" w:type="dxa"/>
+                  <w:tcW w:w="1303" w:type="dxa"/>
                   <w:vAlign w:val="center"/>
                 </w:tcPr>
                 <w:p>
@@ -985,7 +986,7 @@
               </w:tc>
               <w:tc>
                 <w:tcPr>
-                  <w:tcW w:w="1701" w:type="dxa"/>
+                  <w:tcW w:w="1417" w:type="dxa"/>
                   <w:vAlign w:val="center"/>
                 </w:tcPr>
                 <w:p>
@@ -1003,7 +1004,7 @@
               </w:tc>
               <w:tc>
                 <w:tcPr>
-                  <w:tcW w:w="2835" w:type="dxa"/>
+                  <w:tcW w:w="2381" w:type="dxa"/>
                   <w:vAlign w:val="center"/>
                 </w:tcPr>
                 <w:p>
@@ -1015,6 +1016,9 @@
                     </w:rPr>
                   </w:pPr>
                   <w:r>
+                    <w:rPr>
+                      <w:sz w:val="16"/>
+                    </w:rPr>
                     <w:t>tht.csec2005@gmail.com</w:t>
                   </w:r>
                 </w:p>
@@ -1026,7 +1030,7 @@
               </w:trPr>
               <w:tc>
                 <w:tcPr>
-                  <w:tcW w:w="1361" w:type="dxa"/>
+                  <w:tcW w:w="1077" w:type="dxa"/>
                   <w:vMerge w:val="restart"/>
                   <w:vAlign w:val="center"/>
                 </w:tcPr>
@@ -1045,7 +1049,7 @@
               </w:tc>
               <w:tc>
                 <w:tcPr>
-                  <w:tcW w:w="1928" w:type="dxa"/>
+                  <w:tcW w:w="1644" w:type="dxa"/>
                   <w:vAlign w:val="center"/>
                 </w:tcPr>
                 <w:p>
@@ -1061,7 +1065,7 @@
               </w:tc>
               <w:tc>
                 <w:tcPr>
-                  <w:tcW w:w="1814" w:type="dxa"/>
+                  <w:tcW w:w="1303" w:type="dxa"/>
                   <w:vAlign w:val="center"/>
                 </w:tcPr>
                 <w:p>
@@ -1077,7 +1081,7 @@
               </w:tc>
               <w:tc>
                 <w:tcPr>
-                  <w:tcW w:w="1701" w:type="dxa"/>
+                  <w:tcW w:w="1417" w:type="dxa"/>
                   <w:vAlign w:val="center"/>
                 </w:tcPr>
                 <w:p>
@@ -1093,7 +1097,7 @@
               </w:tc>
               <w:tc>
                 <w:tcPr>
-                  <w:tcW w:w="2835" w:type="dxa"/>
+                  <w:tcW w:w="2381" w:type="dxa"/>
                   <w:vAlign w:val="center"/>
                 </w:tcPr>
                 <w:p>
@@ -1131,7 +1135,7 @@
               </w:tc>
               <w:tc>
                 <w:tcPr>
-                  <w:tcW w:w="1928" w:type="dxa"/>
+                  <w:tcW w:w="1644" w:type="dxa"/>
                   <w:vAlign w:val="center"/>
                 </w:tcPr>
                 <w:p>
@@ -1148,7 +1152,7 @@
               </w:tc>
               <w:tc>
                 <w:tcPr>
-                  <w:tcW w:w="1814" w:type="dxa"/>
+                  <w:tcW w:w="1303" w:type="dxa"/>
                   <w:vAlign w:val="center"/>
                 </w:tcPr>
                 <w:p>
@@ -1165,7 +1169,7 @@
               </w:tc>
               <w:tc>
                 <w:tcPr>
-                  <w:tcW w:w="1701" w:type="dxa"/>
+                  <w:tcW w:w="1417" w:type="dxa"/>
                   <w:vAlign w:val="center"/>
                 </w:tcPr>
                 <w:p>
@@ -1182,7 +1186,7 @@
               </w:tc>
               <w:tc>
                 <w:tcPr>
-                  <w:tcW w:w="2835" w:type="dxa"/>
+                  <w:tcW w:w="2381" w:type="dxa"/>
                   <w:vAlign w:val="center"/>
                 </w:tcPr>
                 <w:p>
@@ -1222,7 +1226,7 @@
               </w:tc>
               <w:tc>
                 <w:tcPr>
-                  <w:tcW w:w="1928" w:type="dxa"/>
+                  <w:tcW w:w="1644" w:type="dxa"/>
                   <w:vAlign w:val="center"/>
                 </w:tcPr>
                 <w:p>
@@ -1240,7 +1244,7 @@
               </w:tc>
               <w:tc>
                 <w:tcPr>
-                  <w:tcW w:w="1814" w:type="dxa"/>
+                  <w:tcW w:w="1303" w:type="dxa"/>
                   <w:vAlign w:val="center"/>
                 </w:tcPr>
                 <w:p>
@@ -1258,7 +1262,7 @@
               </w:tc>
               <w:tc>
                 <w:tcPr>
-                  <w:tcW w:w="1701" w:type="dxa"/>
+                  <w:tcW w:w="1417" w:type="dxa"/>
                   <w:vAlign w:val="center"/>
                 </w:tcPr>
                 <w:p>
@@ -1276,7 +1280,7 @@
               </w:tc>
               <w:tc>
                 <w:tcPr>
-                  <w:tcW w:w="2835" w:type="dxa"/>
+                  <w:tcW w:w="2381" w:type="dxa"/>
                   <w:vAlign w:val="center"/>
                 </w:tcPr>
                 <w:p>

</xml_diff>

<commit_message>
Document future research upgrades and slow the Minute-6 demo loops.
Regenerate defense GIFs from current stills with ~3 s holds, ship a readable side-by-side demo MP4, expand README roadmap items, and include the manually polished Application Form.

Co-authored-by: Cursor <cursoragent@cursor.com>
</commit_message>
<xml_diff>
--- a/Al + Materials Competition Application Form.docx
+++ b/Al + Materials Competition Application Form.docx
@@ -109,12 +109,29 @@
               <w:spacing w:line="360" w:lineRule="auto"/>
               <w:jc w:val="right"/>
               <w:rPr>
+                <w:rFonts w:ascii="Times New Roman" w:hAnsi="Times New Roman" w:cs="Times New Roman"/>
+                <w:sz w:val="28"/>
+                <w:szCs w:val="32"/>
+              </w:rPr>
+            </w:pPr>
+          </w:p>
+          <w:p>
+            <w:pPr>
+              <w:adjustRightInd w:val="0"/>
+              <w:spacing w:line="360" w:lineRule="auto"/>
+              <w:jc w:val="right"/>
+              <w:rPr>
                 <w:rFonts w:ascii="Times New Roman" w:eastAsia="KaiTi" w:hAnsi="Times New Roman" w:cs="Times New Roman"/>
                 <w:sz w:val="28"/>
                 <w:szCs w:val="28"/>
               </w:rPr>
             </w:pPr>
             <w:r>
+              <w:rPr>
+                <w:rFonts w:ascii="Times New Roman" w:hAnsi="Times New Roman" w:cs="Times New Roman"/>
+                <w:sz w:val="28"/>
+                <w:szCs w:val="32"/>
+              </w:rPr>
               <w:t>SecureCoating-Vision: Evidence-Gated Multimodal AI for Battery Electrode Inspection and Traceable Quality Decisions</w:t>
             </w:r>
           </w:p>
@@ -424,6 +441,56 @@
         </w:tc>
       </w:tr>
     </w:tbl>
+    <w:p>
+      <w:pPr>
+        <w:jc w:val="left"/>
+        <w:rPr>
+          <w:rFonts w:ascii="Times New Roman" w:eastAsia="STXingkai" w:hAnsi="Times New Roman" w:cs="Times New Roman"/>
+          <w:sz w:val="28"/>
+          <w:szCs w:val="18"/>
+        </w:rPr>
+      </w:pPr>
+    </w:p>
+    <w:p>
+      <w:pPr>
+        <w:jc w:val="left"/>
+        <w:rPr>
+          <w:rFonts w:ascii="Times New Roman" w:eastAsia="STXingkai" w:hAnsi="Times New Roman" w:cs="Times New Roman"/>
+          <w:sz w:val="28"/>
+          <w:szCs w:val="18"/>
+        </w:rPr>
+      </w:pPr>
+    </w:p>
+    <w:p>
+      <w:pPr>
+        <w:jc w:val="left"/>
+        <w:rPr>
+          <w:rFonts w:ascii="Times New Roman" w:eastAsia="STXingkai" w:hAnsi="Times New Roman" w:cs="Times New Roman"/>
+          <w:sz w:val="28"/>
+          <w:szCs w:val="18"/>
+        </w:rPr>
+      </w:pPr>
+    </w:p>
+    <w:p>
+      <w:pPr>
+        <w:jc w:val="left"/>
+        <w:rPr>
+          <w:rFonts w:ascii="Times New Roman" w:eastAsia="STXingkai" w:hAnsi="Times New Roman" w:cs="Times New Roman"/>
+          <w:sz w:val="28"/>
+          <w:szCs w:val="18"/>
+        </w:rPr>
+      </w:pPr>
+    </w:p>
+    <w:p>
+      <w:pPr>
+        <w:jc w:val="left"/>
+        <w:rPr>
+          <w:rFonts w:ascii="Times New Roman" w:eastAsia="STXingkai" w:hAnsi="Times New Roman" w:cs="Times New Roman"/>
+          <w:sz w:val="28"/>
+          <w:szCs w:val="18"/>
+        </w:rPr>
+      </w:pPr>
+    </w:p>
     <w:p>
       <w:pPr>
         <w:jc w:val="left"/>
@@ -491,55 +558,6 @@
         </w:rPr>
         <w:t>Date: 07 / 09 / 2026</w:t>
       </w:r>
-      <w:r>
-        <w:rPr>
-          <w:rFonts w:ascii="Times New Roman" w:hAnsi="Times New Roman" w:cs="Times New Roman"/>
-          <w:sz w:val="28"/>
-          <w:szCs w:val="28"/>
-        </w:rPr>
-      </w:r>
-      <w:r>
-        <w:rPr>
-          <w:rFonts w:ascii="Times New Roman" w:hAnsi="Times New Roman" w:cs="Times New Roman"/>
-          <w:sz w:val="28"/>
-          <w:szCs w:val="28"/>
-        </w:rPr>
-      </w:r>
-      <w:r>
-        <w:rPr>
-          <w:rFonts w:ascii="Times New Roman" w:hAnsi="Times New Roman" w:cs="Times New Roman"/>
-          <w:sz w:val="28"/>
-          <w:szCs w:val="28"/>
-        </w:rPr>
-      </w:r>
-      <w:r>
-        <w:rPr>
-          <w:rFonts w:ascii="Times New Roman" w:hAnsi="Times New Roman" w:cs="Times New Roman"/>
-          <w:sz w:val="28"/>
-          <w:szCs w:val="28"/>
-        </w:rPr>
-      </w:r>
-      <w:r>
-        <w:rPr>
-          <w:rFonts w:ascii="Times New Roman" w:hAnsi="Times New Roman" w:cs="Times New Roman"/>
-          <w:sz w:val="28"/>
-          <w:szCs w:val="28"/>
-        </w:rPr>
-      </w:r>
-      <w:r>
-        <w:rPr>
-          <w:rFonts w:ascii="Times New Roman" w:hAnsi="Times New Roman" w:cs="Times New Roman"/>
-          <w:sz w:val="28"/>
-          <w:szCs w:val="28"/>
-        </w:rPr>
-      </w:r>
-      <w:r>
-        <w:rPr>
-          <w:rFonts w:ascii="Times New Roman" w:hAnsi="Times New Roman" w:cs="Times New Roman"/>
-          <w:sz w:val="28"/>
-          <w:szCs w:val="28"/>
-        </w:rPr>
-      </w:r>
     </w:p>
     <w:tbl>
       <w:tblPr>
@@ -556,25 +574,140 @@
             <w:tcW w:w="8296" w:type="dxa"/>
           </w:tcPr>
           <w:p>
-            <w:r>
-              <w:t>1、Project Overview（e.g., background, state of the art, project objectives, key competitive advantages, etc.）</w:t>
-            </w:r>
-          </w:p>
-          <w:p/>
-          <w:p>
-            <w:r>
+            <w:pPr>
+              <w:rPr>
+                <w:rFonts w:ascii="Times New Roman" w:hAnsi="Times New Roman" w:cs="Times New Roman"/>
+                <w:b/>
+                <w:bCs/>
+              </w:rPr>
+            </w:pPr>
+            <w:r>
+              <w:rPr>
+                <w:rFonts w:ascii="Times New Roman" w:hAnsi="Times New Roman" w:cs="Times New Roman"/>
+                <w:sz w:val="28"/>
+                <w:szCs w:val="28"/>
+              </w:rPr>
+              <w:lastRenderedPageBreak/>
+              <w:br w:type="page"/>
+            </w:r>
+            <w:r>
+              <w:rPr>
+                <w:rFonts w:ascii="Times New Roman" w:hAnsi="Times New Roman" w:cs="Times New Roman"/>
+                <w:b/>
+                <w:bCs/>
+                <w:sz w:val="24"/>
+                <w:szCs w:val="24"/>
+              </w:rPr>
+              <w:t>1</w:t>
+            </w:r>
+            <w:r>
+              <w:rPr>
+                <w:rFonts w:ascii="Times New Roman" w:hAnsi="Times New Roman" w:cs="Times New Roman"/>
+                <w:b/>
+                <w:bCs/>
+                <w:sz w:val="24"/>
+                <w:szCs w:val="24"/>
+              </w:rPr>
+              <w:t>、</w:t>
+            </w:r>
+            <w:r>
+              <w:rPr>
+                <w:rFonts w:ascii="Times New Roman" w:hAnsi="Times New Roman" w:cs="Times New Roman"/>
+                <w:b/>
+                <w:bCs/>
+                <w:sz w:val="24"/>
+                <w:szCs w:val="24"/>
+              </w:rPr>
+              <w:t>Project Overview</w:t>
+            </w:r>
+            <w:r>
+              <w:rPr>
+                <w:rFonts w:ascii="Times New Roman" w:hAnsi="Times New Roman" w:cs="Times New Roman"/>
+                <w:b/>
+                <w:bCs/>
+                <w:sz w:val="24"/>
+                <w:szCs w:val="24"/>
+              </w:rPr>
+              <w:t>（</w:t>
+            </w:r>
+            <w:r>
+              <w:rPr>
+                <w:rFonts w:ascii="Times New Roman" w:hAnsi="Times New Roman" w:cs="Times New Roman"/>
+                <w:b/>
+                <w:bCs/>
+                <w:sz w:val="24"/>
+                <w:szCs w:val="24"/>
+              </w:rPr>
+              <w:t>e.g., background, state of the art, project objectives, key competitive advantages, etc.</w:t>
+            </w:r>
+            <w:r>
+              <w:rPr>
+                <w:rFonts w:ascii="Times New Roman" w:hAnsi="Times New Roman" w:cs="Times New Roman"/>
+                <w:b/>
+                <w:bCs/>
+                <w:sz w:val="24"/>
+                <w:szCs w:val="24"/>
+              </w:rPr>
+              <w:t>）</w:t>
+            </w:r>
+          </w:p>
+          <w:p>
+            <w:pPr>
+              <w:rPr>
+                <w:rFonts w:ascii="Times New Roman" w:hAnsi="Times New Roman" w:cs="Times New Roman"/>
+              </w:rPr>
+            </w:pPr>
+          </w:p>
+          <w:p>
+            <w:pPr>
+              <w:rPr>
+                <w:rFonts w:ascii="Times New Roman" w:hAnsi="Times New Roman" w:cs="Times New Roman"/>
+              </w:rPr>
+            </w:pPr>
+            <w:r>
+              <w:rPr>
+                <w:rFonts w:ascii="Times New Roman" w:hAnsi="Times New Roman" w:cs="Times New Roman"/>
+              </w:rPr>
               <w:t>Background &amp; State of the Art: Battery electrode coating defects can affect downstream quality, yield, and safety. Public research datasets and computer-vision models make defect segmentation accessible, but a deployable inspection workflow also needs traceability, input validation, explicit failure handling, and reproducible evaluation.</w:t>
             </w:r>
           </w:p>
-          <w:p/>
-          <w:p>
-            <w:r>
+          <w:p>
+            <w:pPr>
+              <w:rPr>
+                <w:rFonts w:ascii="Times New Roman" w:hAnsi="Times New Roman" w:cs="Times New Roman"/>
+              </w:rPr>
+            </w:pPr>
+          </w:p>
+          <w:p>
+            <w:pPr>
+              <w:rPr>
+                <w:rFonts w:ascii="Times New Roman" w:hAnsi="Times New Roman" w:cs="Times New Roman"/>
+              </w:rPr>
+            </w:pPr>
+            <w:r>
+              <w:rPr>
+                <w:rFonts w:ascii="Times New Roman" w:hAnsi="Times New Roman" w:cs="Times New Roman"/>
+              </w:rPr>
               <w:t>Project Objectives: SecureCoating-Vision is a research prototype for non-destructive coating-defect inspection. It connects RGB detection with simulated multimodal registration, physical-coordinate mapping, quality traceability, and industrial protocol adapters. The project objective is to demonstrate a verifiable software workflow and define the evidence required for a future plant pilot. Tagline: Evidence-Gated Multimodal Inspection for Battery Electrode Manufacturing. The LIBAD lane extends validation of the same battery-electrode inspection and quality-decision problem.</w:t>
             </w:r>
           </w:p>
-          <w:p/>
-          <w:p>
-            <w:r>
+          <w:p>
+            <w:pPr>
+              <w:rPr>
+                <w:rFonts w:ascii="Times New Roman" w:hAnsi="Times New Roman" w:cs="Times New Roman"/>
+              </w:rPr>
+            </w:pPr>
+          </w:p>
+          <w:p>
+            <w:pPr>
+              <w:rPr>
+                <w:rFonts w:ascii="Times New Roman" w:hAnsi="Times New Roman" w:cs="Times New Roman"/>
+              </w:rPr>
+            </w:pPr>
+            <w:r>
+              <w:rPr>
+                <w:rFonts w:ascii="Times New Roman" w:hAnsi="Times New Roman" w:cs="Times New Roman"/>
+              </w:rPr>
               <w:t>Current Competitive Advantage: The implementation emphasizes evidence and failure behavior around a two-class YOLO26n detector/ONNX baseline: unsafe or unverified conditions are prevented from becoming automatic release decisions, inspection identities are protected against duplicate processing, and evaluation claims are gated by artifact hashes and split integrity. SecureCoating covers the inspection-to-quality-decision segment of an autonomous materials characterization pipeline; material/electrochemical performance prediction is the next validation stage once plant-linked property labels exist. The repository does not claim factory qualification or production performance.</w:t>
             </w:r>
           </w:p>
@@ -586,25 +719,140 @@
             <w:tcW w:w="8296" w:type="dxa"/>
           </w:tcPr>
           <w:p>
-            <w:r>
-              <w:t>2、Project Plan（e.g., technical approach, main features/functionalities, project deliverables/outputs, etc.）</w:t>
-            </w:r>
-          </w:p>
-          <w:p/>
-          <w:p>
-            <w:r>
+            <w:pPr>
+              <w:rPr>
+                <w:rFonts w:ascii="Times New Roman" w:hAnsi="Times New Roman" w:cs="Times New Roman"/>
+                <w:b/>
+                <w:bCs/>
+                <w:sz w:val="24"/>
+                <w:szCs w:val="28"/>
+              </w:rPr>
+            </w:pPr>
+            <w:r>
+              <w:rPr>
+                <w:rFonts w:ascii="Times New Roman" w:hAnsi="Times New Roman" w:cs="Times New Roman"/>
+                <w:b/>
+                <w:bCs/>
+                <w:sz w:val="24"/>
+                <w:szCs w:val="28"/>
+              </w:rPr>
+              <w:t>2</w:t>
+            </w:r>
+            <w:r>
+              <w:rPr>
+                <w:rFonts w:ascii="Times New Roman" w:hAnsi="Times New Roman" w:cs="Times New Roman"/>
+                <w:b/>
+                <w:bCs/>
+                <w:sz w:val="24"/>
+                <w:szCs w:val="28"/>
+              </w:rPr>
+              <w:t>、</w:t>
+            </w:r>
+            <w:r>
+              <w:rPr>
+                <w:rFonts w:ascii="Times New Roman" w:hAnsi="Times New Roman" w:cs="Times New Roman"/>
+                <w:b/>
+                <w:bCs/>
+                <w:sz w:val="24"/>
+                <w:szCs w:val="28"/>
+              </w:rPr>
+              <w:t>Project Plan</w:t>
+            </w:r>
+            <w:r>
+              <w:rPr>
+                <w:rFonts w:ascii="Times New Roman" w:hAnsi="Times New Roman" w:cs="Times New Roman"/>
+                <w:b/>
+                <w:bCs/>
+                <w:sz w:val="24"/>
+                <w:szCs w:val="28"/>
+              </w:rPr>
+              <w:t>（</w:t>
+            </w:r>
+            <w:r>
+              <w:rPr>
+                <w:rFonts w:ascii="Times New Roman" w:hAnsi="Times New Roman" w:cs="Times New Roman"/>
+                <w:b/>
+                <w:bCs/>
+                <w:sz w:val="24"/>
+                <w:szCs w:val="28"/>
+              </w:rPr>
+              <w:t>e.g., technical approach, main features/functionalities, project deliverables/outputs, etc.</w:t>
+            </w:r>
+            <w:r>
+              <w:rPr>
+                <w:rFonts w:ascii="Times New Roman" w:hAnsi="Times New Roman" w:cs="Times New Roman"/>
+                <w:b/>
+                <w:bCs/>
+                <w:sz w:val="24"/>
+                <w:szCs w:val="28"/>
+              </w:rPr>
+              <w:t>）</w:t>
+            </w:r>
+          </w:p>
+          <w:p>
+            <w:pPr>
+              <w:rPr>
+                <w:rFonts w:ascii="Times New Roman" w:hAnsi="Times New Roman" w:cs="Times New Roman"/>
+              </w:rPr>
+            </w:pPr>
+          </w:p>
+          <w:p>
+            <w:pPr>
+              <w:rPr>
+                <w:rFonts w:ascii="Times New Roman" w:hAnsi="Times New Roman" w:cs="Times New Roman"/>
+              </w:rPr>
+            </w:pPr>
+            <w:r>
+              <w:rPr>
+                <w:rFonts w:ascii="Times New Roman" w:hAnsi="Times New Roman" w:cs="Times New Roman"/>
+              </w:rPr>
               <w:t>Technical Approach: The current prototype runs an RGB two-class YOLO26n detector/ONNX inference path locally. Thermal and height streams are simulated or injected interface adapters for registration, metrology, and degraded-mode testing; they are not plant-instrument measurements. After that software-and-safety contract, we added a LIBAD-compatible validation lane for aligned visible-light and X-rayL inputs. The checked-in 90-second demo uses deterministic protocol fixtures; paper-comparable claims require separately verified official dataset/splits and the authors' official implementation. DA-Core remains the LIBAD authors baseline; SecureCoating-Vision adds the evidence-gated PASS/REJECT/HOLD layer. The API applies readiness and fail-closed checks before issuing a decision. Traceability records are written to SQLite, certificates use HMAC-SHA256 authenticated traceability tags, and OPC UA/Modbus adapters expose explicit command and acknowledgement contracts.</w:t>
             </w:r>
           </w:p>
-          <w:p/>
-          <w:p>
-            <w:r>
-              <w:t>Main Features/Functionalities: Two-class optical detection (surface_crack and delamination_crack) on real CoatingVision JPEGs; published pixel masks are dataset labels, not model output; calibrated coordinate mapping when an approved calibration artifact is supplied; roll/batch and part identity controls; PASS/REJECT/HOLD state handling; bounded uploads and inference concurrency; one-shot operations-snapshot dashboard (Guide / Operate / History / Dataset / Diagnose / Traceability / Multimodal); and hash-verified evaluation/evidence tooling.</w:t>
-            </w:r>
-          </w:p>
-          <w:p/>
-          <w:p>
-            <w:r>
+          <w:p>
+            <w:pPr>
+              <w:rPr>
+                <w:rFonts w:ascii="Times New Roman" w:hAnsi="Times New Roman" w:cs="Times New Roman"/>
+              </w:rPr>
+            </w:pPr>
+          </w:p>
+          <w:p>
+            <w:pPr>
+              <w:rPr>
+                <w:rFonts w:ascii="Times New Roman" w:hAnsi="Times New Roman" w:cs="Times New Roman"/>
+              </w:rPr>
+            </w:pPr>
+            <w:r>
+              <w:rPr>
+                <w:rFonts w:ascii="Times New Roman" w:hAnsi="Times New Roman" w:cs="Times New Roman"/>
+              </w:rPr>
+              <w:t xml:space="preserve">Main Features/Functionalities: Two-class optical detection (surface_crack and delamination_crack) on real CoatingVision JPEGs; published pixel masks are dataset labels, not model output; calibrated coordinate mapping when an approved calibration artifact is supplied; roll/batch and part identity controls; PASS/REJECT/HOLD state handling; bounded uploads and inference concurrency; one-shot operations-snapshot dashboard (Guide / Operate / History / </w:t>
+            </w:r>
+            <w:r>
+              <w:rPr>
+                <w:rFonts w:ascii="Times New Roman" w:hAnsi="Times New Roman" w:cs="Times New Roman"/>
+              </w:rPr>
+              <w:lastRenderedPageBreak/>
+              <w:t>Dataset / Diagnose / Traceability / Multimodal); and hash-verified evaluation/evidence tooling.</w:t>
+            </w:r>
+          </w:p>
+          <w:p>
+            <w:pPr>
+              <w:rPr>
+                <w:rFonts w:ascii="Times New Roman" w:hAnsi="Times New Roman" w:cs="Times New Roman"/>
+              </w:rPr>
+            </w:pPr>
+          </w:p>
+          <w:p>
+            <w:pPr>
+              <w:rPr>
+                <w:rFonts w:ascii="Times New Roman" w:hAnsi="Times New Roman" w:cs="Times New Roman"/>
+              </w:rPr>
+            </w:pPr>
+            <w:r>
+              <w:rPr>
+                <w:rFonts w:ascii="Times New Roman" w:hAnsi="Times New Roman" w:cs="Times New Roman"/>
+              </w:rPr>
               <w:t>Deliverables/Outputs: A runnable research prototype, automated safety/integrity tests, local simulation smoke checks, configuration and deployment files, technical documentation, and an evaluation tool that refuses to publish results when required evidence or split integrity is missing. Factory integration, independent performance qualification, and safety approval are future pilot deliverables.</w:t>
             </w:r>
           </w:p>
@@ -616,31 +864,123 @@
             <w:tcW w:w="8296" w:type="dxa"/>
           </w:tcPr>
           <w:p>
-            <w:r>
-              <w:t>3、Key Innovations &amp; Unique Features</w:t>
-            </w:r>
-          </w:p>
-          <w:p/>
-          <w:p>
-            <w:r>
+            <w:pPr>
+              <w:rPr>
+                <w:rFonts w:ascii="Times New Roman" w:hAnsi="Times New Roman" w:cs="Times New Roman"/>
+                <w:b/>
+                <w:bCs/>
+                <w:sz w:val="24"/>
+                <w:szCs w:val="28"/>
+              </w:rPr>
+            </w:pPr>
+            <w:r>
+              <w:rPr>
+                <w:rFonts w:ascii="Times New Roman" w:hAnsi="Times New Roman" w:cs="Times New Roman"/>
+                <w:b/>
+                <w:bCs/>
+                <w:sz w:val="24"/>
+                <w:szCs w:val="28"/>
+              </w:rPr>
+              <w:t>3</w:t>
+            </w:r>
+            <w:r>
+              <w:rPr>
+                <w:rFonts w:ascii="Times New Roman" w:hAnsi="Times New Roman" w:cs="Times New Roman"/>
+                <w:b/>
+                <w:bCs/>
+                <w:sz w:val="24"/>
+                <w:szCs w:val="28"/>
+              </w:rPr>
+              <w:t>、</w:t>
+            </w:r>
+            <w:r>
+              <w:rPr>
+                <w:rFonts w:ascii="Times New Roman" w:hAnsi="Times New Roman" w:cs="Times New Roman"/>
+                <w:b/>
+                <w:bCs/>
+                <w:sz w:val="24"/>
+                <w:szCs w:val="28"/>
+              </w:rPr>
+              <w:t>Key Innovations &amp; Unique Features</w:t>
+            </w:r>
+          </w:p>
+          <w:p>
+            <w:pPr>
+              <w:rPr>
+                <w:rFonts w:ascii="Times New Roman" w:hAnsi="Times New Roman" w:cs="Times New Roman"/>
+              </w:rPr>
+            </w:pPr>
+          </w:p>
+          <w:p>
+            <w:pPr>
+              <w:rPr>
+                <w:rFonts w:ascii="Times New Roman" w:hAnsi="Times New Roman" w:cs="Times New Roman"/>
+              </w:rPr>
+            </w:pPr>
+            <w:r>
+              <w:rPr>
+                <w:rFonts w:ascii="Times New Roman" w:hAnsi="Times New Roman" w:cs="Times New Roman"/>
+              </w:rPr>
               <w:t>Evidence-Gated Quality Decisions: The system separates model output from release authority. Missing sensors, invalid calibration, inference faults, traceability faults, stale or unconfirmed industrial communication, and latched interlocks produce HOLD rather than an inferred PASS.</w:t>
             </w:r>
           </w:p>
-          <w:p/>
-          <w:p>
-            <w:r>
+          <w:p>
+            <w:pPr>
+              <w:rPr>
+                <w:rFonts w:ascii="Times New Roman" w:hAnsi="Times New Roman" w:cs="Times New Roman"/>
+              </w:rPr>
+            </w:pPr>
+          </w:p>
+          <w:p>
+            <w:pPr>
+              <w:rPr>
+                <w:rFonts w:ascii="Times New Roman" w:hAnsi="Times New Roman" w:cs="Times New Roman"/>
+              </w:rPr>
+            </w:pPr>
+            <w:r>
+              <w:rPr>
+                <w:rFonts w:ascii="Times New Roman" w:hAnsi="Times New Roman" w:cs="Times New Roman"/>
+              </w:rPr>
               <w:t>Traceable Inspection Memory: Each inspection is associated with an active roll and batch, claims a unique (batch_id, part_id), remains PENDING until the final gate outcome is known, and can be represented in an HMAC-SHA256 authenticated certificate snapshot.</w:t>
             </w:r>
           </w:p>
-          <w:p/>
-          <w:p>
-            <w:r>
+          <w:p>
+            <w:pPr>
+              <w:rPr>
+                <w:rFonts w:ascii="Times New Roman" w:hAnsi="Times New Roman" w:cs="Times New Roman"/>
+              </w:rPr>
+            </w:pPr>
+          </w:p>
+          <w:p>
+            <w:pPr>
+              <w:rPr>
+                <w:rFonts w:ascii="Times New Roman" w:hAnsi="Times New Roman" w:cs="Times New Roman"/>
+              </w:rPr>
+            </w:pPr>
+            <w:r>
+              <w:rPr>
+                <w:rFonts w:ascii="Times New Roman" w:hAnsi="Times New Roman" w:cs="Times New Roman"/>
+              </w:rPr>
               <w:t>Reproducible Evaluation Boundaries: The evaluation engine validates immutable dataset manifests, records split provenance, and enforces consistent metric semantics. Independent roll-disjoint evidence remains a required gate for factory qualification.</w:t>
             </w:r>
           </w:p>
-          <w:p/>
-          <w:p>
-            <w:r>
+          <w:p>
+            <w:pPr>
+              <w:rPr>
+                <w:rFonts w:ascii="Times New Roman" w:hAnsi="Times New Roman" w:cs="Times New Roman"/>
+              </w:rPr>
+            </w:pPr>
+          </w:p>
+          <w:p>
+            <w:pPr>
+              <w:rPr>
+                <w:rFonts w:ascii="Times New Roman" w:hAnsi="Times New Roman" w:cs="Times New Roman"/>
+              </w:rPr>
+            </w:pPr>
+            <w:r>
+              <w:rPr>
+                <w:rFonts w:ascii="Times New Roman" w:hAnsi="Times New Roman" w:cs="Times New Roman"/>
+              </w:rPr>
               <w:t>Practical Deployment Boundary: The production dashboard consumes one API snapshot and does not render simulators. Operator E-stop/reset require authentication, exact confirmation, and a durable audit. Industrial I/O is explicitly marked SIMULATED when no PLC is connected. The repository therefore makes the distinction between software readiness and physical qualification visible instead of hiding it behind a headline metric.</w:t>
             </w:r>
           </w:p>
@@ -652,34 +992,77 @@
             <w:tcW w:w="8296" w:type="dxa"/>
           </w:tcPr>
           <w:p>
-            <w:r>
-              <w:lastRenderedPageBreak/>
+            <w:pPr>
+              <w:rPr>
+                <w:rFonts w:ascii="Times New Roman" w:hAnsi="Times New Roman" w:cs="Times New Roman"/>
+              </w:rPr>
+            </w:pPr>
+            <w:r>
+              <w:rPr>
+                <w:rFonts w:ascii="Times New Roman" w:hAnsi="Times New Roman" w:cs="Times New Roman"/>
+                <w:b/>
+                <w:bCs/>
+                <w:sz w:val="24"/>
+                <w:szCs w:val="28"/>
+              </w:rPr>
               <w:t>4</w:t>
             </w:r>
             <w:r>
+              <w:rPr>
+                <w:rFonts w:ascii="Times New Roman" w:hAnsi="Times New Roman" w:cs="Times New Roman"/>
+                <w:b/>
+                <w:bCs/>
+                <w:sz w:val="24"/>
+                <w:szCs w:val="28"/>
+              </w:rPr>
               <w:t>、</w:t>
             </w:r>
             <w:r>
+              <w:rPr>
+                <w:rFonts w:ascii="Times New Roman" w:hAnsi="Times New Roman" w:cs="Times New Roman"/>
+                <w:b/>
+                <w:bCs/>
+                <w:sz w:val="24"/>
+                <w:szCs w:val="28"/>
+              </w:rPr>
               <w:t>Applications &amp; Market Potential</w:t>
             </w:r>
             <w:r>
+              <w:rPr>
+                <w:rFonts w:ascii="Times New Roman" w:hAnsi="Times New Roman" w:cs="Times New Roman"/>
+              </w:rPr>
               <w:br/>
             </w:r>
             <w:r>
+              <w:rPr>
+                <w:rFonts w:ascii="Times New Roman" w:hAnsi="Times New Roman" w:cs="Times New Roman"/>
+              </w:rPr>
               <w:br/>
               <w:t>Immediate Application: A future pilot could use the software as an inspection and traceability layer for lithium-ion electrode coating, drying, and coated-foil processes, subject to plant calibration, sensor integration, PLC/HIL testing, and safety approval.</w:t>
             </w:r>
             <w:r>
+              <w:rPr>
+                <w:rFonts w:ascii="Times New Roman" w:hAnsi="Times New Roman" w:cs="Times New Roman"/>
+              </w:rPr>
               <w:br/>
             </w:r>
             <w:r>
+              <w:rPr>
+                <w:rFonts w:ascii="Times New Roman" w:hAnsi="Times New Roman" w:cs="Times New Roman"/>
+              </w:rPr>
               <w:br/>
               <w:t>Adjacent Applications: The same evidence-gated workflow may be adapted to other coated materials, separators, fuel-cell components, and high-value continuous-web manufacturing where surface inspection and traceability are important.</w:t>
             </w:r>
             <w:r>
+              <w:rPr>
+                <w:rFonts w:ascii="Times New Roman" w:hAnsi="Times New Roman" w:cs="Times New Roman"/>
+              </w:rPr>
               <w:br/>
             </w:r>
             <w:r>
+              <w:rPr>
+                <w:rFonts w:ascii="Times New Roman" w:hAnsi="Times New Roman" w:cs="Times New Roman"/>
+              </w:rPr>
               <w:br/>
               <w:t>Market Potential: The opportunity is to reduce manual review and improve response time to recurring coating defects. The current repository does not quantify scrap reduction, escape rate, payback, or production yield; those values require independent plant measurements and a defined pilot protocol.</w:t>
             </w:r>
@@ -692,42 +1075,114 @@
             <w:tcW w:w="8296" w:type="dxa"/>
           </w:tcPr>
           <w:p>
-            <w:r>
+            <w:pPr>
+              <w:rPr>
+                <w:rFonts w:ascii="Times New Roman" w:hAnsi="Times New Roman" w:cs="Times New Roman"/>
+              </w:rPr>
+            </w:pPr>
+            <w:r>
+              <w:rPr>
+                <w:rFonts w:ascii="Times New Roman" w:hAnsi="Times New Roman" w:cs="Times New Roman"/>
+                <w:b/>
+                <w:bCs/>
+                <w:sz w:val="24"/>
+                <w:szCs w:val="28"/>
+              </w:rPr>
               <w:t>5</w:t>
             </w:r>
             <w:r>
+              <w:rPr>
+                <w:rFonts w:ascii="Times New Roman" w:hAnsi="Times New Roman" w:cs="Times New Roman"/>
+                <w:b/>
+                <w:bCs/>
+                <w:sz w:val="24"/>
+                <w:szCs w:val="28"/>
+              </w:rPr>
               <w:t>、</w:t>
             </w:r>
             <w:r>
+              <w:rPr>
+                <w:rFonts w:ascii="Times New Roman" w:hAnsi="Times New Roman" w:cs="Times New Roman"/>
+                <w:b/>
+                <w:bCs/>
+                <w:sz w:val="24"/>
+                <w:szCs w:val="28"/>
+              </w:rPr>
               <w:t>Business Case/Strategy</w:t>
             </w:r>
             <w:r>
+              <w:rPr>
+                <w:rFonts w:ascii="Times New Roman" w:hAnsi="Times New Roman" w:cs="Times New Roman"/>
+                <w:b/>
+                <w:bCs/>
+                <w:sz w:val="24"/>
+                <w:szCs w:val="28"/>
+              </w:rPr>
               <w:t>（</w:t>
             </w:r>
             <w:r>
+              <w:rPr>
+                <w:rFonts w:ascii="Times New Roman" w:hAnsi="Times New Roman" w:cs="Times New Roman"/>
+                <w:b/>
+                <w:bCs/>
+                <w:sz w:val="24"/>
+                <w:szCs w:val="28"/>
+              </w:rPr>
               <w:t>e.g., go-to-market strategy, business model, market size/opportunity, and operational model, etc.</w:t>
             </w:r>
             <w:r>
+              <w:rPr>
+                <w:rFonts w:ascii="Times New Roman" w:hAnsi="Times New Roman" w:cs="Times New Roman"/>
+                <w:b/>
+                <w:bCs/>
+                <w:sz w:val="24"/>
+                <w:szCs w:val="28"/>
+              </w:rPr>
               <w:t>）</w:t>
             </w:r>
             <w:r>
+              <w:rPr>
+                <w:rFonts w:ascii="Times New Roman" w:hAnsi="Times New Roman" w:cs="Times New Roman"/>
+              </w:rPr>
               <w:br/>
             </w:r>
             <w:r>
+              <w:rPr>
+                <w:rFonts w:ascii="Times New Roman" w:hAnsi="Times New Roman" w:cs="Times New Roman"/>
+              </w:rPr>
               <w:br/>
-              <w:t>Go-to-Market Strategy: Begin with a controlled, single-line technical pilot alongside the existing inspection stack. The pilot would first verify data governance, calibration, model performance, PLC command behavior, and operator procedures before any production decision authority is considered.</w:t>
-            </w:r>
-            <w:r>
+              <w:t xml:space="preserve">Go-to-Market Strategy: Begin with a controlled, single-line technical pilot alongside the existing </w:t>
+            </w:r>
+            <w:r>
+              <w:rPr>
+                <w:rFonts w:ascii="Times New Roman" w:hAnsi="Times New Roman" w:cs="Times New Roman"/>
+              </w:rPr>
+              <w:lastRenderedPageBreak/>
+              <w:t>inspection stack. The pilot would first verify data governance, calibration, model performance, PLC command behavior, and operator procedures before any production decision authority is considered.</w:t>
+            </w:r>
+            <w:r>
+              <w:rPr>
+                <w:rFonts w:ascii="Times New Roman" w:hAnsi="Times New Roman" w:cs="Times New Roman"/>
+              </w:rPr>
               <w:br/>
             </w:r>
             <w:r>
+              <w:rPr>
+                <w:rFonts w:ascii="Times New Roman" w:hAnsi="Times New Roman" w:cs="Times New Roman"/>
+              </w:rPr>
               <w:br/>
               <w:t>Business &amp; Operational Model: A potential model is an implementation and integration service followed by site support for calibration management, model monitoring, traceability, and evidence reporting. Pricing, savings, and expansion assumptions should be set only after a plant-specific baseline and independently reviewed pilot results are available.</w:t>
             </w:r>
             <w:r>
+              <w:rPr>
+                <w:rFonts w:ascii="Times New Roman" w:hAnsi="Times New Roman" w:cs="Times New Roman"/>
+              </w:rPr>
               <w:br/>
             </w:r>
             <w:r>
+              <w:rPr>
+                <w:rFonts w:ascii="Times New Roman" w:hAnsi="Times New Roman" w:cs="Times New Roman"/>
+              </w:rPr>
               <w:br/>
               <w:t>Risk Boundary: The present submission is a software research prototype. It is not sold as a safety-rated controller, regulatory certificate generator, or proven zero-escape production system.</w:t>
             </w:r>
@@ -740,32 +1195,209 @@
             <w:tcW w:w="8296" w:type="dxa"/>
           </w:tcPr>
           <w:p>
-            <w:r>
-              <w:t>6、Additional Information（e.g., R&amp;D process, lessons learned, etc.）</w:t>
-            </w:r>
-          </w:p>
-          <w:p/>
-          <w:p>
-            <w:r>
+            <w:pPr>
+              <w:rPr>
+                <w:rFonts w:ascii="Times New Roman" w:hAnsi="Times New Roman" w:cs="Times New Roman"/>
+                <w:b/>
+                <w:bCs/>
+                <w:sz w:val="24"/>
+                <w:szCs w:val="28"/>
+              </w:rPr>
+            </w:pPr>
+            <w:r>
+              <w:rPr>
+                <w:rFonts w:ascii="Times New Roman" w:hAnsi="Times New Roman" w:cs="Times New Roman"/>
+                <w:b/>
+                <w:bCs/>
+                <w:sz w:val="24"/>
+                <w:szCs w:val="28"/>
+              </w:rPr>
+              <w:t>6</w:t>
+            </w:r>
+            <w:r>
+              <w:rPr>
+                <w:rFonts w:ascii="Times New Roman" w:hAnsi="Times New Roman" w:cs="Times New Roman"/>
+                <w:b/>
+                <w:bCs/>
+                <w:sz w:val="24"/>
+                <w:szCs w:val="28"/>
+              </w:rPr>
+              <w:t>、</w:t>
+            </w:r>
+            <w:r>
+              <w:rPr>
+                <w:rFonts w:ascii="Times New Roman" w:hAnsi="Times New Roman" w:cs="Times New Roman"/>
+                <w:b/>
+                <w:bCs/>
+                <w:sz w:val="24"/>
+                <w:szCs w:val="28"/>
+              </w:rPr>
+              <w:t>Additional Information</w:t>
+            </w:r>
+            <w:r>
+              <w:rPr>
+                <w:rFonts w:ascii="Times New Roman" w:hAnsi="Times New Roman" w:cs="Times New Roman"/>
+                <w:b/>
+                <w:bCs/>
+                <w:sz w:val="24"/>
+                <w:szCs w:val="28"/>
+              </w:rPr>
+              <w:t>（</w:t>
+            </w:r>
+            <w:r>
+              <w:rPr>
+                <w:rFonts w:ascii="Times New Roman" w:hAnsi="Times New Roman" w:cs="Times New Roman"/>
+                <w:b/>
+                <w:bCs/>
+                <w:sz w:val="24"/>
+                <w:szCs w:val="28"/>
+              </w:rPr>
+              <w:t>e.g., R&amp;D process, lessons learned, etc.</w:t>
+            </w:r>
+            <w:r>
+              <w:rPr>
+                <w:rFonts w:ascii="Times New Roman" w:hAnsi="Times New Roman" w:cs="Times New Roman"/>
+                <w:b/>
+                <w:bCs/>
+                <w:sz w:val="24"/>
+                <w:szCs w:val="28"/>
+              </w:rPr>
+              <w:t>）</w:t>
+            </w:r>
+          </w:p>
+          <w:p>
+            <w:pPr>
+              <w:rPr>
+                <w:rFonts w:ascii="Times New Roman" w:hAnsi="Times New Roman" w:cs="Times New Roman"/>
+              </w:rPr>
+            </w:pPr>
+          </w:p>
+          <w:p>
+            <w:pPr>
+              <w:rPr>
+                <w:rFonts w:ascii="Times New Roman" w:hAnsi="Times New Roman" w:cs="Times New Roman"/>
+              </w:rPr>
+            </w:pPr>
+            <w:r>
+              <w:rPr>
+                <w:rFonts w:ascii="Times New Roman" w:hAnsi="Times New Roman" w:cs="Times New Roman"/>
+              </w:rPr>
               <w:t>R&amp;D Process &amp; Execution Discipline: Development uses a staged workflow: establish the safety and evidence contract, implement the smallest verifiable change, run automated regression tests, perform local API/dashboard smoke checks, and record limitations in the implementation ledger. The authoritative automated-test snapshot is generated by scripts/record_test_manifest.py and stored in reports/test_manifest.json; this form does not duplicate a mutable test count. Local simulation is not hardware evidence.</w:t>
             </w:r>
           </w:p>
-          <w:p/>
-          <w:p>
-            <w:r>
+          <w:p>
+            <w:pPr>
+              <w:rPr>
+                <w:rFonts w:ascii="Times New Roman" w:hAnsi="Times New Roman" w:cs="Times New Roman"/>
+              </w:rPr>
+            </w:pPr>
+          </w:p>
+          <w:p>
+            <w:pPr>
+              <w:rPr>
+                <w:rFonts w:ascii="Times New Roman" w:hAnsi="Times New Roman" w:cs="Times New Roman"/>
+              </w:rPr>
+            </w:pPr>
+            <w:r>
+              <w:rPr>
+                <w:rFonts w:ascii="Times New Roman" w:hAnsi="Times New Roman" w:cs="Times New Roman"/>
+              </w:rPr>
               <w:t>Lessons Learned: In industrial AI, an accuracy number is only useful when its data split, model artifact, calibration, decision semantics, and failure behavior are auditable. A smaller established model with clear provenance is preferable to a larger model that has not been retrained and independently evaluated. The current RGB detector is hash-pinned YOLO26n/ONNX on an image-disjoint CoatingVision test split; that split is not factory roll-disjoint evidence.</w:t>
             </w:r>
           </w:p>
-          <w:p/>
-          <w:p>
-            <w:r>
+          <w:p>
+            <w:pPr>
+              <w:rPr>
+                <w:rFonts w:ascii="Times New Roman" w:hAnsi="Times New Roman" w:cs="Times New Roman"/>
+              </w:rPr>
+            </w:pPr>
+          </w:p>
+          <w:p>
+            <w:pPr>
+              <w:rPr>
+                <w:rFonts w:ascii="Times New Roman" w:hAnsi="Times New Roman" w:cs="Times New Roman"/>
+              </w:rPr>
+            </w:pPr>
+            <w:r>
+              <w:rPr>
+                <w:rFonts w:ascii="Times New Roman" w:hAnsi="Times New Roman" w:cs="Times New Roman"/>
+              </w:rPr>
               <w:t>Next Validation Steps: Obtain an independent roll-disjoint factory dataset; complete PLC/HIL, plant calibration, and safety testing; pursue authors' DINOv3/DA-Core validation only if paper-comparable LIBAD benchmarking is required; and treat downstream material/electrochemical performance prediction as future validation, not a current defense claim.</w:t>
             </w:r>
           </w:p>
-          <w:p/>
-          <w:p>
-            <w:r>
-              <w:t>Advisor / 指导老师: Prof. Kris Singh — Visiting Professor, Tsinghua University; Founder &amp; CEO, SRII. Advisory scope: innovation, industrialization, and final-defense guidance.</w:t>
+          <w:p>
+            <w:pPr>
+              <w:rPr>
+                <w:rFonts w:ascii="Times New Roman" w:hAnsi="Times New Roman" w:cs="Times New Roman"/>
+              </w:rPr>
+            </w:pPr>
+          </w:p>
+          <w:p>
+            <w:pPr>
+              <w:rPr>
+                <w:rFonts w:ascii="Times New Roman" w:hAnsi="Times New Roman" w:cs="Times New Roman"/>
+              </w:rPr>
+            </w:pPr>
+            <w:r>
+              <w:rPr>
+                <w:rFonts w:ascii="Times New Roman" w:hAnsi="Times New Roman" w:cs="Times New Roman"/>
+              </w:rPr>
+              <w:t xml:space="preserve">Advisor / </w:t>
+            </w:r>
+            <w:r>
+              <w:rPr>
+                <w:rFonts w:ascii="Times New Roman" w:hAnsi="Times New Roman" w:cs="Times New Roman"/>
+              </w:rPr>
+              <w:t>指导老师</w:t>
+            </w:r>
+            <w:r>
+              <w:rPr>
+                <w:rFonts w:ascii="Times New Roman" w:hAnsi="Times New Roman" w:cs="Times New Roman"/>
+              </w:rPr>
+              <w:t xml:space="preserve">: Prof. Kris Singh </w:t>
+            </w:r>
+            <w:r>
+              <w:rPr>
+                <w:rFonts w:ascii="Times New Roman" w:hAnsi="Times New Roman" w:cs="Times New Roman"/>
+              </w:rPr>
+              <w:t>-</w:t>
+            </w:r>
+            <w:r>
+              <w:rPr>
+                <w:rFonts w:ascii="Times New Roman" w:hAnsi="Times New Roman" w:cs="Times New Roman"/>
+              </w:rPr>
+              <w:t xml:space="preserve"> Visiting Professor, Tsinghua University; Founder &amp; CEO, SRII. </w:t>
+            </w:r>
+            <w:r>
+              <w:rPr>
+                <w:rFonts w:ascii="Times New Roman" w:hAnsi="Times New Roman" w:cs="Times New Roman"/>
+              </w:rPr>
+              <w:t>(</w:t>
+            </w:r>
+            <w:r>
+              <w:rPr>
+                <w:rFonts w:ascii="Times New Roman" w:hAnsi="Times New Roman" w:cs="Times New Roman"/>
+              </w:rPr>
+              <w:t>kris@thesrii.org</w:t>
+            </w:r>
+            <w:r>
+              <w:rPr>
+                <w:rFonts w:ascii="Times New Roman" w:hAnsi="Times New Roman" w:cs="Times New Roman"/>
+              </w:rPr>
+              <w:t>)</w:t>
+            </w:r>
+          </w:p>
+          <w:p>
+            <w:pPr>
+              <w:rPr>
+                <w:rFonts w:ascii="Times New Roman" w:hAnsi="Times New Roman" w:cs="Times New Roman"/>
+              </w:rPr>
+            </w:pPr>
+            <w:r>
+              <w:rPr>
+                <w:rFonts w:ascii="Times New Roman" w:hAnsi="Times New Roman" w:cs="Times New Roman"/>
+              </w:rPr>
+              <w:t>Advisory scope: innovation, industrialization, and final-defense guidance.</w:t>
             </w:r>
           </w:p>
         </w:tc>
@@ -779,14 +1411,42 @@
             <w:pPr>
               <w:jc w:val="left"/>
               <w:rPr>
-                <w:rFonts w:ascii="Times New Roman" w:eastAsia="SimHei" w:hAnsi="Times New Roman" w:cs="Times New Roman"/>
-                <w:b/>
-                <w:bCs/>
-                <w:sz w:val="24"/>
-              </w:rPr>
-            </w:pPr>
-            <w:r>
-              <w:t>7、Team Member Information</w:t>
+                <w:rFonts w:ascii="Times New Roman" w:hAnsi="Times New Roman" w:cs="Times New Roman"/>
+                <w:b/>
+                <w:bCs/>
+                <w:sz w:val="24"/>
+                <w:szCs w:val="28"/>
+              </w:rPr>
+            </w:pPr>
+            <w:r>
+              <w:rPr>
+                <w:rFonts w:ascii="Times New Roman" w:hAnsi="Times New Roman" w:cs="Times New Roman"/>
+                <w:b/>
+                <w:bCs/>
+                <w:sz w:val="24"/>
+                <w:szCs w:val="28"/>
+              </w:rPr>
+              <w:t>7</w:t>
+            </w:r>
+            <w:r>
+              <w:rPr>
+                <w:rFonts w:ascii="Times New Roman" w:hAnsi="Times New Roman" w:cs="Times New Roman"/>
+                <w:b/>
+                <w:bCs/>
+                <w:sz w:val="24"/>
+                <w:szCs w:val="28"/>
+              </w:rPr>
+              <w:t>、</w:t>
+            </w:r>
+            <w:r>
+              <w:rPr>
+                <w:rFonts w:ascii="Times New Roman" w:hAnsi="Times New Roman" w:cs="Times New Roman"/>
+                <w:b/>
+                <w:bCs/>
+                <w:sz w:val="24"/>
+                <w:szCs w:val="28"/>
+              </w:rPr>
+              <w:t>Team Member Information</w:t>
             </w:r>
           </w:p>
           <w:tbl>
@@ -805,11 +1465,11 @@
               <w:tblLook w:val="0000" w:firstRow="0" w:lastRow="0" w:firstColumn="0" w:lastColumn="0" w:noHBand="0" w:noVBand="0"/>
             </w:tblPr>
             <w:tblGrid>
-              <w:gridCol w:w="1158"/>
-              <w:gridCol w:w="1577"/>
-              <w:gridCol w:w="1429"/>
-              <w:gridCol w:w="1548"/>
-              <w:gridCol w:w="2358"/>
+              <w:gridCol w:w="1078"/>
+              <w:gridCol w:w="1644"/>
+              <w:gridCol w:w="1303"/>
+              <w:gridCol w:w="1417"/>
+              <w:gridCol w:w="2381"/>
             </w:tblGrid>
             <w:tr>
               <w:trPr>
@@ -944,6 +1604,9 @@
                     </w:rPr>
                   </w:pPr>
                   <w:r>
+                    <w:rPr>
+                      <w:rFonts w:ascii="Times New Roman" w:hAnsi="Times New Roman" w:cs="Times New Roman"/>
+                    </w:rPr>
                     <w:t>Team Leader</w:t>
                   </w:r>
                 </w:p>
@@ -962,6 +1625,9 @@
                     </w:rPr>
                   </w:pPr>
                   <w:r>
+                    <w:rPr>
+                      <w:rFonts w:ascii="Times New Roman" w:hAnsi="Times New Roman" w:cs="Times New Roman"/>
+                    </w:rPr>
                     <w:t>Trịnh Hoàng Tú</w:t>
                   </w:r>
                 </w:p>
@@ -980,6 +1646,9 @@
                     </w:rPr>
                   </w:pPr>
                   <w:r>
+                    <w:rPr>
+                      <w:rFonts w:ascii="Times New Roman" w:hAnsi="Times New Roman" w:cs="Times New Roman"/>
+                    </w:rPr>
                     <w:t>HUFLIT</w:t>
                   </w:r>
                 </w:p>
@@ -998,6 +1667,9 @@
                     </w:rPr>
                   </w:pPr>
                   <w:r>
+                    <w:rPr>
+                      <w:rFonts w:ascii="Times New Roman" w:hAnsi="Times New Roman" w:cs="Times New Roman"/>
+                    </w:rPr>
                     <w:t>+84 983967098</w:t>
                   </w:r>
                 </w:p>
@@ -1017,7 +1689,9 @@
                   </w:pPr>
                   <w:r>
                     <w:rPr>
-                      <w:sz w:val="16"/>
+                      <w:rFonts w:ascii="Times New Roman" w:hAnsi="Times New Roman" w:cs="Times New Roman"/>
+                      <w:sz w:val="20"/>
+                      <w:szCs w:val="28"/>
                     </w:rPr>
                     <w:t>tht.csec2005@gmail.com</w:t>
                   </w:r>
@@ -1043,6 +1717,9 @@
                     </w:rPr>
                   </w:pPr>
                   <w:r>
+                    <w:rPr>
+                      <w:rFonts w:ascii="Times New Roman" w:hAnsi="Times New Roman" w:cs="Times New Roman"/>
+                    </w:rPr>
                     <w:t>Team Member</w:t>
                   </w:r>
                 </w:p>
@@ -1060,7 +1737,6 @@
                       <w:szCs w:val="20"/>
                     </w:rPr>
                   </w:pPr>
-                  <w:r/>
                 </w:p>
               </w:tc>
               <w:tc>
@@ -1076,7 +1752,6 @@
                       <w:szCs w:val="20"/>
                     </w:rPr>
                   </w:pPr>
-                  <w:r/>
                 </w:p>
               </w:tc>
               <w:tc>
@@ -1092,7 +1767,6 @@
                       <w:szCs w:val="20"/>
                     </w:rPr>
                   </w:pPr>
-                  <w:r/>
                 </w:p>
               </w:tc>
               <w:tc>
@@ -1108,7 +1782,6 @@
                       <w:szCs w:val="20"/>
                     </w:rPr>
                   </w:pPr>
-                  <w:r/>
                 </w:p>
               </w:tc>
             </w:tr>
@@ -1147,7 +1820,6 @@
                       <w:szCs w:val="20"/>
                     </w:rPr>
                   </w:pPr>
-                  <w:r/>
                 </w:p>
               </w:tc>
               <w:tc>
@@ -1164,7 +1836,6 @@
                       <w:szCs w:val="20"/>
                     </w:rPr>
                   </w:pPr>
-                  <w:r/>
                 </w:p>
               </w:tc>
               <w:tc>
@@ -1181,7 +1852,6 @@
                       <w:szCs w:val="20"/>
                     </w:rPr>
                   </w:pPr>
-                  <w:r/>
                 </w:p>
               </w:tc>
               <w:tc>
@@ -1198,7 +1868,6 @@
                       <w:szCs w:val="20"/>
                     </w:rPr>
                   </w:pPr>
-                  <w:r/>
                 </w:p>
               </w:tc>
             </w:tr>
@@ -1239,7 +1908,6 @@
                       <w:szCs w:val="24"/>
                     </w:rPr>
                   </w:pPr>
-                  <w:r/>
                 </w:p>
               </w:tc>
               <w:tc>
@@ -1257,7 +1925,6 @@
                       <w:szCs w:val="24"/>
                     </w:rPr>
                   </w:pPr>
-                  <w:r/>
                 </w:p>
               </w:tc>
               <w:tc>
@@ -1275,7 +1942,6 @@
                       <w:szCs w:val="24"/>
                     </w:rPr>
                   </w:pPr>
-                  <w:r/>
                 </w:p>
               </w:tc>
               <w:tc>
@@ -1293,21 +1959,34 @@
                       <w:szCs w:val="24"/>
                     </w:rPr>
                   </w:pPr>
-                  <w:r/>
                 </w:p>
               </w:tc>
             </w:tr>
           </w:tbl>
-          <w:p/>
-          <w:p>
-            <w:r/>
-          </w:p>
-          <w:p>
-            <w:r/>
+          <w:p>
+            <w:pPr>
+              <w:rPr>
+                <w:rFonts w:ascii="Times New Roman" w:hAnsi="Times New Roman" w:cs="Times New Roman"/>
+              </w:rPr>
+            </w:pPr>
+          </w:p>
+          <w:p>
+            <w:pPr>
+              <w:rPr>
+                <w:rFonts w:ascii="Times New Roman" w:hAnsi="Times New Roman" w:cs="Times New Roman"/>
+              </w:rPr>
+            </w:pPr>
           </w:p>
         </w:tc>
       </w:tr>
     </w:tbl>
+    <w:p>
+      <w:pPr>
+        <w:rPr>
+          <w:rFonts w:ascii="Times New Roman" w:hAnsi="Times New Roman" w:cs="Times New Roman"/>
+        </w:rPr>
+      </w:pPr>
+    </w:p>
     <w:sectPr>
       <w:type w:val="continuous"/>
       <w:pgSz w:w="11906" w:h="16838"/>
@@ -1998,7 +2677,6 @@
   <w:style w:type="character" w:default="1" w:styleId="DefaultParagraphFont">
     <w:name w:val="Default Paragraph Font"/>
     <w:uiPriority w:val="1"/>
-    <w:semiHidden/>
     <w:unhideWhenUsed/>
   </w:style>
   <w:style w:type="table" w:default="1" w:styleId="TableNormal">

</xml_diff>